<commit_message>
Export: refresh Russian timeline appendix (DOCX).
Made-with: Cursor
</commit_message>
<xml_diff>
--- a/export/timeline-appendix-ru.docx
+++ b/export/timeline-appendix-ru.docx
@@ -35,7 +35,7 @@
         <w:jc w:val="center"/>
       </w:pPr>
       <w:r>
-        <w:t>Версия 1.2.112</w:t>
+        <w:t>Версия 1.2.128</w:t>
       </w:r>
     </w:p>
     <w:p>
@@ -1156,6 +1156,15 @@
     </w:p>
     <w:p>
       <w:pPr>
+        <w:pStyle w:val="ListBullet"/>
+        <w:spacing w:before="20" w:after="20"/>
+      </w:pPr>
+      <w:r>
+        <w:t>Файлы (лексические спекуляции): «Русь-Орда» перекликается с английским политическим и военным лексиконом — открытая нота о спешке, орде, про/коне, орде Фоменко = крыса, короле Артуре (2004) и т. д.; никаких временных событий (только досье).</w:t>
+      </w:r>
+    </w:p>
+    <w:p>
+      <w:pPr>
         <w:pStyle w:val="Heading3"/>
         <w:keepNext/>
         <w:keepLines/>
@@ -1208,6 +1217,77 @@
       </w:pPr>
       <w:r>
         <w:t>Иезуитские операции: обращение, католицизм и Новый Свет</w:t>
+      </w:r>
+    </w:p>
+    <w:p>
+      <w:pPr>
+        <w:pStyle w:val="Heading3"/>
+        <w:keepNext/>
+        <w:keepLines/>
+      </w:pPr>
+      <w:r>
+        <w:t>Отзывы читателей и исправления</w:t>
+      </w:r>
+    </w:p>
+    <w:p>
+      <w:pPr>
+        <w:pStyle w:val="ListBullet"/>
+        <w:spacing w:before="20" w:after="20"/>
+      </w:pPr>
+      <w:r>
+        <w:t>ФБ-001 — Анатолий Фоменко: Русскоязычный читатель возражал против фразы, которую государственный историк применил к Фоменко. Обзор английской хронологии был исправлен; резюме и открытые последующие наблюдения представлены в разделе ниже. Полное анонимное сообщение, примечания к расследованию и политика цитирования Восток / Запад: FEEDBACK.md (досье на хранилище).</w:t>
+      </w:r>
+    </w:p>
+    <w:p>
+      <w:pPr>
+        <w:pBdr>
+          <w:bottom w:val="single" w:sz="6" w:space="1" w:color="CCCCCC"/>
+        </w:pBdr>
+      </w:pPr>
+    </w:p>
+    <w:p>
+      <w:pPr>
+        <w:pStyle w:val="Heading2"/>
+        <w:keepNext/>
+        <w:keepLines/>
+      </w:pPr>
+      <w:r>
+        <w:t>Отзывы читателей и исправления (книжные)</w:t>
+      </w:r>
+    </w:p>
+    <w:p>
+      <w:pPr>
+        <w:pStyle w:val="Heading3"/>
+        <w:keepNext/>
+        <w:keepLines/>
+      </w:pPr>
+      <w:r>
+        <w:t>ФБ-001 — Анатолий Фоменко: «государственный историк»</w:t>
+      </w:r>
+    </w:p>
+    <w:p>
+      <w:r>
+        <w:t>Читатель русского перевода сообщил, что называть Анатолия Фоменко историком, спонсируемым государством, вводит в заблуждение: он признанный математик, избранный действительным членом Российской академии наук (1994) по математике, в то время как труды его и Г.В. Носовского «Новая хронология» отвергаются профессиональными историками в России и на международном уровне — то есть позиция «официальной» исторической профессии враждебна, а не спонсирует. Рецензент добавил, что «Новая хронология» не рассматривалась как поддерживаемая государством проектная работа (никаких грантов не названо; доносы советской эпохи утверждались, но никаких систематических преследований не описано).</w:t>
+      </w:r>
+    </w:p>
+    <w:p>
+      <w:r>
+        <w:t>Применяемая коррекция: та же формулировка была удалена из истории/хронологии/page.md и из содержания обзора временной шкалы/00.overview/00.02.00-background.md; оба теперь отделяют членство в РАН (математика) от основного отказа от Новой Хронологии. Восстановите DOCX / PDF (и любой российский экспорт), чтобы собранные книги подобрали исправление.</w:t>
+      </w:r>
+    </w:p>
+    <w:p>
+      <w:r>
+        <w:t>Вторая нить (не «фиксированная», записанная): Та же самая обратная связь связала сатурнианский / 4077 г. до н.э. / катастрофизм с Новой Хронологией и прочитала смесь как фантазию или эзотеризм, а не науку — проблему «мухи в мази». Эта хронология уже рассматривает линии Фоменко и Сатурна как различные рамки в правилах проекта; действенный элемент является более четкими границами глав в любой составленной книге, поэтому читатели, которые хотят только статистическую хронологию, не принуждаются через космологию на одном дыхании.</w:t>
+      </w:r>
+    </w:p>
+    <w:p>
+      <w:r>
+        <w:t>Откройте: Пройдите ту же самую коррекцию формулировок Фоменко через любой автономный русский источник книги, если он не был создан с сайта page.md. Факультативный незападный якорь для «академии vs. псевдоистории»: дайджест РАН «В защиту науки» бюллетени на ras.ru (см. статью Википедии о Фоменко для указателей).</w:t>
+      </w:r>
+    </w:p>
+    <w:p>
+      <w:r>
+        <w:t>ID: FB-001 — см. FEEDBACK.md для полной анонимности текста и таблицы расследований.</w:t>
       </w:r>
     </w:p>
     <w:p/>
@@ -1397,7 +1477,7 @@
             <w:pPr>
               <w:spacing w:before="20" w:after="20"/>
             </w:pPr>
-            <w:hyperlink r:id="rId47">
+            <w:hyperlink r:id="rId52">
               <w:r>
                 <w:rPr>
                   <w:b w:val="0"/>
@@ -1451,7 +1531,7 @@
             <w:pPr>
               <w:spacing w:before="20" w:after="20"/>
             </w:pPr>
-            <w:hyperlink r:id="rId48">
+            <w:hyperlink r:id="rId53">
               <w:r>
                 <w:rPr>
                   <w:b w:val="0"/>
@@ -1505,7 +1585,7 @@
             <w:pPr>
               <w:spacing w:before="20" w:after="20"/>
             </w:pPr>
-            <w:hyperlink r:id="rId49">
+            <w:hyperlink r:id="rId54">
               <w:r>
                 <w:rPr>
                   <w:b w:val="0"/>
@@ -1559,7 +1639,7 @@
             <w:pPr>
               <w:spacing w:before="20" w:after="20"/>
             </w:pPr>
-            <w:hyperlink r:id="rId50">
+            <w:hyperlink r:id="rId55">
               <w:r>
                 <w:rPr>
                   <w:b w:val="0"/>
@@ -1613,7 +1693,7 @@
             <w:pPr>
               <w:spacing w:before="20" w:after="20"/>
             </w:pPr>
-            <w:hyperlink r:id="rId51">
+            <w:hyperlink r:id="rId56">
               <w:r>
                 <w:rPr>
                   <w:b w:val="0"/>
@@ -1667,7 +1747,7 @@
             <w:pPr>
               <w:spacing w:before="20" w:after="20"/>
             </w:pPr>
-            <w:hyperlink r:id="rId52">
+            <w:hyperlink r:id="rId57">
               <w:r>
                 <w:rPr>
                   <w:b w:val="0"/>
@@ -1721,7 +1801,7 @@
             <w:pPr>
               <w:spacing w:before="20" w:after="20"/>
             </w:pPr>
-            <w:hyperlink r:id="rId53">
+            <w:hyperlink r:id="rId58">
               <w:r>
                 <w:rPr>
                   <w:b w:val="0"/>
@@ -1761,7 +1841,12 @@
               <w:spacing w:before="20" w:after="20"/>
             </w:pPr>
             <w:r>
-              <w:t>Петроглифы как записи Z-пинч плазменного разряда</w:t>
+              <w:rPr>
+                <w:b w:val="0"/>
+                <w:i w:val="0"/>
+                <w:sz w:val="18"/>
+              </w:rPr>
+              <w:t>Petroglyphs as Z-pinch plasma discharge records</w:t>
             </w:r>
           </w:p>
         </w:tc>
@@ -1775,9 +1860,17 @@
             <w:pPr>
               <w:spacing w:before="20" w:after="20"/>
             </w:pPr>
-            <w:r>
-              <w:t>Джино Кук</w:t>
-            </w:r>
+            <w:hyperlink r:id="rId59">
+              <w:r>
+                <w:rPr>
+                  <w:b w:val="0"/>
+                  <w:i w:val="0"/>
+                  <w:color w:val="B8860B"/>
+                  <w:sz w:val="18"/>
+                </w:rPr>
+                <w:t>Jno Cook</w:t>
+              </w:r>
+            </w:hyperlink>
           </w:p>
         </w:tc>
         <w:tc>
@@ -1807,7 +1900,12 @@
               <w:spacing w:before="20" w:after="20"/>
             </w:pPr>
             <w:r>
-              <w:t>Наиболее подробная хронология Сатурна с конкретными датами</w:t>
+              <w:rPr>
+                <w:b w:val="0"/>
+                <w:i w:val="0"/>
+                <w:sz w:val="18"/>
+              </w:rPr>
+              <w:t>Most detailed Saturnian chronology with specific dates</w:t>
             </w:r>
           </w:p>
         </w:tc>
@@ -1821,7 +1919,7 @@
             <w:pPr>
               <w:spacing w:before="20" w:after="20"/>
             </w:pPr>
-            <w:hyperlink r:id="rId55">
+            <w:hyperlink r:id="rId60">
               <w:r>
                 <w:rPr>
                   <w:b w:val="0"/>
@@ -1880,7 +1978,7 @@
             <w:pPr>
               <w:spacing w:before="20" w:after="20"/>
             </w:pPr>
-            <w:hyperlink r:id="rId56">
+            <w:hyperlink r:id="rId61">
               <w:r>
                 <w:rPr>
                   <w:b w:val="0"/>
@@ -1939,7 +2037,7 @@
             <w:pPr>
               <w:spacing w:before="20" w:after="20"/>
             </w:pPr>
-            <w:hyperlink r:id="rId57">
+            <w:hyperlink r:id="rId62">
               <w:r>
                 <w:rPr>
                   <w:b w:val="0"/>
@@ -1998,7 +2096,7 @@
             <w:pPr>
               <w:spacing w:before="20" w:after="20"/>
             </w:pPr>
-            <w:hyperlink r:id="rId58">
+            <w:hyperlink r:id="rId63">
               <w:r>
                 <w:rPr>
                   <w:b w:val="0"/>
@@ -2065,7 +2163,7 @@
             <w:pPr>
               <w:spacing w:before="20" w:after="20"/>
             </w:pPr>
-            <w:hyperlink r:id="rId59">
+            <w:hyperlink r:id="rId64">
               <w:r>
                 <w:rPr>
                   <w:b w:val="0"/>
@@ -2124,7 +2222,7 @@
             <w:pPr>
               <w:spacing w:before="20" w:after="20"/>
             </w:pPr>
-            <w:hyperlink r:id="rId60">
+            <w:hyperlink r:id="rId65">
               <w:r>
                 <w:rPr>
                   <w:b w:val="0"/>
@@ -2183,7 +2281,7 @@
             <w:pPr>
               <w:spacing w:before="20" w:after="20"/>
             </w:pPr>
-            <w:hyperlink r:id="rId61">
+            <w:hyperlink r:id="rId66">
               <w:r>
                 <w:rPr>
                   <w:b w:val="0"/>
@@ -2242,7 +2340,7 @@
             <w:pPr>
               <w:spacing w:before="20" w:after="20"/>
             </w:pPr>
-            <w:hyperlink r:id="rId62">
+            <w:hyperlink r:id="rId67">
               <w:r>
                 <w:rPr>
                   <w:b w:val="0"/>
@@ -2301,7 +2399,7 @@
             <w:pPr>
               <w:spacing w:before="20" w:after="20"/>
             </w:pPr>
-            <w:hyperlink r:id="rId63">
+            <w:hyperlink r:id="rId68">
               <w:r>
                 <w:rPr>
                   <w:b w:val="0"/>
@@ -2360,7 +2458,7 @@
             <w:pPr>
               <w:spacing w:before="20" w:after="20"/>
             </w:pPr>
-            <w:hyperlink r:id="rId64">
+            <w:hyperlink r:id="rId69">
               <w:r>
                 <w:rPr>
                   <w:b w:val="0"/>
@@ -2419,7 +2517,7 @@
             <w:pPr>
               <w:spacing w:before="20" w:after="20"/>
             </w:pPr>
-            <w:hyperlink r:id="rId65">
+            <w:hyperlink r:id="rId70">
               <w:r>
                 <w:rPr>
                   <w:b w:val="0"/>
@@ -2478,7 +2576,7 @@
             <w:pPr>
               <w:spacing w:before="20" w:after="20"/>
             </w:pPr>
-            <w:hyperlink r:id="rId66">
+            <w:hyperlink r:id="rId71">
               <w:r>
                 <w:rPr>
                   <w:b w:val="0"/>
@@ -2537,7 +2635,7 @@
             <w:pPr>
               <w:spacing w:before="20" w:after="20"/>
             </w:pPr>
-            <w:hyperlink r:id="rId67">
+            <w:hyperlink r:id="rId72">
               <w:r>
                 <w:rPr>
                   <w:b w:val="0"/>
@@ -2577,7 +2675,12 @@
               <w:spacing w:before="20" w:after="20"/>
             </w:pPr>
             <w:r>
-              <w:t>Саган опровержение; исследование вымирания мамонтов</w:t>
+              <w:rPr>
+                <w:b w:val="0"/>
+                <w:i w:val="0"/>
+                <w:sz w:val="18"/>
+              </w:rPr>
+              <w:t>Sagan rebuttal; mammoth extinction research</w:t>
             </w:r>
           </w:p>
         </w:tc>
@@ -2591,7 +2694,7 @@
             <w:pPr>
               <w:spacing w:before="20" w:after="20"/>
             </w:pPr>
-            <w:hyperlink r:id="rId68">
+            <w:hyperlink r:id="rId73">
               <w:r>
                 <w:rPr>
                   <w:b w:val="0"/>
@@ -2650,7 +2753,7 @@
             <w:pPr>
               <w:spacing w:before="20" w:after="20"/>
             </w:pPr>
-            <w:hyperlink r:id="rId69">
+            <w:hyperlink r:id="rId74">
               <w:r>
                 <w:rPr>
                   <w:b w:val="0"/>
@@ -2709,7 +2812,7 @@
             <w:pPr>
               <w:spacing w:before="20" w:after="20"/>
             </w:pPr>
-            <w:hyperlink r:id="rId70">
+            <w:hyperlink r:id="rId75">
               <w:r>
                 <w:rPr>
                   <w:b w:val="0"/>
@@ -7689,12 +7792,7 @@
               <w:spacing w:before="20" w:after="20"/>
             </w:pPr>
             <w:r>
-              <w:rPr>
-                <w:b w:val="0"/>
-                <w:i w:val="0"/>
-                <w:sz w:val="18"/>
-              </w:rPr>
-              <w:t>Robert Becker</w:t>
+              <w:t>Роберт Беккер</w:t>
             </w:r>
           </w:p>
         </w:tc>
@@ -7733,7 +7831,12 @@
               <w:spacing w:before="20" w:after="20"/>
             </w:pPr>
             <w:r>
-              <w:t>Дважды номинированный на Нобелевскую премию; сокращение финансирования</w:t>
+              <w:rPr>
+                <w:b w:val="0"/>
+                <w:i w:val="0"/>
+                <w:sz w:val="18"/>
+              </w:rPr>
+              <w:t>Twice Nobel-nominated; funding cut</w:t>
             </w:r>
           </w:p>
         </w:tc>
@@ -7792,12 +7895,7 @@
               <w:spacing w:before="20" w:after="20"/>
             </w:pPr>
             <w:r>
-              <w:rPr>
-                <w:b w:val="0"/>
-                <w:i w:val="0"/>
-                <w:sz w:val="18"/>
-              </w:rPr>
-              <w:t>Published as Karolinska chair; ignored</w:t>
+              <w:t>Опубликовано как Каролинский стул; проигнорировано</w:t>
             </w:r>
           </w:p>
         </w:tc>
@@ -8616,28 +8714,7 @@
               <w:spacing w:before="20" w:after="20"/>
             </w:pPr>
             <w:r>
-              <w:rPr>
-                <w:b w:val="0"/>
-                <w:i w:val="0"/>
-                <w:sz w:val="18"/>
-              </w:rPr>
-              <w:t xml:space="preserve">Pyramidal Empire reversed calendar at Year Zero; Jesuits reinterpreted </w:t>
-            </w:r>
-            <w:r>
-              <w:rPr>
-                <w:b w:val="0"/>
-                <w:i w:val="0"/>
-                <w:sz w:val="18"/>
-              </w:rPr>
-              <w:t>ι</w:t>
-            </w:r>
-            <w:r>
-              <w:rPr>
-                <w:b w:val="0"/>
-                <w:i w:val="0"/>
-                <w:sz w:val="18"/>
-              </w:rPr>
-              <w:t xml:space="preserve"> as 1000</w:t>
+              <w:t>Пирамидальная империя изменила календарь на нулевой год; иезуиты переосмыслили его как 1000 лет</w:t>
             </w:r>
           </w:p>
         </w:tc>
@@ -8788,7 +8865,12 @@
               <w:spacing w:before="20" w:after="20"/>
             </w:pPr>
             <w:r>
-              <w:t>Иллиг</w:t>
+              <w:rPr>
+                <w:b w:val="0"/>
+                <w:i w:val="0"/>
+                <w:sz w:val="18"/>
+              </w:rPr>
+              <w:t>Illig</w:t>
             </w:r>
           </w:p>
         </w:tc>
@@ -8819,12 +8901,7 @@
               <w:spacing w:before="20" w:after="20"/>
             </w:pPr>
             <w:r>
-              <w:rPr>
-                <w:b w:val="0"/>
-                <w:i w:val="0"/>
-                <w:sz w:val="18"/>
-              </w:rPr>
-              <w:t>Political calculation</w:t>
+              <w:t>Политический расчет</w:t>
             </w:r>
           </w:p>
         </w:tc>
@@ -12465,12 +12542,7 @@
               <w:spacing w:before="20" w:after="20"/>
             </w:pPr>
             <w:r>
-              <w:rPr>
-                <w:b w:val="0"/>
-                <w:i w:val="0"/>
-                <w:sz w:val="18"/>
-              </w:rPr>
-              <w:t>Sunday</w:t>
+              <w:t>Воскресенье</w:t>
             </w:r>
           </w:p>
         </w:tc>
@@ -12483,12 +12555,7 @@
               <w:spacing w:before="20" w:after="20"/>
             </w:pPr>
             <w:r>
-              <w:rPr>
-                <w:b w:val="0"/>
-                <w:i w:val="0"/>
-                <w:sz w:val="18"/>
-              </w:rPr>
-              <w:t>Sun</w:t>
+              <w:t>Солнце</w:t>
             </w:r>
           </w:p>
         </w:tc>
@@ -12501,12 +12568,7 @@
               <w:spacing w:before="20" w:after="20"/>
             </w:pPr>
             <w:r>
-              <w:rPr>
-                <w:b w:val="0"/>
-                <w:i w:val="0"/>
-                <w:sz w:val="18"/>
-              </w:rPr>
-              <w:t>—</w:t>
+              <w:t>-</w:t>
             </w:r>
           </w:p>
         </w:tc>
@@ -15998,7 +16060,7 @@
               </w:rPr>
               <w:t xml:space="preserve">Pineal gland extraction, adrenochrome from living donors; bar-scene managed disclosure — see </w:t>
             </w:r>
-            <w:hyperlink r:id="rId197">
+            <w:hyperlink r:id="rId202">
               <w:r>
                 <w:rPr>
                   <w:b w:val="0"/>
@@ -19854,7 +19916,12 @@
               <w:spacing w:before="20" w:after="20"/>
             </w:pPr>
             <w:r>
-              <w:t>Робинсон</w:t>
+              <w:rPr>
+                <w:b w:val="0"/>
+                <w:i w:val="0"/>
+                <w:sz w:val="18"/>
+              </w:rPr>
+              <w:t>Robinson</w:t>
             </w:r>
           </w:p>
         </w:tc>
@@ -19867,7 +19934,12 @@
               <w:spacing w:before="20" w:after="20"/>
             </w:pPr>
             <w:r>
-              <w:t>Марсианская трилогия</w:t>
+              <w:rPr>
+                <w:b w:val="0"/>
+                <w:i w:val="0"/>
+                <w:sz w:val="18"/>
+              </w:rPr>
+              <w:t>Mars trilogy</w:t>
             </w:r>
           </w:p>
         </w:tc>
@@ -19880,7 +19952,12 @@
               <w:spacing w:before="20" w:after="20"/>
             </w:pPr>
             <w:r>
-              <w:t>Политическая революция, независимость</w:t>
+              <w:rPr>
+                <w:b w:val="0"/>
+                <w:i w:val="0"/>
+                <w:sz w:val="18"/>
+              </w:rPr>
+              <w:t>Political revolution, independence</w:t>
             </w:r>
           </w:p>
         </w:tc>
@@ -19893,7 +19970,12 @@
               <w:spacing w:before="20" w:after="20"/>
             </w:pPr>
             <w:r>
-              <w:t>Опубликовано SF</w:t>
+              <w:rPr>
+                <w:b w:val="0"/>
+                <w:i w:val="0"/>
+                <w:sz w:val="18"/>
+              </w:rPr>
+              <w:t>Published SF</w:t>
             </w:r>
           </w:p>
         </w:tc>
@@ -19980,8 +20062,24 @@
               <w:spacing w:before="20" w:after="20"/>
             </w:pPr>
             <w:r>
-              <w:t>См. ссылку на резню</w:t>
-            </w:r>
+              <w:rPr>
+                <w:b w:val="0"/>
+                <w:i w:val="0"/>
+                <w:sz w:val="18"/>
+              </w:rPr>
+              <w:t xml:space="preserve">See </w:t>
+            </w:r>
+            <w:hyperlink r:id="rId167">
+              <w:r>
+                <w:rPr>
+                  <w:b w:val="0"/>
+                  <w:i w:val="0"/>
+                  <w:color w:val="B8860B"/>
+                  <w:sz w:val="18"/>
+                </w:rPr>
+                <w:t>massacre reference</w:t>
+              </w:r>
+            </w:hyperlink>
           </w:p>
         </w:tc>
       </w:tr>
@@ -21513,12 +21611,7 @@
               <w:spacing w:before="20" w:after="20"/>
             </w:pPr>
             <w:r>
-              <w:rPr>
-                <w:b w:val="0"/>
-                <w:i w:val="0"/>
-                <w:sz w:val="18"/>
-              </w:rPr>
-              <w:t>1898</w:t>
+              <w:t>1898 год</w:t>
             </w:r>
           </w:p>
         </w:tc>
@@ -21567,7 +21660,12 @@
               <w:spacing w:before="20" w:after="20"/>
             </w:pPr>
             <w:r>
-              <w:t>Испано-американская война; Куба, Филиппины, Гуам</w:t>
+              <w:rPr>
+                <w:b w:val="0"/>
+                <w:i w:val="0"/>
+                <w:sz w:val="18"/>
+              </w:rPr>
+              <w:t>Spanish-American War; Cuba, Philippines, Guam</w:t>
             </w:r>
           </w:p>
         </w:tc>
@@ -24156,7 +24254,7 @@
     </w:p>
     <w:p>
       <w:r>
-        <w:t>Иезуиты — тайное общество Иисуса — были основным инструментом распространения реформированного монотеизма во всем мире: преобразование коренного населения, редактирование христианства в контролируемый Римом католицизм и расширение Крестового похода в Новый Свет. Теологический механизм, проанализированный в «Глубоком государстве», отредактирует христианство.</w:t>
+        <w:t>Иезуиты — тайное общество Иисуса — были основным инструментом распространения реформированного монотеизма во всем мире: преобразование коренного населения, редактирование христианства в контролируемый Римом католицизм и расширение Крестового похода в Новый Свет. Теологический механизм, проанализированный в «Глубоком государстве», отредактирует христианство. Восстановление девятнадцатого века, протестантский захват карт, Иерусалим III и 324-летний тезис о разрыве обращены к книге в Иезуитской Реставрации: План миссии; детали следуют в разделе 1814 реставрация и протестантский захват архива ниже.</w:t>
       </w:r>
     </w:p>
     <w:p>
@@ -24272,6 +24370,103 @@
     <w:p>
       <w:r>
         <w:t>Сокращения Гуарани — автономные общины численностью до 150 000 человек под управлением иезуитов, защищенные от работорговцев — были по колониальным стандартам удивительно гуманными и именно поэтому были разрушены Мадридским договором (1750).</w:t>
+      </w:r>
+    </w:p>
+    <w:p>
+      <w:pPr>
+        <w:pBdr>
+          <w:bottom w:val="single" w:sz="6" w:space="1" w:color="CCCCCC"/>
+        </w:pBdr>
+      </w:pPr>
+    </w:p>
+    <w:p>
+      <w:pPr>
+        <w:pStyle w:val="Heading3"/>
+        <w:keepNext/>
+        <w:keepLines/>
+      </w:pPr>
+      <w:r>
+        <w:t>Реставрация 1814 года и захват архива протестантами</w:t>
+      </w:r>
+    </w:p>
+    <w:p>
+      <w:pPr>
+        <w:pStyle w:val="Heading4"/>
+        <w:keepNext/>
+        <w:keepLines/>
+      </w:pPr>
+      <w:r>
+        <w:t>Что на самом деле построили миссии</w:t>
+      </w:r>
+    </w:p>
+    <w:p>
+      <w:r>
+        <w:t>По всей Америке, Азии и Африке иезуитские миссии сочетали давление преобразования с серьезной лингвистикой и этнографией: грамматика, отношения, звездные знания, растительные знания и политические карты эскизов. Там, где позволяло время, отцы часто договаривались о местных обрядах в католической раме, а не разбивали их при первом контакте. Честь этой работы, независимо от ее соучастия с империей, заключается в том, что большая часть архива сохраняет содержание коренных народов, которое более поздние режимы предпочитали забывать.</w:t>
+      </w:r>
+    </w:p>
+    <w:p>
+      <w:pPr>
+        <w:pStyle w:val="Heading4"/>
+        <w:keepNext/>
+        <w:keepLines/>
+      </w:pPr>
+      <w:r>
+        <w:t>Угон русско-иезуитского синтеза</w:t>
+      </w:r>
+    </w:p>
+    <w:p>
+      <w:r>
+        <w:t>Эта хронология утверждает, что протестантские научные и финансовые сети не просто не соглашались с Римом; они унаследовали практический результат мира Романовых-иезуитов — атласные пластины, знание маршрутов, этнографические файлы — после того, как этот результат был отмыт через суды и торговые дома. «Русская» картография и хронография в восемнадцатом веке уже смешали ордынский, романовский и иезуитский труд; глубокое государство девятнадцатого века находилось в состоянии переименовать этот синтез в нейтральную науку, лишив ее ордынского каркаса. Восстановление Общества в 1814 году не изменило этот сдвиг: оно вернуло иезуитов под папское право, оставив печатную культуру, университетские кафедры и финансы в основном в протестантских или латитудианских руках. В этом чтении восстановленные провинции должны были преподавать и цитировать в рамках ландшафта протестантских стандартных историй и отредактированных протестантами карт мира, независимо от того, какую римскую лояльность поддерживали отдельные провинции.</w:t>
+      </w:r>
+    </w:p>
+    <w:p>
+      <w:pPr>
+        <w:pStyle w:val="Heading4"/>
+        <w:keepNext/>
+        <w:keepLines/>
+      </w:pPr>
+      <w:r>
+        <w:t>Протестантский католицизм и 324-летний разрыв</w:t>
+      </w:r>
+    </w:p>
+    <w:p>
+      <w:r>
+        <w:t>Вытаскивание иезуитов и католической элиты из орды-романовского источника в отдельную европейскую аристократию — университет, курию в изгнании из этого источника, городские финансы — не было незначительным литургическим изменением. Эта хронология утверждает, что это был метод, с помощью которого протестантские хронологи и покровители создали, по историческому эффекту, католическую церковь, которую современный мир признает: римский аппарат, чья генеалогия была отделена от цивилизационного центра, который питал его миссии и карты, а затем пересказывался в скалигеровское время. Разрыв показывает в записи хронологическую рану: история учебников просит папство соединить века, где ни одна мировая империя не держит линию - только фрагментация и хаос на скалигеровской странице.</w:t>
+      </w:r>
+    </w:p>
+    <w:p>
+      <w:r>
+        <w:t>В скалигеровских учебниках 324 года между конвенцией 476 года н.э. о конце Западной Римской империи и 800 годом н.э. для императорской коронации Карла Великого — перезапуска Каролингов. Этот интервал достаточно длинный, чтобы стереть непрерывную имперскую память, если подлежащая экумена была в другом месте. Новая Хронология (см. Построение Новой Хронологии, Фоменко) часто перемещает один и тот же структурный пролет, поэтому эти события находятся ближе к 1476 и 1800 гг. н.э. (сохранение 324-летнего расстояния между парой при смене абсолютных дат). В любой схеме датирования середина изображается как междуцарствие: ни одно мировое государство, повествовательная тьма, папско-французское или национальное лоскутное одеяло — текстура католицизма, вырезанная из происхождения и вставленная в прошлое, созданное протестантами.</w:t>
+      </w:r>
+    </w:p>
+    <w:p>
+      <w:pPr>
+        <w:pStyle w:val="Heading4"/>
+        <w:keepNext/>
+        <w:keepLines/>
+      </w:pPr>
+      <w:r>
+        <w:t>Наполеон и «военный порядок»</w:t>
+      </w:r>
+    </w:p>
+    <w:p>
+      <w:r>
+        <w:t>Режимы Наполеона изгоняли или ограничивали иезуитов и рассматривали их как проблему безопасности. Полемика девятнадцатого века часто цитирует его следующим образом: Общество — это военная организация, а не религиозный орден; его высшее руководство — генерал, а не настоятель; его цель — власть — абсолютная, универсальная — скрепленная повиновением единой воле, сосредоточенной на генерале в Риме; поэтому оно не может быть безопасным партнером для установленной гражданской власти. Точная формулировка оспаривается (многие строки проходят через английские антологии и антииезуитскую литературу), но политика не оспаривается: подозрение в том, что Общество освободило пространство для национальных церквей и светских министерств, чтобы контролировать школы и архивы, в то время как протестантские редакторы продвинули скалигеровскую хронологию и новую географию Святой Земли. Для самой хронологической войны см. Глубокое государство стирает Российскую империю из всей хронологии.</w:t>
+      </w:r>
+    </w:p>
+    <w:p>
+      <w:pPr>
+        <w:pStyle w:val="Heading4"/>
+        <w:keepNext/>
+        <w:keepLines/>
+      </w:pPr>
+      <w:r>
+        <w:t>1812 — тактическая потеря, стратегический поворот</w:t>
+      </w:r>
+    </w:p>
+    <w:p>
+      <w:r>
+        <w:t>Французская катастрофа в России в 1812 году была существенным поражением для вторжения, которое поддерживала Сити. Эта временная шкала рассматривает такие поражения как привычно конвертируемые: замороженная армия является потерей заголовка, но повествование о паломничестве, библейская география и востоковедческая наука все еще могут управляться в последующие десятилетия. Сожжение Москвы в 1812 году отрицало зимние кварталы захватчиков и уничтожило живой православный Иерусалимский полюс, который мог бы оспаривать любую конкурирующую священную географию. После того, как этот центр был уменьшен своими собственными защитниками, новый Иерусалим под управлением протестантского паломничества — Иерусалим III на платформе Аль-Акса в Палестине, с Константинополем / Царь-Градом, читаемым как разрушенный библейский Иерусалим вдоль маршрута тура — мог быть установлен с меньшим количеством заслуживающих доверия восточных претендентов, оставшихся стоять в камне.</w:t>
       </w:r>
     </w:p>
     <w:p>
@@ -24653,7 +24848,74 @@
     </w:p>
     <w:p>
       <w:r>
-        <w:t>Современные карикатуры изображают Наполеона как миниатюрного (~ 4'). Западные популяции разводились меньше, разница в росте с русским населением была реальной. Западные армии компенсировали массированной, стандартизированной артиллерией (системы эпохи Грюбоваль), доктриной и — в революционной армии — привязали водородные воздушные шары для разведки, где по-прежнему действовал аэростатический корпус. Плазменные пушки и осадное оружие на основе плазмы исключены из наполеоновской картины: они превзошли бы то, что могла операционализировать открытая наука 19-го века, а военные знания уже двигались за разрозненными, отвергнутыми каналами — не в массовые полевые части для революционной армии. Спекулятивная преемственность ограничивается звуковыми / резонансными боеприпасами, масштабируемой логистикой легче воздуха и легендами о лифтах с заряженной массой — см. /governance / war / investigations /napoleonic-advanced-artillery-airship-investigation.md. Нить Марса / Пугачева остается отдельной временной линией, пока датированная цепочка не свяжет ее с французским ORBAT в России.</w:t>
+        <w:t>Современные карикатуры изображают Наполеона как миниатюрного (~ 4'). Западные популяции разводились меньше, разница в росте с русским населением была реальной. Западные армии компенсировали массированной, стандартизированной артиллерией (системы эпохи Грюбоваль), доктриной и — на открытой записи — привязанными водородными воздушными шарами для разведки, где все еще действовал аэростатический корпус. Плазменные пушки и осадное оружие на основе плазмы исключены из наполеоновской картины: они превзошли бы то, что могла операционализировать открытая наука 19-го века, а военные знания уже двигались за разрозненными, отвергнутыми каналами — не в массовые полевые части для революционной армии. Воздушные шары на публичных записях - слабый матч для наступательного стратегического подъема (медленный, трудно маневрируемый, легко нацеленный); где логистика или легенда подразумевают пересечение основных барьеров, не перетаскивая полный осадный поезд по каждой дороге, эта хронология предпочитает классифицированные антигравитационные или заряженные массовые платформы - прочные, стабильные и менее тривиально сбитые, чем газовый мешок - над воздушными шарами. Зимний провал разрабатывается под Лифтовые платформы, зимнюю оккупацию и Кремль ниже. Дальнейшие темы: звуковые / резонансные боеприпасы, эфир или легенды о подъёме заряженной массы — см. /governance/war/investigations/napoleonic-advanced-artillery-airship-investigation.md. Нить Марса / Пугачева остается отдельной временной линией, пока датированная цепочка не свяжет ее с французским ORBAT в России.</w:t>
+      </w:r>
+    </w:p>
+    <w:p>
+      <w:pPr>
+        <w:pBdr>
+          <w:bottom w:val="single" w:sz="6" w:space="1" w:color="CCCCCC"/>
+        </w:pBdr>
+      </w:pPr>
+    </w:p>
+    <w:p>
+      <w:pPr>
+        <w:pStyle w:val="Heading3"/>
+        <w:keepNext/>
+        <w:keepLines/>
+      </w:pPr>
+      <w:r>
+        <w:t>Лифтовые платформы, зимняя оккупация и Кремль</w:t>
+      </w:r>
+    </w:p>
+    <w:p>
+      <w:r>
+        <w:t>Спекулятивное продолжение зимней диссертации 1812 года.</w:t>
+      </w:r>
+    </w:p>
+    <w:p>
+      <w:pPr>
+        <w:pStyle w:val="Heading4"/>
+        <w:keepNext/>
+        <w:keepLines/>
+      </w:pPr>
+      <w:r>
+        <w:t>Воздушные шары против классифицированных аэродинов</w:t>
+      </w:r>
+    </w:p>
+    <w:p>
+      <w:r>
+        <w:t>Водородные шары в революционной и наполеоновской армиях были главным образом наблюдательными средствами: привязанными или едва маневренными конвертами. Этот профиль плохо подходит для решающего подъема на поле боя - большие тканевые цели, уязвимые для выстрелов и огня, неудобные для перепозиционирования в условиях конкуренции. Если французы (или их скрытый ярус) перемещали тяжелые возможности через препятствия, такие как Альпы, не сопоставляя каждую классическую историю о пушке, которую тащили по дороге и мул, воздушный шар с открытой записью не является лучшим аналогом. Эта хронология утверждает, что секретная военная антигравитация или плотный полевой подъем - корпуса, воображаемые как прочные и стабильные, труднее отрицать, чем воздушный шар - является более надежным скрытым дополнением к открытой артиллерии эпохи Грибовала, а не дирижаблей, как мы себе представляем, для линейного боя.</w:t>
+      </w:r>
+    </w:p>
+    <w:p>
+      <w:pPr>
+        <w:pStyle w:val="Heading4"/>
+        <w:keepNext/>
+        <w:keepLines/>
+      </w:pPr>
+      <w:r>
+        <w:t>Зима: высадка и оккупация</w:t>
+      </w:r>
+    </w:p>
+    <w:p>
+      <w:r>
+        <w:t>Русская зима не должна была заземлять такие суда в простом смысле, убивая лифт или замораживая машины. Более острым узким местом является оккупация: для удержания России нужны люди на земле — патроны, фураж, гарнизоны, запугивание элит. Экипажи, которые могли выжить внутри корпуса, возможно, все еще боялись оставить его для температуры и партизанской страны. Платформы, вероятно, не были спроектированы в течение нескольких месяцев экстремально холодного жилья (отопление, тюлени, логистика жизнеобеспечения), даже если они все еще летали. Превосходство воздуха в этой раме не заменяет каменные стены и зимние магазины; он не может управлять городом с высоты, пока солдаты замораживают момент, когда они выходят.</w:t>
+      </w:r>
+    </w:p>
+    <w:p>
+      <w:pPr>
+        <w:pStyle w:val="Heading4"/>
+        <w:keepNext/>
+        <w:keepLines/>
+      </w:pPr>
+      <w:r>
+        <w:t>Кремль как зимний редут</w:t>
+      </w:r>
+    </w:p>
+    <w:p>
+      <w:r>
+        <w:t>Выжженная Москва была не только цивилизационным жестом. Кремль предложил укрепленный камень, ограждение и внутренний объем, подходящий для зимовки большой силы - прорыва ветра, обороны и правдоподобного пути, чтобы пережить сезон внутри стен, а не в открытом бивуаке. Отрицание Наполеона неповрежденной цитадели и столицы устранило последний дом, который мог превратить сентябрьский вход в весну, все еще удерживающую Москву. См. Aftermath of 1812 for the book-facing summary.</w:t>
       </w:r>
     </w:p>
     <w:p>
@@ -24720,7 +24982,7 @@
     </w:p>
     <w:p>
       <w:r>
-        <w:t>Стратегической целью вторжения было принуждение царя Александра I к переговорам путем захвата старой символической столицы. Но Москва в 1812 году уже не была ее центром. Романовы переехали в Санкт-Петербург, Москва была административным захолустьем. Когда Александр отказался вести переговоры и русские сами сожгли Москву, а не позволили ей служить французским зимним штабом, у Наполеона не осталось стратегической цели. Он пять недель занимал обугленные руины и отступил в русскую зиму.</w:t>
+        <w:t>Стратегической целью вторжения было принуждение царя Александра I к переговорам путем захвата старой символической столицы. Но Москва в 1812 году уже не была ее центром. Романовы переехали в Санкт-Петербург, Москва была административным захолустьем. Когда Александр отказался вести переговоры и русские сами сожгли Москву, а не позволили ей служить французским зимним штабом, у Наполеона не осталось стратегической цели. Кремль, в частности, дал бы оккупанту зимние кварталы, окруженные стенами; его потеря с более широким ожогом закрыла бы самый надежный способ провести столицу через холод. Он пять недель занимал обугленные руины и отступил в русскую зиму.</w:t>
       </w:r>
     </w:p>
     <w:p>
@@ -24755,7 +25017,7 @@
     </w:p>
     <w:p>
       <w:r>
-        <w:t>Обычное объяснение, что Наполеон просто высокомерно относился к логистике, упускает два критических фактора. Во-первых, Энергетическое событие Грязного Потопа 1774 года дестабилизировало климат Земли всего сорок лет назад. Погодные условия, которые были надежными на протяжении веков, теперь были хаотичными; французское верховное командование планировало на основе исторических данных, которые больше не были действительными. Во-вторых, на какой бы край ни опирались французы — артиллерийский темп, расчеты поставок, возможно, наблюдательные воздушные шары в некоторых театрах — встречались логистический коллапс и экстремальные холода (бронза, лошади, дороги, фуража). Эта неудача согласуется с перенапряжением и климатом без плазменного оружия (которое эта временная шкала не относит к 1812 году). Спекулятивные звуковые потоки и потоки дирижаблей (включая параллели прогностического программирования) см. /governance/war/investigations/napoleonic-advanced-artillery-airship-investigation.md. Для более глубокого финансового контекста войны см. Aftermath 1812.</w:t>
+        <w:t>Обычное объяснение, что Наполеон просто высокомерно относился к логистике, упускает два критических фактора. Во-первых, Энергетическое событие Грязного Потопа 1774 года дестабилизировало климат Земли всего сорок лет назад. Погодные условия, которые были надежными на протяжении веков, теперь были хаотичными; французское верховное командование планировало на основе исторических данных, которые больше не были действительными. Во-вторых, независимо от того, на какой край опирались французы - темп артиллерии, расчеты поставок, возможно, классифицированный подъемник наряду с наблюдательными воздушными шарами на публичных записях - встретил логистический коллапс, экстремальный холод и невозможность оккупации с воздуха, когда экипажи не могли безопасно удерживать землю или зимовать в камне. Эта неудача согласуется с перенапряжением и климатом без плазменного оружия (которое эта временная шкала не относит к 1812 году). Для лифта, кремлевского сомнения и воздействия на экипаж см. Лифтовые платформы, зимняя оккупация и Кремль выше; для звуковых боеприпасов и следственных связей см. /governance/war/investigations/napoleonic-advanced-artillery-airship-investigation.md. Для более глубокого финансового контекста войны см. Aftermath 1812.</w:t>
       </w:r>
     </w:p>
     <w:p>
@@ -26237,26 +26499,7 @@
               <w:spacing w:before="20" w:after="20"/>
             </w:pPr>
             <w:r>
-              <w:rPr>
-                <w:b w:val="0"/>
-                <w:i w:val="0"/>
-                <w:sz w:val="18"/>
-              </w:rPr>
-            </w:r>
-            <w:r>
-              <w:rPr>
-                <w:b/>
-                <w:i w:val="0"/>
-                <w:sz w:val="18"/>
-              </w:rPr>
-              <w:t>Emmanuel Macron</w:t>
-            </w:r>
-            <w:r>
-              <w:rPr>
-                <w:b w:val="0"/>
-                <w:i w:val="0"/>
-                <w:sz w:val="18"/>
-              </w:rPr>
+              <w:t>Эммануэль Макрон</w:t>
             </w:r>
           </w:p>
         </w:tc>
@@ -26282,12 +26525,7 @@
               <w:spacing w:before="20" w:after="20"/>
             </w:pPr>
             <w:r>
-              <w:rPr>
-                <w:b w:val="0"/>
-                <w:i w:val="0"/>
-                <w:sz w:val="18"/>
-              </w:rPr>
-              <w:t>Proposed sending European ground troops to Ukraine; pushed "strategic ambiguity" on nuclear threshold; drove EU military integration rhetoric while French economy contracted</w:t>
+              <w:t>Предложение отправить европейские наземные войска на Украину; подталкивание «стратегической двусмысленности» на ядерном пороге; подталкивание риторики военной интеграции ЕС в то время как французская экономика сокращалась</w:t>
             </w:r>
           </w:p>
         </w:tc>
@@ -26612,7 +26850,12 @@
               <w:spacing w:before="20" w:after="20"/>
             </w:pPr>
             <w:r>
-              <w:t>Скоординированные военные обязательства альянса; поддержание обмена сообщениями о единстве НАТО; замена Столтенберга и продолжение одинаковой траектории эскалации</w:t>
+              <w:rPr>
+                <w:b w:val="0"/>
+                <w:i w:val="0"/>
+                <w:sz w:val="18"/>
+              </w:rPr>
+              <w:t>Coordinated alliance military commitments; maintained NATO unity messaging; replaced Stoltenberg and continued identical escalation trajectory</w:t>
             </w:r>
           </w:p>
         </w:tc>
@@ -26709,26 +26952,7 @@
               <w:spacing w:before="20" w:after="20"/>
             </w:pPr>
             <w:r>
-              <w:rPr>
-                <w:b w:val="0"/>
-                <w:i w:val="0"/>
-                <w:sz w:val="18"/>
-              </w:rPr>
-            </w:r>
-            <w:r>
-              <w:rPr>
-                <w:b/>
-                <w:i w:val="0"/>
-                <w:sz w:val="18"/>
-              </w:rPr>
-              <w:t>Joe Biden</w:t>
-            </w:r>
-            <w:r>
-              <w:rPr>
-                <w:b w:val="0"/>
-                <w:i w:val="0"/>
-                <w:sz w:val="18"/>
-              </w:rPr>
+              <w:t>Джо Байден</w:t>
             </w:r>
           </w:p>
         </w:tc>
@@ -26759,7 +26983,12 @@
               <w:spacing w:before="20" w:after="20"/>
             </w:pPr>
             <w:r>
-              <w:t>Разрешенная военная и экономическая помощь в размере 175 млрд. долларов США; одобренная ATACMS; «зеленые» удары по территории России; «не может оставаться у власти» — смена режима в ядерном государстве</w:t>
+              <w:rPr>
+                <w:b w:val="0"/>
+                <w:i w:val="0"/>
+                <w:sz w:val="18"/>
+              </w:rPr>
+              <w:t>Authorised $175B+ in military and economic aid; approved ATACMS; greenlit strikes into Russian territory; "cannot remain in power" — regime change in a nuclear-armed state</w:t>
             </w:r>
           </w:p>
         </w:tc>
@@ -26889,7 +27118,12 @@
               <w:spacing w:before="20" w:after="20"/>
             </w:pPr>
             <w:r>
-              <w:t>Управляла дипломатической изоляцией; отвергала каждое мирное предложение как «российскую пропаганду»</w:t>
+              <w:rPr>
+                <w:b w:val="0"/>
+                <w:i w:val="0"/>
+                <w:sz w:val="18"/>
+              </w:rPr>
+              <w:t>Managed diplomatic isolation; dismissed every peace proposal as "Russian propaganda"</w:t>
             </w:r>
           </w:p>
         </w:tc>
@@ -27629,12 +27863,7 @@
               <w:spacing w:before="20" w:after="20"/>
             </w:pPr>
             <w:r>
-              <w:rPr>
-                <w:b w:val="0"/>
-                <w:i w:val="0"/>
-                <w:sz w:val="18"/>
-              </w:rPr>
-              <w:t>Refinements and miniaturizations; particle accelerators; no fundamentally new energy paradigms</w:t>
+              <w:t>Утонченность и миниатюризация; ускорители частиц; отсутствие принципиально новых энергетических парадигм</w:t>
             </w:r>
           </w:p>
         </w:tc>
@@ -27702,7 +27931,7 @@
     </w:p>
     <w:p>
       <w:r>
-        <w:t>В 1865 году Максвелл опубликовал уравнения, описывающие электромагнитные волны, распространяющиеся через физическую среду — эфир. Скорость света вытекает из двух измеренных свойств вакуума: (c = 1/\sqrt{\mu 0\varepsilon 0}) — проницаемость и проницаемость. Свойства чего? Ничто не может иметь измеримых характеристик. Такая же логика, как и скорость звука в воздухе: среда определяет скорость. Его оригинальные уравнения 20 кватернионов включали продольные волны, гравитационно-ЭМ связь, тензор среднего напряжения. Хевисайд разделил их на 4 векторных уравнения; остальные были объявлены эфир-свободными. Тесла, Стейнметц, Хевисайд, Эйнштейн все утверждали эфир; «его не существует» пришло из поколения, которое классифицировало. Каждая технология ниже использует одну и ту же среду. Авторская диссертация: Подавление эфира является главным ключом — не заговор, а инженерия.</w:t>
+        <w:t>В 1865 году Максвелл опубликовал уравнения, описывающие электромагнитные волны, распространяющиеся через физическую среду — эфир. Скорость света вытекает из двух измеренных свойств вакуума: (c = 1/\sqrt{\mu 0\varepsilon 0}) — проницаемость и проницаемость. Свойства чего? Ничто не может иметь измеримых характеристик. Такая же логика, как и скорость звука в воздухе: среда определяет скорость. Его оригинальные уравнения 20 кватернионов включали продольные волны, гравитационно-ЭМ связь, тензор среднего напряжения. Хевисайд разделил их на 4 векторных уравнения; остальные были объявлены эфир-свободными. Тесла, Стейнметц, Хевисайд, Эйнштейн все утверждали эфир; «его не существует» пришло из поколения, которое классифицировало. Каждая технология ниже использует одну и ту же среду. На этом чтении подавление эфира является главным ключом — инженерией и классификацией, а не единым развенчивающим экспериментом.</w:t>
       </w:r>
     </w:p>
     <w:p>
@@ -27829,7 +28058,26 @@
               <w:spacing w:before="20" w:after="20"/>
             </w:pPr>
             <w:r>
-              <w:t>Передача энергии</w:t>
+              <w:rPr>
+                <w:b w:val="0"/>
+                <w:i w:val="0"/>
+                <w:sz w:val="18"/>
+              </w:rPr>
+            </w:r>
+            <w:r>
+              <w:rPr>
+                <w:b/>
+                <w:i w:val="0"/>
+                <w:sz w:val="18"/>
+              </w:rPr>
+              <w:t>Energy transmission</w:t>
+            </w:r>
+            <w:r>
+              <w:rPr>
+                <w:b w:val="0"/>
+                <w:i w:val="0"/>
+                <w:sz w:val="18"/>
+              </w:rPr>
             </w:r>
           </w:p>
         </w:tc>
@@ -27895,17 +28143,9 @@
             <w:pPr>
               <w:spacing w:before="20" w:after="20"/>
             </w:pPr>
-            <w:hyperlink r:id="rId147">
-              <w:r>
-                <w:rPr>
-                  <w:b w:val="0"/>
-                  <w:i w:val="0"/>
-                  <w:color w:val="B8860B"/>
-                  <w:sz w:val="18"/>
-                </w:rPr>
-                <w:t>Maxwell &amp; the Aether</w:t>
-              </w:r>
-            </w:hyperlink>
+            <w:r>
+              <w:t>Исполнитель: Maxwell &amp; The Aether</w:t>
+            </w:r>
           </w:p>
         </w:tc>
       </w:tr>
@@ -28408,7 +28648,7 @@
             <w:pPr>
               <w:spacing w:before="20" w:after="20"/>
             </w:pPr>
-            <w:hyperlink r:id="rId220">
+            <w:hyperlink r:id="rId225">
               <w:r>
                 <w:rPr>
                   <w:b w:val="0"/>
@@ -28517,7 +28757,7 @@
             <w:pPr>
               <w:spacing w:before="20" w:after="20"/>
             </w:pPr>
-            <w:hyperlink r:id="rId281">
+            <w:hyperlink r:id="rId289">
               <w:r>
                 <w:rPr>
                   <w:b w:val="0"/>
@@ -29600,7 +29840,12 @@
               <w:spacing w:before="20" w:after="20"/>
             </w:pPr>
             <w:r>
-              <w:t>Раскрывается, что эфир можно манипулировать → подтверждает Тесла, опровергает столетие физики</w:t>
+              <w:rPr>
+                <w:b w:val="0"/>
+                <w:i w:val="0"/>
+                <w:sz w:val="18"/>
+              </w:rPr>
+              <w:t>Reveals that the aether is manipulable → validates Tesla, invalidates a century of physics</w:t>
             </w:r>
           </w:p>
         </w:tc>
@@ -29647,7 +29892,12 @@
               <w:spacing w:before="20" w:after="20"/>
             </w:pPr>
             <w:r>
-              <w:t>Вся энергетическая отрасль устарела: экзистенциальная угроза силовым структурам</w:t>
+              <w:rPr>
+                <w:b w:val="0"/>
+                <w:i w:val="0"/>
+                <w:sz w:val="18"/>
+              </w:rPr>
+              <w:t>Renders entire energy sector obsolete → existential threat to power structures</w:t>
             </w:r>
           </w:p>
         </w:tc>
@@ -29911,6 +30161,15 @@
         <w:spacing w:before="20" w:after="20"/>
       </w:pPr>
       <w:r>
+        <w:t>Пирамиды: мифы против реальности — искусственный транспорт Бифроста / среднего уровня (изображения Радужного моста)</w:t>
+      </w:r>
+    </w:p>
+    <w:p>
+      <w:pPr>
+        <w:pStyle w:val="ListBullet"/>
+        <w:spacing w:before="20" w:after="20"/>
+      </w:pPr>
+      <w:r>
         <w:t>1946 — Управление погодой — манипуляция атмосферным эфиром</w:t>
       </w:r>
     </w:p>
@@ -31084,6 +31343,11 @@
     </w:p>
     <w:p>
       <w:r>
+        <w:t>Эпизод Доннера часто связан с Забытой надеждой (1846-47), партией снегоступов, которая отделилась, чтобы получить помощь и оставила короткий, хорошо документированный след голода, убийств и каннибализма среди мертвых. Затерянные 49ers (1849), ища кратчайший путь к раскопкам, были загнаны в страну Долины Смерти и умерли главным образом от жажды и воздействия, пока внешняя помощь не прибыла - параллельный "неправильный поворот" катастрофа без Сьерра снег повествования. Многие поезда 1840-50-х годов, которые отставали и встречали раннюю зиму в Сьерре или Скалистых горах, голодали в меньших масштабах; каннибализм в море под голодом (например, Эссекс, 1820) показывает то же самое последнее средство перед сухопутной золотой лихорадкой.</w:t>
+      </w:r>
+    </w:p>
+    <w:p>
+      <w:r>
         <w:t>Полное исследование (источники, границы, открытые вопросы): /история / хронология / исследования / медленный-экологический-коллапс-мфе-через-donner-era.md</w:t>
       </w:r>
     </w:p>
@@ -31156,6 +31420,15 @@
     </w:p>
     <w:p>
       <w:pPr>
+        <w:pStyle w:val="ListBullet"/>
+        <w:spacing w:before="20" w:after="20"/>
+      </w:pPr>
+      <w:r>
+        <w:t>evt-1833-ce-josiah-священник-американские древности</w:t>
+      </w:r>
+    </w:p>
+    <w:p>
+      <w:pPr>
         <w:pBdr>
           <w:bottom w:val="single" w:sz="6" w:space="1" w:color="CCCCCC"/>
         </w:pBdr>
@@ -31169,6 +31442,11 @@
     <w:p>
       <w:r>
         <w:t>Основная этимология (европейская новизна; Новая Зеландия из Голландской Зеландии) не отбрасывается в исследовании; вопрос состоит в многослойном значении и разрывах карты после ~1774. Мундус Новус может отражать голос тех, кто бежит от кризиса 1492 года, в то время как кадр «Нового мира» резко расширился в официальном использовании после MFEE — ранний тираж и рост после 1774 года не рассматриваются как взаимоисключающие.</w:t>
+      </w:r>
+    </w:p>
+    <w:p>
+      <w:r>
+        <w:t>Периодическая печать (США, доколумбовая память): Жосия-священник, американские древности и открытия на Западе (Албания: Хоффман и Уайт, 1833), собирает путешественники и антикварный материал, утверждая, что цивилизованные народы, отличные от современных коренных народов, населяли Америки за столетия до Колумба, ссылаясь среди других ниток финикийские, датские / норвежские и валлийские путешествия, рассеяние Ноя и восточные курганы и земляные работы. Эта хронология ссылается на Священника как на свидетельство популярного повествования 19-го века, а не как на доказательство предыстории. 1833 г. н.э. — Josiah Priest публикует «Американские древности». Факсимиле: Интернет-архив. Полная библиография и использование в данном исследовании: § Жозеф-священник: Американские древности (1833).</w:t>
       </w:r>
     </w:p>
     <w:p>
@@ -32045,12 +32323,7 @@
               <w:spacing w:before="20" w:after="20"/>
             </w:pPr>
             <w:r>
-              <w:rPr>
-                <w:b w:val="0"/>
-                <w:i/>
-                <w:sz w:val="18"/>
-              </w:rPr>
-              <w:t>The Lion, the Witch and the Wardrobe</w:t>
+              <w:t>Лев, ведьма и шкаф</w:t>
             </w:r>
           </w:p>
         </w:tc>
@@ -32113,7 +32386,12 @@
               <w:spacing w:before="20" w:after="20"/>
             </w:pPr>
             <w:r>
-              <w:t>Аслан как король Юпитера; поражение вечной зимы; прибытие Деда Мороза; коронация</w:t>
+              <w:rPr>
+                <w:b w:val="0"/>
+                <w:i w:val="0"/>
+                <w:sz w:val="18"/>
+              </w:rPr>
+              <w:t>Aslan as Jupiter-king; the defeat of perpetual winter; Father Christmas's arrival; the coronation</w:t>
             </w:r>
           </w:p>
         </w:tc>
@@ -32196,7 +32474,12 @@
               <w:spacing w:before="20" w:after="20"/>
             </w:pPr>
             <w:r>
-              <w:t>Боевое повествование; воинская честь Рипичипа; деревья, идущие на войну; весь сюжет - военная кампания</w:t>
+              <w:rPr>
+                <w:b w:val="0"/>
+                <w:i w:val="0"/>
+                <w:sz w:val="18"/>
+              </w:rPr>
+              <w:t>Battle narrative; Reepicheep's martial honor; trees going to war; the entire plot is a military campaign</w:t>
             </w:r>
           </w:p>
         </w:tc>
@@ -32280,7 +32563,12 @@
               <w:spacing w:before="20" w:after="20"/>
             </w:pPr>
             <w:r>
-              <w:t>Преображение золотого дракона Юстаса; крайний восток как чистый свет; золотые образы во всем</w:t>
+              <w:rPr>
+                <w:b w:val="0"/>
+                <w:i w:val="0"/>
+                <w:sz w:val="18"/>
+              </w:rPr>
+              <w:t>Eustace's golden dragon transformation; the utter east as pure light; gold imagery throughout</w:t>
             </w:r>
           </w:p>
         </w:tc>
@@ -32364,7 +32652,12 @@
               <w:spacing w:before="20" w:after="20"/>
             </w:pPr>
             <w:r>
-              <w:t>Серебряное кресло как лунное очарование; подземное заключение; заклинание Леди Зеленого Киртла</w:t>
+              <w:rPr>
+                <w:b w:val="0"/>
+                <w:i w:val="0"/>
+                <w:sz w:val="18"/>
+              </w:rPr>
+              <w:t>The Silver Chair as lunar enchantment; underground imprisonment; the Lady of the Green Kirtle's lunacy-inducing spell</w:t>
             </w:r>
           </w:p>
         </w:tc>
@@ -32447,7 +32740,12 @@
               <w:spacing w:before="20" w:after="20"/>
             </w:pPr>
             <w:r>
-              <w:t>История путешествия; Шаста / Кор как близнецы отделились и воссоединились; быстрый темп; рассказ Арависа</w:t>
+              <w:rPr>
+                <w:b w:val="0"/>
+                <w:i w:val="0"/>
+                <w:sz w:val="18"/>
+              </w:rPr>
+              <w:t>A journey story; Shasta/Cor as twins separated and reunited; the rapid pace; Aravis's storytelling</w:t>
             </w:r>
           </w:p>
         </w:tc>
@@ -32530,7 +32828,12 @@
               <w:spacing w:before="20" w:after="20"/>
             </w:pPr>
             <w:r>
-              <w:t>Создание Нарнии; сад; яблоко жизни; исцеление матери Дигори; созидательная сила</w:t>
+              <w:rPr>
+                <w:b w:val="0"/>
+                <w:i w:val="0"/>
+                <w:sz w:val="18"/>
+              </w:rPr>
+              <w:t>The creation of Narnia; the garden; the apple of life; Digory's mother healed; generative power</w:t>
             </w:r>
           </w:p>
         </w:tc>
@@ -32613,7 +32916,12 @@
               <w:spacing w:before="20" w:after="20"/>
             </w:pPr>
             <w:r>
-              <w:t>Конец Нарнии; сатурнинский отказ карликов; Пробуждение Отца Времени; последний суд</w:t>
+              <w:rPr>
+                <w:b w:val="0"/>
+                <w:i w:val="0"/>
+                <w:sz w:val="18"/>
+              </w:rPr>
+              <w:t>The end of Narnia; the dwarfs' saturnine refusal; Father Time awakened; the last judgment</w:t>
             </w:r>
           </w:p>
         </w:tc>
@@ -33281,7 +33589,47 @@
               <w:spacing w:before="20" w:after="20"/>
             </w:pPr>
             <w:r>
-              <w:t>То же название читается как преждевременная волна молодых гигантов перед главным хозяином — Первой статьей Крестового похода.</w:t>
+              <w:rPr>
+                <w:b w:val="0"/>
+                <w:i w:val="0"/>
+                <w:sz w:val="18"/>
+              </w:rPr>
+              <w:t xml:space="preserve">Same name read as </w:t>
+            </w:r>
+            <w:r>
+              <w:rPr>
+                <w:b/>
+                <w:i w:val="0"/>
+                <w:sz w:val="18"/>
+              </w:rPr>
+              <w:t>young giants’</w:t>
+            </w:r>
+            <w:r>
+              <w:rPr>
+                <w:b w:val="0"/>
+                <w:i w:val="0"/>
+                <w:sz w:val="18"/>
+              </w:rPr>
+              <w:t xml:space="preserve"> premature wave before the main host — </w:t>
+            </w:r>
+            <w:hyperlink r:id="rId319">
+              <w:r>
+                <w:rPr>
+                  <w:b w:val="0"/>
+                  <w:i w:val="0"/>
+                  <w:color w:val="B8860B"/>
+                  <w:sz w:val="18"/>
+                </w:rPr>
+                <w:t>First Crusade article</w:t>
+              </w:r>
+            </w:hyperlink>
+            <w:r>
+              <w:rPr>
+                <w:b w:val="0"/>
+                <w:i w:val="0"/>
+                <w:sz w:val="18"/>
+              </w:rPr>
+              <w:t>.</w:t>
             </w:r>
           </w:p>
         </w:tc>
@@ -33514,12 +33862,7 @@
               <w:spacing w:before="20" w:after="20"/>
             </w:pPr>
             <w:r>
-              <w:rPr>
-                <w:b w:val="0"/>
-                <w:i/>
-                <w:sz w:val="18"/>
-              </w:rPr>
-              <w:t>Pueri</w:t>
+              <w:t>Пуэри</w:t>
             </w:r>
           </w:p>
         </w:tc>
@@ -33532,7 +33875,44 @@
               <w:spacing w:before="20" w:after="20"/>
             </w:pPr>
             <w:r>
-              <w:t>Латинские «мальчики/дети»; используется из 1212 участников — часто интерпретируется как социальные иждивенцы или молодежь, не обязательно маленькие дети.</w:t>
+              <w:rPr>
+                <w:b w:val="0"/>
+                <w:i w:val="0"/>
+                <w:sz w:val="18"/>
+              </w:rPr>
+              <w:t xml:space="preserve">Latin “boys/children”; used of 1212 participants — often interpreted as </w:t>
+            </w:r>
+            <w:r>
+              <w:rPr>
+                <w:b/>
+                <w:i w:val="0"/>
+                <w:sz w:val="18"/>
+              </w:rPr>
+              <w:t>social dependents</w:t>
+            </w:r>
+            <w:r>
+              <w:rPr>
+                <w:b w:val="0"/>
+                <w:i w:val="0"/>
+                <w:sz w:val="18"/>
+              </w:rPr>
+              <w:t xml:space="preserve"> or </w:t>
+            </w:r>
+            <w:r>
+              <w:rPr>
+                <w:b/>
+                <w:i w:val="0"/>
+                <w:sz w:val="18"/>
+              </w:rPr>
+              <w:t>youths</w:t>
+            </w:r>
+            <w:r>
+              <w:rPr>
+                <w:b w:val="0"/>
+                <w:i w:val="0"/>
+                <w:sz w:val="18"/>
+              </w:rPr>
+              <w:t>, not necessarily small children.</w:t>
             </w:r>
           </w:p>
         </w:tc>
@@ -34019,8 +34399,8 @@
     </w:p>
     <w:p/>
     <w:sectPr>
-      <w:headerReference w:type="default" r:id="rId314"/>
-      <w:footerReference w:type="default" r:id="rId315"/>
+      <w:headerReference w:type="default" r:id="rId325"/>
+      <w:footerReference w:type="default" r:id="rId326"/>
       <w:pgSz w:w="8640" w:h="12960"/>
       <w:pgMar w:top="1020" w:right="1134" w:bottom="1134" w:left="1134" w:header="720" w:footer="720" w:gutter="0"/>
       <w:cols w:space="720"/>

</xml_diff>

<commit_message>
Link Cathar-Khazar hub and articles to suppression dossiers
- 10.05.01: Paradigm Threat repository dossiers section (Cathar + Eckhart)
- 10.03.02, 10.05.00: cross-links to investigations and Google Groups
- 15.07 Historical Antibodies: Eckhart dossier + Cathar § VII; fix stale § X ref
- Export artifacts, translation/export scripts, RU docx backups, postprocess helpers

Made-with: Cursor
</commit_message>
<xml_diff>
--- a/export/timeline-appendix-ru.docx
+++ b/export/timeline-appendix-ru.docx
@@ -2347,7 +2347,7 @@
         <w:pStyle w:val="Quote"/>
       </w:pPr>
       <w:r>
-        <w:t>TL;DR: TODO</w:t>
+        <w:t>Кратко: TODO</w:t>
       </w:r>
     </w:p>
     <w:p>
@@ -2789,7 +2789,7 @@
         <w:pStyle w:val="Quote"/>
       </w:pPr>
       <w:r>
-        <w:t>TL;DR: TODO</w:t>
+        <w:t>Кратко: TODO</w:t>
       </w:r>
     </w:p>
     <w:p>
@@ -3291,7 +3291,7 @@
         <w:pStyle w:val="Quote"/>
       </w:pPr>
       <w:r>
-        <w:t>TL;DR: TODO</w:t>
+        <w:t>Кратко: TODO</w:t>
       </w:r>
     </w:p>
     <w:p>
@@ -3854,7 +3854,7 @@
         <w:pStyle w:val="Quote"/>
       </w:pPr>
       <w:r>
-        <w:t>TL;DR: TODO</w:t>
+        <w:t>Кратко: TODO</w:t>
       </w:r>
     </w:p>
     <w:p>
@@ -4125,7 +4125,7 @@
         <w:pStyle w:val="Quote"/>
       </w:pPr>
       <w:r>
-        <w:t>TL;DR: TODO</w:t>
+        <w:t>Кратко: TODO</w:t>
       </w:r>
     </w:p>
     <w:p>
@@ -4353,7 +4353,7 @@
         <w:pStyle w:val="Quote"/>
       </w:pPr>
       <w:r>
-        <w:t>TL;DR: TODO</w:t>
+        <w:t>Кратко: TODO</w:t>
       </w:r>
     </w:p>
     <w:p>
@@ -4745,7 +4745,7 @@
         <w:pStyle w:val="Quote"/>
       </w:pPr>
       <w:r>
-        <w:t>TL;DR: TODO</w:t>
+        <w:t>Кратко: TODO</w:t>
       </w:r>
     </w:p>
     <w:p>
@@ -5324,7 +5324,7 @@
         <w:pStyle w:val="Quote"/>
       </w:pPr>
       <w:r>
-        <w:t>TL;DR: TODO</w:t>
+        <w:t>Кратко: TODO</w:t>
       </w:r>
     </w:p>
     <w:p>
@@ -5651,7 +5651,7 @@
         <w:pStyle w:val="Quote"/>
       </w:pPr>
       <w:r>
-        <w:t>TL;DR: TODO</w:t>
+        <w:t>Кратко: TODO</w:t>
       </w:r>
     </w:p>
     <w:p>
@@ -6045,7 +6045,7 @@
         <w:pStyle w:val="Quote"/>
       </w:pPr>
       <w:r>
-        <w:t>TL;DR: TODO</w:t>
+        <w:t>Кратко: TODO</w:t>
       </w:r>
     </w:p>
     <w:p>
@@ -7219,7 +7219,7 @@
         <w:pStyle w:val="Quote"/>
       </w:pPr>
       <w:r>
-        <w:t>TL;DR: TODO</w:t>
+        <w:t>Кратко: TODO</w:t>
       </w:r>
     </w:p>
     <w:p>
@@ -7757,7 +7757,7 @@
         <w:pStyle w:val="Quote"/>
       </w:pPr>
       <w:r>
-        <w:t>TL;DR: TODO</w:t>
+        <w:t>Кратко: TODO</w:t>
       </w:r>
     </w:p>
     <w:p>
@@ -8414,7 +8414,7 @@
         <w:pStyle w:val="Quote"/>
       </w:pPr>
       <w:r>
-        <w:t>TL;DR: TODO</w:t>
+        <w:t>Кратко: TODO</w:t>
       </w:r>
     </w:p>
     <w:p>
@@ -9304,7 +9304,7 @@
     <w:p/>
     <w:p>
       <w:r>
-        <w:t>Этот проект утверждает, что 684 г. до н.э., нулевой год и 1053 г. н.э. - это один и тот же момент, отделенный только сфабрикованным Blip. Посмотреть The Blip.</w:t>
+        <w:t>Этот проект утверждает, что 684 г. до н.э., нулевой год и 1053 г. н.э. - это один и тот же момент, отделенный только выдуманным «блипом». См. «Блип».</w:t>
       </w:r>
     </w:p>
     <w:p>
@@ -9348,7 +9348,7 @@
         <w:pStyle w:val="Quote"/>
       </w:pPr>
       <w:r>
-        <w:t>TL;DR: TODO</w:t>
+        <w:t>Кратко: TODO</w:t>
       </w:r>
     </w:p>
     <w:p>
@@ -9955,7 +9955,7 @@
         <w:pStyle w:val="Quote"/>
       </w:pPr>
       <w:r>
-        <w:t>TL;DR: TODO</w:t>
+        <w:t>Кратко: TODO</w:t>
       </w:r>
     </w:p>
     <w:p>
@@ -11733,7 +11733,7 @@
         <w:pStyle w:val="Quote"/>
       </w:pPr>
       <w:r>
-        <w:t>TL;DR: TODO</w:t>
+        <w:t>Кратко: TODO</w:t>
       </w:r>
     </w:p>
     <w:p>
@@ -12003,7 +12003,7 @@
         <w:pStyle w:val="Quote"/>
       </w:pPr>
       <w:r>
-        <w:t>TL;DR: TODO</w:t>
+        <w:t>Кратко: TODO</w:t>
       </w:r>
     </w:p>
     <w:p>
@@ -14818,7 +14818,7 @@
         <w:pStyle w:val="Quote"/>
       </w:pPr>
       <w:r>
-        <w:t>TL;DR: TODO</w:t>
+        <w:t>Кратко: TODO</w:t>
       </w:r>
     </w:p>
     <w:p>
@@ -16548,7 +16548,7 @@
         <w:pStyle w:val="Quote"/>
       </w:pPr>
       <w:r>
-        <w:t>TL;DR: TODO</w:t>
+        <w:t>Кратко: TODO</w:t>
       </w:r>
     </w:p>
     <w:p>
@@ -16811,7 +16811,7 @@
         <w:pStyle w:val="Quote"/>
       </w:pPr>
       <w:r>
-        <w:t>TL;DR: TODO</w:t>
+        <w:t>Кратко: TODO</w:t>
       </w:r>
     </w:p>
     <w:p>
@@ -17035,7 +17035,7 @@
         <w:pStyle w:val="Quote"/>
       </w:pPr>
       <w:r>
-        <w:t>TL;DR: TODO</w:t>
+        <w:t>Кратко: TODO</w:t>
       </w:r>
     </w:p>
     <w:p>
@@ -17243,7 +17243,7 @@
         <w:pStyle w:val="Quote"/>
       </w:pPr>
       <w:r>
-        <w:t>TL;DR: TODO</w:t>
+        <w:t>Кратко: TODO</w:t>
       </w:r>
     </w:p>
     <w:p>
@@ -20588,7 +20588,7 @@
         <w:pStyle w:val="Quote"/>
       </w:pPr>
       <w:r>
-        <w:t>TL;DR: TODO</w:t>
+        <w:t>Кратко: TODO</w:t>
       </w:r>
     </w:p>
     <w:p>
@@ -20850,7 +20850,7 @@
         <w:pStyle w:val="Quote"/>
       </w:pPr>
       <w:r>
-        <w:t>TL;DR: TODO</w:t>
+        <w:t>Кратко: TODO</w:t>
       </w:r>
     </w:p>
     <w:p>
@@ -21893,7 +21893,7 @@
         <w:pStyle w:val="Quote"/>
       </w:pPr>
       <w:r>
-        <w:t>TL;DR: TODO</w:t>
+        <w:t>Кратко: TODO</w:t>
       </w:r>
     </w:p>
     <w:p>
@@ -22010,7 +22010,7 @@
         <w:pStyle w:val="Quote"/>
       </w:pPr>
       <w:r>
-        <w:t>TL;DR: TODO</w:t>
+        <w:t>Кратко: TODO</w:t>
       </w:r>
     </w:p>
     <w:p>
@@ -22562,7 +22562,7 @@
         <w:pStyle w:val="Quote"/>
       </w:pPr>
       <w:r>
-        <w:t>TL;DR: TODO</w:t>
+        <w:t>Кратко: TODO</w:t>
       </w:r>
     </w:p>
     <w:p>
@@ -22860,7 +22860,7 @@
         <w:pStyle w:val="Quote"/>
       </w:pPr>
       <w:r>
-        <w:t>TL;DR: TODO</w:t>
+        <w:t>Кратко: TODO</w:t>
       </w:r>
     </w:p>
     <w:p>
@@ -23451,7 +23451,7 @@
         <w:pStyle w:val="Quote"/>
       </w:pPr>
       <w:r>
-        <w:t>TL;DR: TODO</w:t>
+        <w:t>Кратко: TODO</w:t>
       </w:r>
     </w:p>
     <w:p>
@@ -26032,7 +26032,7 @@
         <w:pStyle w:val="Quote"/>
       </w:pPr>
       <w:r>
-        <w:t>TL;DR: TODO</w:t>
+        <w:t>Кратко: TODO</w:t>
       </w:r>
     </w:p>
     <w:p>
@@ -28671,7 +28671,7 @@
         <w:pStyle w:val="Quote"/>
       </w:pPr>
       <w:r>
-        <w:t>TL;DR: TODO</w:t>
+        <w:t>Кратко: TODO</w:t>
       </w:r>
     </w:p>
     <w:p>
@@ -29023,7 +29023,7 @@
         <w:pStyle w:val="Quote"/>
       </w:pPr>
       <w:r>
-        <w:t>TL;DR: TODO</w:t>
+        <w:t>Кратко: TODO</w:t>
       </w:r>
     </w:p>
     <w:p>
@@ -29424,7 +29424,7 @@
         <w:pStyle w:val="Quote"/>
       </w:pPr>
       <w:r>
-        <w:t>TL;DR: TODO</w:t>
+        <w:t>Кратко: TODO</w:t>
       </w:r>
     </w:p>
     <w:p>
@@ -30858,7 +30858,7 @@
         <w:pStyle w:val="Quote"/>
       </w:pPr>
       <w:r>
-        <w:t>TL;DR: TODO</w:t>
+        <w:t>Кратко: TODO</w:t>
       </w:r>
     </w:p>
     <w:p>
@@ -30980,7 +30980,7 @@
         <w:pStyle w:val="Quote"/>
       </w:pPr>
       <w:r>
-        <w:t>TL;DR: TODO</w:t>
+        <w:t>Кратко: TODO</w:t>
       </w:r>
     </w:p>
     <w:p>
@@ -31338,7 +31338,7 @@
         <w:pStyle w:val="Quote"/>
       </w:pPr>
       <w:r>
-        <w:t>TL;DR: TODO</w:t>
+        <w:t>Кратко: TODO</w:t>
       </w:r>
     </w:p>
     <w:p>

</xml_diff>

<commit_message>
RU appendix DOCX: postprocess fix and remove backup copies
- Extend postprocess_ru_docx appendix rule for 'Посмотреть The Blip' without period
- Refresh timeline-appendix-ru.docx; drop tracked .bak-manual backups

Made-with: Cursor
</commit_message>
<xml_diff>
--- a/export/timeline-appendix-ru.docx
+++ b/export/timeline-appendix-ru.docx
@@ -35,7 +35,7 @@
         <w:jc w:val="center"/>
       </w:pPr>
       <w:r>
-        <w:t>Версия 1.2.140</w:t>
+        <w:t>Версия 1.2.156</w:t>
       </w:r>
     </w:p>
     <w:p>
@@ -731,7 +731,7 @@
         <w:jc w:val="center"/>
       </w:pPr>
       <w:r>
-        <w:t>ЧАСТЬ XVI</w:t>
+        <w:t>Часть XVI</w:t>
       </w:r>
     </w:p>
     <w:p>
@@ -767,7 +767,7 @@
         <w:keepLines/>
       </w:pPr>
       <w:r>
-        <w:t>Хаб</w:t>
+        <w:t>хаб</w:t>
       </w:r>
     </w:p>
     <w:p>
@@ -966,17 +966,9 @@
             <w:pPr>
               <w:spacing w:before="20" w:after="20"/>
             </w:pPr>
-            <w:hyperlink r:id="rId15">
-              <w:r>
-                <w:rPr>
-                  <w:b w:val="0"/>
-                  <w:i w:val="0"/>
-                  <w:color w:val="B8860B"/>
-                  <w:sz w:val="18"/>
-                </w:rPr>
-                <w:t>N. A. Morozov</w:t>
-              </w:r>
-            </w:hyperlink>
+            <w:r>
+              <w:t>Н. А. Морозов</w:t>
+            </w:r>
           </w:p>
         </w:tc>
         <w:tc>
@@ -1006,7 +998,12 @@
               <w:spacing w:before="20" w:after="20"/>
             </w:pPr>
             <w:r>
-              <w:t>Первый математический вызов скалигеровской хронологии</w:t>
+              <w:rPr>
+                <w:b w:val="0"/>
+                <w:i w:val="0"/>
+                <w:sz w:val="18"/>
+              </w:rPr>
+              <w:t>First mathematical challenge to Scaligerian chronology</w:t>
             </w:r>
           </w:p>
         </w:tc>
@@ -1276,7 +1273,12 @@
               <w:spacing w:before="20" w:after="20"/>
             </w:pPr>
             <w:r>
-              <w:t>Миф о Сатурне: миф о полярной конфигурации</w:t>
+              <w:rPr>
+                <w:b w:val="0"/>
+                <w:i w:val="0"/>
+                <w:sz w:val="18"/>
+              </w:rPr>
+              <w:t>Saturn Myth; polar configuration mythology</w:t>
             </w:r>
           </w:p>
         </w:tc>
@@ -1330,7 +1332,12 @@
               <w:spacing w:before="20" w:after="20"/>
             </w:pPr>
             <w:r>
-              <w:t>Петроглифы как записи Z-пинч плазменного разряда</w:t>
+              <w:rPr>
+                <w:b w:val="0"/>
+                <w:i w:val="0"/>
+                <w:sz w:val="18"/>
+              </w:rPr>
+              <w:t>Petroglyphs as Z-pinch plasma discharge records</w:t>
             </w:r>
           </w:p>
         </w:tc>
@@ -1384,7 +1391,12 @@
               <w:spacing w:before="20" w:after="20"/>
             </w:pPr>
             <w:r>
-              <w:t>Наиболее подробная хронология Сатурна с конкретными датами</w:t>
+              <w:rPr>
+                <w:b w:val="0"/>
+                <w:i w:val="0"/>
+                <w:sz w:val="18"/>
+              </w:rPr>
+              <w:t>Most detailed Saturnian chronology with specific dates</w:t>
             </w:r>
           </w:p>
         </w:tc>
@@ -1438,7 +1450,12 @@
               <w:spacing w:before="20" w:after="20"/>
             </w:pPr>
             <w:r>
-              <w:t>Quantavolution framework; 15-томная серия катастроф</w:t>
+              <w:rPr>
+                <w:b w:val="0"/>
+                <w:i w:val="0"/>
+                <w:sz w:val="18"/>
+              </w:rPr>
+              <w:t>Quantavolution framework; 15-volume catastrophist series</w:t>
             </w:r>
           </w:p>
         </w:tc>
@@ -1492,7 +1509,12 @@
               <w:spacing w:before="20" w:after="20"/>
             </w:pPr>
             <w:r>
-              <w:t>Европейская плазменная модель инженерного класса</w:t>
+              <w:rPr>
+                <w:b w:val="0"/>
+                <w:i w:val="0"/>
+                <w:sz w:val="18"/>
+              </w:rPr>
+              <w:t>Engineering-grade EU plasma model</w:t>
             </w:r>
           </w:p>
         </w:tc>
@@ -2572,7 +2594,7 @@
         <w:pStyle w:val="Quote"/>
       </w:pPr>
       <w:r>
-        <w:t>«При внимательном рассмотрении Синайского кодекса в отделе рукописей Публичной библиотеки мое внимание было в первую очередь обращено на то, что пергаментные листы этого документа совсем не испортились в нижних углах, не были грязными или запачканы пальцами, как это должно было быть в случае с тысячелетним использованием»</w:t>
+        <w:t>«При внимательном рассмотрении Синайского кодекса в отделе рукописей Публичной библиотеки мое внимание было в первую очередь обращено на то, что пергаментные листы этого документа совсем не испортились в нижних углах, не были грязными или запачканы пальцами, как это должно было быть в случае с тысячелетним использованием».</w:t>
       </w:r>
     </w:p>
     <w:p>
@@ -2593,7 +2615,7 @@
         <w:pStyle w:val="Quote"/>
       </w:pPr>
       <w:r>
-        <w:t>На фотографиях, сделанных из него, опубликованных в Англии, страницы выглядят гораздо грязнее, чем они есть на самом деле</w:t>
+        <w:t>На фотографиях, сделанных из него, опубликованных в Англии, страницы выглядят гораздо грязнее, чем они есть на самом деле.</w:t>
       </w:r>
     </w:p>
     <w:p>
@@ -2640,7 +2662,7 @@
         <w:pStyle w:val="Quote"/>
       </w:pPr>
       <w:r>
-        <w:t>«...состояние внутренних листов Синайского кодекса с явными следами небрежного обращения монахов, которые сорвали его связывание и сорвали внешние листы»</w:t>
+        <w:t>«...состояние внутренних листов Синайского кодекса с явными следами небрежного обращения монахов, которые сорвали его связывание и сорвали внешние листы».</w:t>
       </w:r>
     </w:p>
     <w:p>
@@ -2807,7 +2829,7 @@
         <w:pStyle w:val="Quote"/>
       </w:pPr>
       <w:r>
-        <w:t>"Мастер Рип Уол Торнхилл. Ты открыла нам глаза. Вы были гигантом своего времени. Нам нужно что-то лучшее, электрическая вселенная — это что-то лучшее. Слезы печали о твоей кончине и радости о твоей жизни»</w:t>
+        <w:t>"Мастер Рип Уол Торнхилл. Ты открыла нам глаза. Вы были гигантом своего времени. Нам нужно что-то лучшее, электрическая вселенная — это что-то лучшее. Слезы печали о твоей кончине и радости о твоей жизни».</w:t>
       </w:r>
     </w:p>
     <w:p>
@@ -2824,7 +2846,7 @@
         <w:keepLines/>
       </w:pPr>
       <w:r>
-        <w:t>Биография</w:t>
+        <w:t>биография</w:t>
       </w:r>
     </w:p>
     <w:p>
@@ -2879,7 +2901,7 @@
         <w:pStyle w:val="Quote"/>
       </w:pPr>
       <w:r>
-        <w:t>«Электрическая Вселенная работает, пытаясь представить себе, какими были эти первоначальные простые правила, и результатом этого был синтез, который позволяет нам понять, как Вселенная действительно работает в электрическом смысле. Это очень просто — вы можете научить этому учеников начальной школы»</w:t>
+        <w:t>«Электрическая Вселенная работает, пытаясь представить себе, какими были эти первоначальные простые правила, и результатом этого был синтез, который позволяет нам понять, как Вселенная действительно работает в электрическом смысле. Это очень просто — вы можете научить этому учеников начальной школы».</w:t>
       </w:r>
     </w:p>
     <w:p>
@@ -2934,7 +2956,7 @@
         <w:spacing w:before="20" w:after="20"/>
       </w:pPr>
       <w:r>
-        <w:t>«В нашей Электрической Вселенной звезды и планеты формируются одновременно внутри молекулярных облаков вдоль космического молнии»</w:t>
+        <w:t>«В нашей Электрической Вселенной звезды и планеты формируются одновременно внутри молекулярных облаков вдоль космического молнии».</w:t>
       </w:r>
     </w:p>
     <w:p>
@@ -2978,7 +3000,7 @@
         <w:pStyle w:val="Quote"/>
       </w:pPr>
       <w:r>
-        <w:t>История и происхождение газового гиганта Сатурна и всей Солнечной системы, включая нашу собственную планету, - это не то, что нам говорили</w:t>
+        <w:t>История и происхождение газового гиганта Сатурна и всей Солнечной системы, включая нашу собственную планету, - это не то, что нам говорили.</w:t>
       </w:r>
     </w:p>
     <w:p>
@@ -3019,7 +3041,7 @@
         <w:spacing w:before="20" w:after="20"/>
       </w:pPr>
       <w:r>
-        <w:t>Большая катастрофа: возможный распад этой коллинеарной конфигурации вызвал катаклизмы, записанные в мифологиях по всему миру под именами богов, участвующих в битве, которые Талботт и Торнхилл проанализировали в документальном фильме «Символы чужого неба» (2009) и «Молниеносная планета Марс» (2012).</w:t>
+        <w:t>Великая катастрофа: возможный распад этой коллинеарной конфигурации вызвал катаклизмы, записанные в мифологиях по всему миру под именами богов, участвующих в битве, которые Талботт и Торнхилл проанализировали в документальном фильме «Символы чужого неба» (2009) и «Молния, шрамы планеты Марс» (2012).</w:t>
       </w:r>
     </w:p>
     <w:p>
@@ -3049,7 +3071,7 @@
         <w:pStyle w:val="Quote"/>
       </w:pPr>
       <w:r>
-        <w:t>Эксперимент с плазмой SAFIRE доказал, что астрофизики не понимают звезды и их источник лучистой энергии</w:t>
+        <w:t>Эксперимент с плазмой SAFIRE доказал, что астрофизики не понимают звезды и их источник лучистой энергии.</w:t>
       </w:r>
     </w:p>
     <w:p>
@@ -3057,7 +3079,7 @@
         <w:pStyle w:val="Quote"/>
       </w:pPr>
       <w:r>
-        <w:t>"Истории творения рассказывают об установлении нынешнего неба после периода апокалиптического хаоса. Рационально эти истории не могут иметь ничего общего с созданием Вселенной. Солнечная система имеет ужасную недавнюю историю, которую необходимо понять, прежде чем у нас появится надежда понять экзопланетные системы, нас самих или жизнь во Вселенной</w:t>
+        <w:t>"Истории творения рассказывают об установлении нынешнего неба после периода апокалиптического хаоса. Рационально эти истории не могут иметь ничего общего с созданием Вселенной. Солнечная система имеет ужасную недавнюю историю, которую необходимо понять, прежде чем у нас появится надежда понять экзопланетные системы, нас самих или жизнь во Вселенной.</w:t>
       </w:r>
     </w:p>
     <w:p>
@@ -3092,7 +3114,7 @@
         <w:pStyle w:val="Quote"/>
       </w:pPr>
       <w:r>
-        <w:t>"Сегодня специализация - враг науки. Это создает больше осложнений, чем упрощений, потому что эксперты вводят друг друга в заблуждение вещами, как сказал Том: «Они не знают, что они не знают». В результате получается бесполезное отражение в разбитом зеркале»</w:t>
+        <w:t>"Сегодня специализация - враг науки. Это создает больше осложнений, чем упрощений, потому что эксперты вводят друг друга в заблуждение вещами, как сказал Том: «Они не знают, что они не знают». В результате получается бесполезное отражение в разбитом зеркале».</w:t>
       </w:r>
     </w:p>
     <w:p>
@@ -3100,7 +3122,7 @@
         <w:pStyle w:val="Quote"/>
       </w:pPr>
       <w:r>
-        <w:t>«Математика — это не физика»</w:t>
+        <w:t>«Математика — это не физика».</w:t>
       </w:r>
     </w:p>
     <w:p>
@@ -3328,7 +3350,7 @@
     </w:p>
     <w:p>
       <w:r>
-        <w:t>Юргенс стал одним из ближайших научных сотрудников Великовского. Великовский рекомендовал его Альфреду де Грации в качестве научного редактора в запланированной книге о Великовском споре. Вместе с де Грацией и Ливио Стеккини, Юргенс внес свой вклад в специальный сентябрьский выпуск 1963 года американского поведенческого ученого под названием «Политика науки и доктора Великовского» — знаковый междисциплинарный вызов подавлению работы Великовского. Это было расширено в книгу 1966 года «Дело Великовского: Саентизм против науки», содержащую эссе Юргенса «Разум в хаосе» и «Последствия к разоблачению»</w:t>
+        <w:t>Юргенс стал одним из ближайших научных сотрудников Великовского. Великовский рекомендовал его Альфреду де Грации в качестве научного редактора в запланированной книге о Великовском споре. Вместе с де Грацией и Ливио Стеккини, Юргенс внес свой вклад в специальный сентябрьский выпуск 1963 года американского поведенческого ученого под названием «Политика науки и доктора Великовского» — знаковый междисциплинарный вызов подавлению работы Великовского. Это было расширено в книгу 1966 года «Дело Великовского: Саентизм против науки», содержащую эссе Юргенса «Разум в хаосе» и «Последствия к разоблачению».</w:t>
       </w:r>
     </w:p>
     <w:p>
@@ -3355,7 +3377,7 @@
     </w:p>
     <w:p>
       <w:r>
-        <w:t>В августе 1972 года Юргенс впервые опубликовал свою модель Electric Sun в журнале Pensée</w:t>
+        <w:t>В августе 1972 года Юргенс впервые опубликовал свою модель Electric Sun в журнале Pensée.</w:t>
       </w:r>
     </w:p>
     <w:p>
@@ -3363,7 +3385,7 @@
         <w:pStyle w:val="Quote"/>
       </w:pPr>
       <w:r>
-        <w:t>Современная астрофизическая концепция, которая приписывает энергию Солнца термоядерным реакциям в глубине Солнца, противоречит почти каждому наблюдаемому аспекту Солнца. Межпланетная среда предполагает не только то, что Солнце и планеты электрически заряжены, но и то, что само Солнце является центром космического электрического разряда — вероятного источника всей его лучистой энергии»</w:t>
+        <w:t>Современная астрофизическая концепция, которая приписывает энергию Солнца термоядерным реакциям в глубине Солнца, противоречит почти каждому наблюдаемому аспекту Солнца. Межпланетная среда предполагает не только то, что Солнце и планеты электрически заряжены, но и то, что само Солнце является центром космического электрического разряда — вероятного источника всей его лучистой энергии».</w:t>
       </w:r>
     </w:p>
     <w:p>
@@ -3425,7 +3447,7 @@
         <w:pStyle w:val="Quote"/>
       </w:pPr>
       <w:r>
-        <w:t>Юргенс, однако, пошел дальше всех своих наставников в электрификации как космических тел, так и их взаимодействий. Он воспринимал астрономические тела как изначально заряженные объекты, погруженные во вселенную, которую можно описать как электрифицированную ткань»</w:t>
+        <w:t>Юргенс, однако, пошел дальше всех своих наставников в электрификации как космических тел, так и их взаимодействий. Он воспринимал астрономические тела как изначально заряженные объекты, погруженные во вселенную, которую можно описать как электрифицированную ткань».</w:t>
       </w:r>
     </w:p>
     <w:p>
@@ -3496,7 +3518,7 @@
         <w:spacing w:before="20" w:after="20"/>
       </w:pPr>
       <w:r>
-        <w:t>Звездная термоядерная энергия: ложный след</w:t>
+        <w:t>Звездная термоядерная энергия: ложный след?</w:t>
       </w:r>
     </w:p>
     <w:p>
@@ -3505,7 +3527,7 @@
         <w:spacing w:before="20" w:after="20"/>
       </w:pPr>
       <w:r>
-        <w:t>Фотосфера: это верх или низ явления, которое мы называем Солнцем</w:t>
+        <w:t>Фотосфера: это верх или низ явления, которое мы называем Солнцем?</w:t>
       </w:r>
     </w:p>
     <w:p>
@@ -3543,7 +3565,7 @@
         <w:pStyle w:val="Quote"/>
       </w:pPr>
       <w:r>
-        <w:t>Модель Электрической Вселенной следует блестящей работе Ральфа Юргенса, в которой звезды являются проявлениями космического свечения</w:t>
+        <w:t>Модель Электрической Вселенной следует блестящей работе Ральфа Юргенса, в которой звезды являются проявлениями космического свечения.</w:t>
       </w:r>
     </w:p>
     <w:p>
@@ -3586,7 +3608,7 @@
         <w:pStyle w:val="Quote"/>
       </w:pPr>
       <w:r>
-        <w:t>Физическая модель того, что вы предлагаете, ускользает от меня. Если кто-то, возможно, Юргенс, придет с моделью, мне бы хотелось, чтобы мне сказали"</w:t>
+        <w:t>Физическая модель того, что вы предлагаете, ускользает от меня. Если кто-то, возможно, Юргенс, придет с моделью, мне бы хотелось, чтобы мне сказали".</w:t>
       </w:r>
     </w:p>
     <w:p>
@@ -3909,7 +3931,7 @@
         <w:spacing w:before="20" w:after="20"/>
       </w:pPr>
       <w:r>
-        <w:t>Венера была кометой в течение последних 3500 лет, а не первичной планетой</w:t>
+        <w:t>Венера была кометой в течение последних 3500 лет, а не первичной планетой.</w:t>
       </w:r>
     </w:p>
     <w:p>
@@ -3918,7 +3940,7 @@
         <w:spacing w:before="20" w:after="20"/>
       </w:pPr>
       <w:r>
-        <w:t>Планетарная катастрофа произошла во время истории, а не в геологические глубины</w:t>
+        <w:t>Планетарная катастрофа произошла во время истории, а не в геологические глубины.</w:t>
       </w:r>
     </w:p>
     <w:p>
@@ -3927,7 +3949,7 @@
         <w:spacing w:before="20" w:after="20"/>
       </w:pPr>
       <w:r>
-        <w:t>Древние мифы являются буквальными свидетельствами очевидцев небесных событий</w:t>
+        <w:t>Древние мифы являются буквальными свидетельствами очевидцев небесных событий.</w:t>
       </w:r>
     </w:p>
     <w:p>
@@ -3936,7 +3958,7 @@
         <w:spacing w:before="20" w:after="20"/>
       </w:pPr>
       <w:r>
-        <w:t>Египетская хронология раздувается примерно на 500 лет, создавая ложный разрыв синхронизации с еврейской историей</w:t>
+        <w:t>Египетская хронология раздувается примерно на 500 лет, создавая ложный разрыв синхронизации с еврейской историей.</w:t>
       </w:r>
     </w:p>
     <w:p>
@@ -4202,7 +4224,7 @@
         <w:spacing w:before="20" w:after="20"/>
       </w:pPr>
       <w:r>
-        <w:t>Три хронологических сдвига приблизительно 333, 1053 и 1800 лет встроены в скалигеровскую хронологию — та же краткая хроника, по-видимому, скопирована четыре раза и представлена как отдельные эпохи</w:t>
+        <w:t>Три хронологических сдвига приблизительно 333, 1053 и 1800 лет встроены в скалигеровскую хронологию — та же краткая хроника, по-видимому, скопирована четыре раза и представлена как отдельные эпохи.</w:t>
       </w:r>
     </w:p>
     <w:p>
@@ -4211,7 +4233,7 @@
         <w:spacing w:before="20" w:after="20"/>
       </w:pPr>
       <w:r>
-        <w:t>Аномалии лунного ускорения (на основе работы Роберта Ньютона 1972 года) показывают, что древние записи затмений хронологически неуместны</w:t>
+        <w:t>Аномалии лунного ускорения (на основе работы Роберта Ньютона 1972 года) показывают, что древние записи затмений хронологически неуместны.</w:t>
       </w:r>
     </w:p>
     <w:p>
@@ -4220,7 +4242,7 @@
         <w:spacing w:before="20" w:after="20"/>
       </w:pPr>
       <w:r>
-        <w:t>Вся "древняя" цивилизация - средневековая - греческие, римские и египетские записи описывают события не ранее, чем приблизительно 900 н.э</w:t>
+        <w:t>Вся "древняя" цивилизация - средневековая - греческие, римские и египетские записи описывают события не ранее, чем приблизительно 900 н.э.</w:t>
       </w:r>
     </w:p>
     <w:p>
@@ -4238,7 +4260,7 @@
         <w:spacing w:before="20" w:after="20"/>
       </w:pPr>
       <w:r>
-        <w:t>Монгольская империя и русско-ордынское образование – одно и то же: «Чингисхан» – это титул, а не личное имя</w:t>
+        <w:t>Монгольская империя и русско-ордынское образование – одно и то же: «Чингисхан» – это титул, а не личное имя.</w:t>
       </w:r>
     </w:p>
     <w:p>
@@ -4430,7 +4452,7 @@
         <w:spacing w:before="20" w:after="20"/>
       </w:pPr>
       <w:r>
-        <w:t>Полярная конфигурация — Сатурн, Венера и Марс выровнены вдоль общей полярной оси, видимой из северного полушария Земли в Золотой век</w:t>
+        <w:t>Полярная конфигурация — Сатурн, Венера и Марс выровнены вдоль общей полярной оси, видимой из северного полушария Земли в Золотой век.</w:t>
       </w:r>
     </w:p>
     <w:p>
@@ -4439,7 +4461,7 @@
         <w:spacing w:before="20" w:after="20"/>
       </w:pPr>
       <w:r>
-        <w:t>Архетип «Колесо Неба» — появляется в вавилонских, египетских, индуистских, норвежских, майя и ацтекских источниках как прямая визуальная запись плазменной короны Сатурна и спиц</w:t>
+        <w:t>Архетип «Колесо Неба» — появляется в вавилонских, египетских, индуистских, норвежских, майя и ацтекских источниках как прямая визуальная запись плазменной короны Сатурна и спиц.</w:t>
       </w:r>
     </w:p>
     <w:p>
@@ -4457,7 +4479,7 @@
         <w:spacing w:before="20" w:after="20"/>
       </w:pPr>
       <w:r>
-        <w:t>Мифологическая конвергенция как первичный доказательный метод — 30+ несвязанных древних культур, независимо описывающих одно и то же невозможное небо, означает, что оно наблюдалось</w:t>
+        <w:t>Мифологическая конвергенция как первичный доказательный метод — 30+ несвязанных древних культур, независимо описывающих одно и то же невозможное небо, означает, что оно наблюдалось.</w:t>
       </w:r>
     </w:p>
     <w:p>
@@ -4632,7 +4654,7 @@
         <w:spacing w:before="20" w:after="20"/>
       </w:pPr>
       <w:r>
-        <w:t>3 южных плазмоида — статья Ператта 2003 года идентифицировала три плазменных колонны в древнем южном небе, соответствующие Меркурию, Нептуну и Урану в нижней конфигурации Сатурна (конфигурация приседающего человека южного полушария)</w:t>
+        <w:t>3 южных плазмоида — статья Ператта 2003 года идентифицировала три плазменных колонны в древнем южном небе, соответствующие Меркурию, Нептуну и Урану в нижней конфигурации Сатурна (конфигурация приседающего человека южного полушария).</w:t>
       </w:r>
     </w:p>
     <w:p>
@@ -4641,7 +4663,7 @@
         <w:spacing w:before="20" w:after="20"/>
       </w:pPr>
       <w:r>
-        <w:t>Количественное датирование — интенсивность плазмы, необходимая для создания наблюдаемых петроглифов, обеспечивает физическое ограничение, когда произошло событие</w:t>
+        <w:t>Количественное датирование — интенсивность плазмы, необходимая для создания наблюдаемых петроглифов, обеспечивает физическое ограничение, когда произошло событие.</w:t>
       </w:r>
     </w:p>
     <w:p>
@@ -4850,7 +4872,7 @@
     </w:p>
     <w:p>
       <w:r>
-        <w:t>Космология Сатурна — это не оригинальное независимое исследование, а синтез всей катастрофической традиции</w:t>
+        <w:t>Космология Сатурна — это не оригинальное независимое исследование, а синтез всей катастрофической традиции.</w:t>
       </w:r>
     </w:p>
     <w:tbl>
@@ -5029,12 +5051,7 @@
               <w:spacing w:before="20" w:after="20"/>
             </w:pPr>
             <w:r>
-              <w:rPr>
-                <w:b w:val="0"/>
-                <w:i w:val="0"/>
-                <w:sz w:val="18"/>
-              </w:rPr>
-              <w:t>Quantavolution framework, historical sequence</w:t>
+              <w:t>Квантаволюционная структура, историческая последовательность</w:t>
             </w:r>
           </w:p>
         </w:tc>
@@ -5067,12 +5084,7 @@
               <w:spacing w:before="20" w:after="20"/>
             </w:pPr>
             <w:r>
-              <w:rPr>
-                <w:b w:val="0"/>
-                <w:i w:val="0"/>
-                <w:sz w:val="18"/>
-              </w:rPr>
-              <w:t>God Star sequence, proto-Saturnian epoch</w:t>
+              <w:t>«Звезда Бога», протосатурнская эпоха</w:t>
             </w:r>
           </w:p>
         </w:tc>
@@ -5105,12 +5117,7 @@
               <w:spacing w:before="20" w:after="20"/>
             </w:pPr>
             <w:r>
-              <w:rPr>
-                <w:b w:val="0"/>
-                <w:i w:val="0"/>
-                <w:sz w:val="18"/>
-              </w:rPr>
-              <w:t>Mars and Venus mythology</w:t>
+              <w:t>Марс и Венера мифология</w:t>
             </w:r>
           </w:p>
         </w:tc>
@@ -5143,12 +5150,7 @@
               <w:spacing w:before="20" w:after="20"/>
             </w:pPr>
             <w:r>
-              <w:rPr>
-                <w:b w:val="0"/>
-                <w:i w:val="0"/>
-                <w:sz w:val="18"/>
-              </w:rPr>
-              <w:t>Venus orbital period analysis</w:t>
+              <w:t>Анализ орбитального периода Венеры</w:t>
             </w:r>
           </w:p>
         </w:tc>
@@ -5181,12 +5183,7 @@
               <w:spacing w:before="20" w:after="20"/>
             </w:pPr>
             <w:r>
-              <w:rPr>
-                <w:b w:val="0"/>
-                <w:i w:val="0"/>
-                <w:sz w:val="18"/>
-              </w:rPr>
-              <w:t>685 BCE Venus stabilization date</w:t>
+              <w:t>685 год до н.э. Дата стабилизации Венеры</w:t>
             </w:r>
           </w:p>
         </w:tc>
@@ -5706,7 +5703,7 @@
         <w:spacing w:before="20" w:after="20"/>
       </w:pPr>
       <w:r>
-        <w:t>Диаграммы плазменного режима — формализовали три режима плазменного разряда (темный, свечение, дуга) и продемонстрировали, что звездные короны, кометные хвосты, небулярная структура и галактическая морфология лучше описаны этими режимами, чем модели только гравитации</w:t>
+        <w:t>Диаграммы плазменного режима — формализовали три режима плазменного разряда (темный, свечение, дуга) и продемонстрировали, что звездные короны, кометные хвосты, небулярная структура и галактическая морфология лучше описаны этими режимами, чем модели только гравитации.</w:t>
       </w:r>
     </w:p>
     <w:p>
@@ -5724,7 +5721,7 @@
         <w:spacing w:before="20" w:after="20"/>
       </w:pPr>
       <w:r>
-        <w:t>Текущая галактическая структура Биркеланда — утверждала, что галактики организованы вдоль текущих нитей Биркеланда, а не гравитационных гало, что согласуется с крупномасштабной нитевидной структурой, наблюдаемой в обзорах галактик</w:t>
+        <w:t>Текущая галактическая структура Биркеланда — утверждала, что галактики организованы вдоль текущих нитей Биркеланда, а не гравитационных гало, что согласуется с крупномасштабной нитевидной структурой, наблюдаемой в обзорах галактик.</w:t>
       </w:r>
     </w:p>
     <w:p>
@@ -5733,7 +5730,7 @@
         <w:spacing w:before="20" w:after="20"/>
       </w:pPr>
       <w:r>
-        <w:t>Конвекция Марклунда — объяснила слоистые элементарные обилия, наблюдаемые в звездах, как естественное следствие сортировки элементов тока плазмы по потенциалу ионизации</w:t>
+        <w:t>Конвекция Марклунда — объяснила слоистые элементарные обилия, наблюдаемые в звездах, как естественное следствие сортировки элементов тока плазмы по потенциалу ионизации.</w:t>
       </w:r>
     </w:p>
     <w:p>
@@ -5913,7 +5910,7 @@
         <w:spacing w:before="20" w:after="20"/>
       </w:pPr>
       <w:r>
-        <w:t>Марс как космический воин — утверждал, что мифы о Марсе (бог-воин, убийца драконов, нисходящий герой) зафиксировали реальные околоземные проходы Марса в полярной конфигурации</w:t>
+        <w:t>Марс как космический воин — утверждал, что мифы о Марсе (бог-воин, убийца драконов, нисходящий герой) зафиксировали реальные околоземные проходы Марса в полярной конфигурации.</w:t>
       </w:r>
     </w:p>
     <w:p>
@@ -5922,7 +5919,7 @@
         <w:spacing w:before="20" w:after="20"/>
       </w:pPr>
       <w:r>
-        <w:t>Традиция кометной Венеры в мезоамериканских, шумерских, греческих и индуистских источниках независимо подтверждает утверждение Великовского о комете Венеры с мифологическими доказательствами, которые сам Великовский никогда не собирал</w:t>
+        <w:t>Традиция кометной Венеры в мезоамериканских, шумерских, греческих и индуистских источниках независимо подтверждает утверждение Великовского о комете Венеры с мифологическими доказательствами, которые сам Великовский никогда не собирал.</w:t>
       </w:r>
     </w:p>
     <w:p>
@@ -6102,7 +6099,7 @@
         <w:spacing w:before="20" w:after="20"/>
       </w:pPr>
       <w:r>
-        <w:t>Миф кодирует астрономию, а не аллегорию — всемирное распространение метафоры «мельницы» (мельница Гамлета, скандинавский Гротти, индуистское бурение океана) является кросс-культурным образом для прецессирующего небесного полюса. Это не метафора урожая, не психологический архетип, не народная сказка</w:t>
+        <w:t>Миф кодирует астрономию, а не аллегорию — всемирное распространение метафоры «мельницы» (мельница Гамлета, скандинавский Гротти, индуистское бурение океана) является кросс-культурным образом для прецессирующего небесного полюса. Это не метафора урожая, не психологический архетип, не народная сказка.</w:t>
       </w:r>
     </w:p>
     <w:p>
@@ -6111,7 +6108,7 @@
         <w:spacing w:before="20" w:after="20"/>
       </w:pPr>
       <w:r>
-        <w:t>Древние народы отслеживали движение планет с точностью на протяжении веков и закодировали его в мифе, что сделало восстановление этой астрономии методологически законным</w:t>
+        <w:t>Древние народы отслеживали движение планет с точностью на протяжении веков и закодировали его в мифе, что сделало восстановление этой астрономии методологически законным.</w:t>
       </w:r>
     </w:p>
     <w:p>
@@ -6120,7 +6117,7 @@
         <w:spacing w:before="20" w:after="20"/>
       </w:pPr>
       <w:r>
-        <w:t>Прецессия равноденствий является скрытым предметом обширного тела древней мифологии — от норвежского Рагнарёка до метаморфоз Овидия до эпоса Гильгамеша</w:t>
+        <w:t>Прецессия равноденствий является скрытым предметом обширного тела древней мифологии — от норвежского Рагнарёка до метаморфоз Овидия до эпоса Гильгамеша.</w:t>
       </w:r>
     </w:p>
     <w:p>
@@ -6129,7 +6126,7 @@
         <w:spacing w:before="20" w:after="20"/>
       </w:pPr>
       <w:r>
-        <w:t>Методологическая основа — демонстрируя, что миф надежно кодирует реальные астрономические наблюдения, мельница Гамлета сделала реконструкцию мифа Тэлботта о Сатурне оправданной как научно обоснованная наука, а не спекуляция</w:t>
+        <w:t>Методологическая основа — демонстрируя, что миф надежно кодирует реальные астрономические наблюдения, мельница Гамлета сделала реконструкцию мифа Тэлботта о Сатурне оправданной как научно обоснованная наука, а не спекуляция.</w:t>
       </w:r>
     </w:p>
     <w:p>
@@ -7304,7 +7301,7 @@
               <w:jc w:val="center"/>
             </w:pPr>
             <w:r>
-              <w:t>Исследователь</w:t>
+              <w:t>исследователь</w:t>
             </w:r>
           </w:p>
         </w:tc>
@@ -7452,12 +7449,7 @@
               <w:spacing w:before="20" w:after="20"/>
             </w:pPr>
             <w:r>
-              <w:rPr>
-                <w:b w:val="0"/>
-                <w:i w:val="0"/>
-                <w:sz w:val="18"/>
-              </w:rPr>
-              <w:t>Published as Karolinska chair; ignored</w:t>
+              <w:t>Опубликовано как Каролинский стул; проигнорировано</w:t>
             </w:r>
           </w:p>
         </w:tc>
@@ -7508,12 +7500,7 @@
               <w:spacing w:before="20" w:after="20"/>
             </w:pPr>
             <w:r>
-              <w:rPr>
-                <w:b w:val="0"/>
-                <w:i w:val="0"/>
-                <w:sz w:val="18"/>
-              </w:rPr>
-              <w:t>Ignored by dentistry</w:t>
+              <w:t>игнорируется стоматологией</w:t>
             </w:r>
           </w:p>
         </w:tc>
@@ -7564,12 +7551,7 @@
               <w:spacing w:before="20" w:after="20"/>
             </w:pPr>
             <w:r>
-              <w:rPr>
-                <w:b w:val="0"/>
-                <w:i w:val="0"/>
-                <w:sz w:val="18"/>
-              </w:rPr>
-              <w:t>Known in Japan; unknown in West</w:t>
+              <w:t>Известный в Японии, неизвестный на Западе</w:t>
             </w:r>
           </w:p>
         </w:tc>
@@ -7740,7 +7722,7 @@
         <w:jc w:val="center"/>
       </w:pPr>
       <w:r>
-        <w:t>ЧАСТЬ XVII</w:t>
+        <w:t>Часть XVII</w:t>
       </w:r>
     </w:p>
     <w:p>
@@ -8470,7 +8452,7 @@
               <w:jc w:val="center"/>
             </w:pPr>
             <w:r>
-              <w:t>Истец</w:t>
+              <w:t>истец</w:t>
             </w:r>
           </w:p>
         </w:tc>
@@ -8500,7 +8482,7 @@
               <w:jc w:val="center"/>
             </w:pPr>
             <w:r>
-              <w:t>Метод</w:t>
+              <w:t>метод</w:t>
             </w:r>
           </w:p>
         </w:tc>
@@ -8945,7 +8927,7 @@
               <w:spacing w:before="20" w:after="20"/>
             </w:pPr>
             <w:r>
-              <w:t>Пирамидальная империя изменила календарь на нулевой год; иезуиты переосмыслили его как 1000 лет</w:t>
+              <w:t>Пирамидальная империя изменила календарь на нулевой год; иезуиты переосмыслили его как 1000 лет.</w:t>
             </w:r>
           </w:p>
         </w:tc>
@@ -9081,7 +9063,7 @@
               <w:jc w:val="center"/>
             </w:pPr>
             <w:r>
-              <w:t>Значение</w:t>
+              <w:t>значение</w:t>
             </w:r>
           </w:p>
         </w:tc>
@@ -9234,12 +9216,7 @@
               <w:spacing w:before="20" w:after="20"/>
             </w:pPr>
             <w:r>
-              <w:rPr>
-                <w:b w:val="0"/>
-                <w:i w:val="0"/>
-                <w:sz w:val="18"/>
-              </w:rPr>
-              <w:t>Statistical artefact</w:t>
+              <w:t>Статистический артефакт</w:t>
             </w:r>
           </w:p>
         </w:tc>
@@ -9290,12 +9267,7 @@
               <w:spacing w:before="20" w:after="20"/>
             </w:pPr>
             <w:r>
-              <w:rPr>
-                <w:b w:val="0"/>
-                <w:i w:val="0"/>
-                <w:sz w:val="18"/>
-              </w:rPr>
-              <w:t>End of planetary cataclysm</w:t>
+              <w:t>Конец планетарного катаклизма</w:t>
             </w:r>
           </w:p>
         </w:tc>
@@ -9304,7 +9276,7 @@
     <w:p/>
     <w:p>
       <w:r>
-        <w:t>Этот проект утверждает, что 684 г. до н.э., нулевой год и 1053 г. н.э. - это один и тот же момент, отделенный только выдуманным «блипом». См. «Блип».</w:t>
+        <w:t>Этот проект утверждает, что 684 г. до н.э., нулевой год и 1053 г. н.э. - это один и тот же момент, отделенный только выдуманным «блипом». См. «Блип»</w:t>
       </w:r>
     </w:p>
     <w:p>
@@ -9467,7 +9439,7 @@
         <w:pStyle w:val="Quote"/>
       </w:pPr>
       <w:r>
-        <w:t>"А. Т. Фоменко обнаружил три важных хронологических сдвига, примерно 333 года, 1053 и 1800 лет соответственно. Оказалось, что «Скалигеровский учебник» составлен из четырёх экземпляров одной и той же краткой хроники</w:t>
+        <w:t>"А. Т. Фоменко обнаружил три важных хронологических сдвига, примерно 333 года, 1053 и 1800 лет соответственно. Оказалось, что «Скалигеровский учебник» составлен из четырёх экземпляров одной и той же краткой хроники.</w:t>
       </w:r>
     </w:p>
     <w:p>
@@ -9611,7 +9583,12 @@
               <w:spacing w:before="20" w:after="20"/>
             </w:pPr>
             <w:r>
-              <w:t>Сатурн погружается в кому, уходит в нову — «Солнце сначала показывает себя»</w:t>
+              <w:rPr>
+                <w:b w:val="0"/>
+                <w:i w:val="0"/>
+                <w:sz w:val="18"/>
+              </w:rPr>
+              <w:t>Saturn drops coma, goes nova — "sun first shows itself"</w:t>
             </w:r>
           </w:p>
         </w:tc>
@@ -9656,12 +9633,7 @@
               <w:spacing w:before="20" w:after="20"/>
             </w:pPr>
             <w:r>
-              <w:rPr>
-                <w:b w:val="0"/>
-                <w:i w:val="0"/>
-                <w:sz w:val="18"/>
-              </w:rPr>
-              <w:t>Quiche Maya</w:t>
+              <w:t>Киче Майя</w:t>
             </w:r>
           </w:p>
         </w:tc>
@@ -9791,12 +9763,7 @@
               <w:spacing w:before="20" w:after="20"/>
             </w:pPr>
             <w:r>
-              <w:rPr>
-                <w:b w:val="0"/>
-                <w:i w:val="0"/>
-                <w:sz w:val="18"/>
-              </w:rPr>
-              <w:t>Biblical/Babylonian tradition</w:t>
+              <w:t>Библейская/вавилонская традиция</w:t>
             </w:r>
           </w:p>
         </w:tc>
@@ -9861,12 +9828,7 @@
               <w:spacing w:before="20" w:after="20"/>
             </w:pPr>
             <w:r>
-              <w:rPr>
-                <w:b w:val="0"/>
-                <w:i w:val="0"/>
-                <w:sz w:val="18"/>
-              </w:rPr>
-              <w:t>"Start of history, science, and philosophy"</w:t>
+              <w:t>«Начало истории, науки и философии»</w:t>
             </w:r>
           </w:p>
         </w:tc>
@@ -9878,7 +9840,7 @@
         <w:pStyle w:val="Quote"/>
       </w:pPr>
       <w:r>
-        <w:t>В 4077 году до н.э. Сатурн потерял свою кому. Сатурн стал новой звездой и засветился более ярко, чем Солнце. Для людей, которые не видели Солнца в течение тысяч лет, это было началом творения, началом времени</w:t>
+        <w:t>В 4077 году до н.э. Сатурн потерял свою кому. Сатурн стал новой звездой и засветился более ярко, чем Солнце. Для людей, которые не видели Солнца в течение тысяч лет, это было началом творения, началом времени.</w:t>
       </w:r>
     </w:p>
     <w:p>
@@ -9924,7 +9886,7 @@
         <w:spacing w:before="20" w:after="20"/>
       </w:pPr>
       <w:r>
-        <w:t>Ацтекские кодексы систематически сжигались после 1521 года</w:t>
+        <w:t>Ацтекские кодексы систематически сжигались после 1521 года.</w:t>
       </w:r>
     </w:p>
     <w:p/>
@@ -10210,7 +10172,7 @@
         <w:spacing w:before="20" w:after="20"/>
       </w:pPr>
       <w:r>
-        <w:t>Трансляция транслировалась во время настоящей военной тревоги (Европа на грани войны)</w:t>
+        <w:t>Трансляция транслировалась во время настоящей военной тревоги (Европа на грани войны).</w:t>
       </w:r>
     </w:p>
     <w:p>
@@ -10219,7 +10181,7 @@
         <w:spacing w:before="20" w:after="20"/>
       </w:pPr>
       <w:r>
-        <w:t>Формат был неотличим от реальных аварийных передач</w:t>
+        <w:t>Формат был неотличим от реальных аварийных передач.</w:t>
       </w:r>
     </w:p>
     <w:p>
@@ -10237,12 +10199,12 @@
         <w:spacing w:before="20" w:after="20"/>
       </w:pPr>
       <w:r>
-        <w:t>Адольф Гитлер ссылался на трансляцию в своей Мюнхенской речи (8 ноября 1938 года), называя ее доказательством американской демократической слабости</w:t>
-      </w:r>
-    </w:p>
-    <w:p>
-      <w:r>
-        <w:t>Оперативный тезис: передача 1938 года охватывала реальное вторжение на восточное побережье, ведущее к Обратному крестовому походу III («Вторая мировая война»). «Откровение метода» — объявляют событие вымыслом, в то время как транслируют реалистичные сообщения о том, что оно происходит. Любой, кто сообщал о реальных аномальных явлениях той ночью, был задним числом классифицирован как «паника»</w:t>
+        <w:t>Адольф Гитлер ссылался на трансляцию в своей Мюнхенской речи (8 ноября 1938 года), называя ее доказательством американской демократической слабости.</w:t>
+      </w:r>
+    </w:p>
+    <w:p>
+      <w:r>
+        <w:t>Оперативный тезис: передача 1938 года охватывала реальное вторжение на восточное побережье, ведущее к Обратному крестовому походу III («Вторая мировая война»). «Откровение метода» — объявляют событие вымыслом, в то время как транслируют реалистичные сообщения о том, что оно происходит. Любой, кто сообщал о реальных аномальных явлениях той ночью, был задним числом классифицирован как «паника».</w:t>
       </w:r>
     </w:p>
     <w:p>
@@ -10292,7 +10254,7 @@
         <w:spacing w:before="20" w:after="20"/>
       </w:pPr>
       <w:r>
-        <w:t>Министр ВМС США Фрэнк Нокс назвал это «ложной тревогой» на следующий день, что противоречит утверждению армии о наличии реальных целей</w:t>
+        <w:t>Министр ВМС США Фрэнк Нокс назвал это «ложной тревогой» на следующий день, что противоречит утверждению армии о наличии реальных целей.</w:t>
       </w:r>
     </w:p>
     <w:p>
@@ -10310,7 +10272,7 @@
         <w:spacing w:before="20" w:after="20"/>
       </w:pPr>
       <w:r>
-        <w:t>Позже ВВС приписали его «погодному шару» и военным нервам — такое же объяснение использовал Розуэлл пять лет спустя</w:t>
+        <w:t>Позже ВВС приписали его «погодному шару» и военным нервам — такое же объяснение использовал Розуэлл пять лет спустя.</w:t>
       </w:r>
     </w:p>
     <w:p>
@@ -10400,7 +10362,7 @@
     </w:p>
     <w:p>
       <w:r>
-        <w:t>12 февраля 1949 года Радио Кито транслировало испаноязычную адаптацию «Войны миров» Эдуардо Алькараза, отформатированную как «новая новость». В отличие от 1938 года, это привело к смертельному насилию</w:t>
+        <w:t>12 февраля 1949 года Радио Кито транслировало испаноязычную адаптацию «Войны миров» Эдуардо Алькараза, отформатированную как «новая новость». В отличие от 1938 года, это привело к смертельному насилию.</w:t>
       </w:r>
     </w:p>
     <w:p>
@@ -10409,7 +10371,7 @@
         <w:spacing w:before="20" w:after="20"/>
       </w:pPr>
       <w:r>
-        <w:t>Когда обман был раскрыт, толпа подожгла здание Радио Кито</w:t>
+        <w:t>Когда обман был раскрыт, толпа подожгла здание Радио Кито.</w:t>
       </w:r>
     </w:p>
     <w:p>
@@ -10499,7 +10461,7 @@
         <w:spacing w:before="20" w:after="20"/>
       </w:pPr>
       <w:r>
-        <w:t>Высокие, худые существа в беде, зная, что их цивилизация заканчивается</w:t>
+        <w:t>Высокие, худые существа в беде, зная, что их цивилизация заканчивается.</w:t>
       </w:r>
     </w:p>
     <w:p>
@@ -10620,7 +10582,12 @@
               <w:spacing w:before="20" w:after="20"/>
             </w:pPr>
             <w:r>
-              <w:t>1894 год</w:t>
+              <w:rPr>
+                <w:b w:val="0"/>
+                <w:i w:val="0"/>
+                <w:sz w:val="18"/>
+              </w:rPr>
+              <w:t>1894</w:t>
             </w:r>
           </w:p>
         </w:tc>
@@ -10669,12 +10636,7 @@
               <w:spacing w:before="20" w:after="20"/>
             </w:pPr>
             <w:r>
-              <w:rPr>
-                <w:b w:val="0"/>
-                <w:i w:val="0"/>
-                <w:sz w:val="18"/>
-              </w:rPr>
-              <w:t>Pre-invasion bombardment signal</w:t>
+              <w:t>Сигнал перед вторжением</w:t>
             </w:r>
           </w:p>
         </w:tc>
@@ -10812,12 +10774,7 @@
               <w:spacing w:before="20" w:after="20"/>
             </w:pPr>
             <w:r>
-              <w:rPr>
-                <w:b w:val="0"/>
-                <w:i w:val="0"/>
-                <w:sz w:val="18"/>
-              </w:rPr>
-              <w:t>Operational account, relocated to US</w:t>
+              <w:t>Операционный счет, переведенный в США</w:t>
             </w:r>
           </w:p>
         </w:tc>
@@ -11961,7 +11918,7 @@
         <w:spacing w:before="20" w:after="20"/>
       </w:pPr>
       <w:r>
-        <w:t>Объясняется глобальной цивилизацией, реагирующей на глобальный электромагнитный кризис, а не одной программой строительства средневековой империи</w:t>
+        <w:t>Объясняется глобальной цивилизацией, реагирующей на глобальный электромагнитный кризис, а не одной программой строительства средневековой империи.</w:t>
       </w:r>
     </w:p>
     <w:p>
@@ -11985,7 +11942,7 @@
         <w:spacing w:before="0" w:after="40"/>
       </w:pPr>
       <w:r>
-        <w:t>ГЛАВА 5</w:t>
+        <w:t>Глава 5</w:t>
       </w:r>
     </w:p>
     <w:p>
@@ -12071,7 +12028,7 @@
         <w:spacing w:before="20" w:after="20"/>
       </w:pPr>
       <w:r>
-        <w:t>День 4: «Да будут светила на небосводе, чтобы отделить день от ночи» — Солнце, Луна и звезды</w:t>
+        <w:t>День 4: «Да будут светила на небосводе, чтобы отделить день от ночи» — Солнце, Луна и звезды.</w:t>
       </w:r>
     </w:p>
     <w:p>
@@ -12112,7 +12069,7 @@
         <w:spacing w:before="20" w:after="20"/>
       </w:pPr>
       <w:r>
-        <w:t>«Свет Бога отличался от света Солнца», — утверждалось без механизма</w:t>
+        <w:t>«Свет Бога отличался от света Солнца», — утверждалось без механизма.</w:t>
       </w:r>
     </w:p>
     <w:p>
@@ -12121,7 +12078,7 @@
         <w:spacing w:before="20" w:after="20"/>
       </w:pPr>
       <w:r>
-        <w:t>«Солнце было создано на 1-й день, но выведено на орбиту на 4-й день», — говорится в тексте</w:t>
+        <w:t>«Солнце было создано на 1-й день, но выведено на орбиту на 4-й день», — говорится в тексте.</w:t>
       </w:r>
     </w:p>
     <w:p>
@@ -12130,7 +12087,7 @@
         <w:spacing w:before="20" w:after="20"/>
       </w:pPr>
       <w:r>
-        <w:t>«Дни — это образные эоны» — правда в самом глубоком смысле, но все еще оставляет проблему Солнца до светил нерешенной</w:t>
+        <w:t>«Дни — это образные эоны» — правда в самом глубоком смысле, но все еще оставляет проблему Солнца до светил нерешенной.</w:t>
       </w:r>
     </w:p>
     <w:p>
@@ -12289,7 +12246,7 @@
         <w:pStyle w:val="Quote"/>
       </w:pPr>
       <w:r>
-        <w:t>И сказал Бог: да будет свет, и был свет. И увидел Бог свет, что он благ, и отделил Бог свет от тьмы (Бытие 1:3-4)</w:t>
+        <w:t>И сказал Бог: да будет свет, и был свет. И увидел Бог свет, что он благ, и отделил Бог свет от тьмы (Бытие 1:3-4).</w:t>
       </w:r>
     </w:p>
     <w:p>
@@ -12347,7 +12304,7 @@
         <w:pStyle w:val="Quote"/>
       </w:pPr>
       <w:r>
-        <w:t>«И сказал Бог: да будет твердь посреди вод, и да отделит она воды от вод» (Бытие 1:6)</w:t>
+        <w:t>«И сказал Бог: да будет твердь посреди вод, и да отделит она воды от вод» (Бытие 1:6).</w:t>
       </w:r>
     </w:p>
     <w:p>
@@ -12375,7 +12332,7 @@
         <w:pStyle w:val="Quote"/>
       </w:pPr>
       <w:r>
-        <w:t>"Поскольку Сатурн изменился на дуговой режим разряда, предыдущий охватывающий световой разряд исчез. Сатурн внезапно засветился как солнце и соединился с Землей через Меркурий и Марс электрической дугой. Боги родились, и «создание» произошло. Воды внизу отделились от «вод» вверху, и свет был создан не светом Солнца, а корональным разрядом Сатурна</w:t>
+        <w:t>"Поскольку Сатурн изменился на дуговой режим разряда, предыдущий охватывающий световой разряд исчез. Сатурн внезапно засветился как солнце и соединился с Землей через Меркурий и Марс электрической дугой. Боги родились, и «создание» произошло. Воды внизу отделились от «вод» вверху, и свет был создан не светом Солнца, а корональным разрядом Сатурна.</w:t>
       </w:r>
     </w:p>
     <w:p>
@@ -12383,7 +12340,7 @@
         <w:pStyle w:val="Quote"/>
       </w:pPr>
       <w:r>
-        <w:t>В книге Бытия Бог отделил воды внизу от вод вверху, создав купол неба. Это появление северных звезд в 4077 году до нашей эры, когда режим свечения комы Сатурна коллапсирует. «Вода наверху», которая была плазмой, изливающейся из Сатурна в окружающее пространство, остается «выше» в виде колец Сатурна и потока воды, или того, что выглядело как вода, соединяющаяся с Землей</w:t>
+        <w:t>В книге Бытия Бог отделил воды внизу от вод вверху, создав купол неба. Это появление северных звезд в 4077 году до нашей эры, когда режим свечения комы Сатурна коллапсирует. «Вода наверху», которая была плазмой, изливающейся из Сатурна в окружающее пространство, остается «выше», чем кольца Сатурна и поток воды, или то, что выглядело как вода, соединяющаяся с Землей.</w:t>
       </w:r>
     </w:p>
     <w:p>
@@ -12439,7 +12396,7 @@
         <w:pStyle w:val="Quote"/>
       </w:pPr>
       <w:r>
-        <w:t>«И сказал Бог: да будут огни на тверди небесной, чтобы отделять день от ночи, и да будут они знамениями, и временами, и днями, и годами» (Бытие 1:14)</w:t>
+        <w:t>«И сказал Бог: да будут огни на тверди небесной, чтобы отделять день от ночи, и да будут они знамениями, и временами, и днями, и годами» (Бытие 1:14).</w:t>
       </w:r>
     </w:p>
     <w:p>
@@ -12472,7 +12429,7 @@
         <w:pStyle w:val="Quote"/>
       </w:pPr>
       <w:r>
-        <w:t>«И сказал Бог: да произведут воды с избытком движущееся существо, имеющее жизнь, и птицу, которая может летать над землей» (Бытие 1:20)</w:t>
+        <w:t>«И сказал Бог: да произведут воды с избытком движущееся существо, имеющее жизнь, и птицу, которая может летать над землей» (Бытие 1:20).</w:t>
       </w:r>
     </w:p>
     <w:p>
@@ -12500,7 +12457,7 @@
         <w:pStyle w:val="Quote"/>
       </w:pPr>
       <w:r>
-        <w:t>«И сказал Бог: сотворим человека по образу Нашему, по подобию Нашему; и да будут они господствовать над рыбами морскими, и над птицами воздушными, и над скотом» (Бытие 1:26)</w:t>
+        <w:t>«И сказал Бог: сотворим человека по образу Нашему, по подобию Нашему; и да будут они господствовать над рыбами морскими, и над птицами воздушными, и над скотом» (Бытие 1:26).</w:t>
       </w:r>
     </w:p>
     <w:p>
@@ -12538,7 +12495,7 @@
         <w:pStyle w:val="Quote"/>
       </w:pPr>
       <w:r>
-        <w:t>«И на седьмой день закончил Бог дело Свое, которое Он сотворил, и почил на седьмой день от всего дела Своего, которое Он сотворил» (Бытие 2:2)</w:t>
+        <w:t>«И на седьмой день закончил Бог дело Свое, которое Он сотворил, и почил на седьмой день от всего дела Своего, которое Он сотворил» (Бытие 2:2).</w:t>
       </w:r>
     </w:p>
     <w:p>
@@ -12675,7 +12632,7 @@
         <w:spacing w:before="20" w:after="20"/>
       </w:pPr>
       <w:r>
-        <w:t>космологическая память переформулируется как моральное наказание;</w:t>
+        <w:t>Космологическая память переформулируется как моральное наказание.</w:t>
       </w:r>
     </w:p>
     <w:p>
@@ -12684,7 +12641,7 @@
         <w:spacing w:before="20" w:after="20"/>
       </w:pPr>
       <w:r>
-        <w:t>хронология сплющена в единую дидактическую историю, сосредоточенную на Ное.</w:t>
+        <w:t>Хронология сплющена в единую дидактическую историю, сосредоточенную на Ное.</w:t>
       </w:r>
     </w:p>
     <w:p>
@@ -12864,7 +12821,7 @@
               <w:spacing w:before="20" w:after="20"/>
             </w:pPr>
             <w:r>
-              <w:t>Наше Солнце появляется после того, как все творение завершено</w:t>
+              <w:t>Наше Солнце появляется после того, как все творение завершено.</w:t>
             </w:r>
           </w:p>
         </w:tc>
@@ -13209,12 +13166,7 @@
               <w:spacing w:before="20" w:after="20"/>
             </w:pPr>
             <w:r>
-              <w:rPr>
-                <w:b w:val="0"/>
-                <w:i w:val="0"/>
-                <w:sz w:val="18"/>
-              </w:rPr>
-              <w:t>Venus as the plasmoid star in the column</w:t>
+              <w:t>Венера как плазмоидная звезда в колонне</w:t>
             </w:r>
           </w:p>
         </w:tc>
@@ -13325,26 +13277,7 @@
               <w:spacing w:before="20" w:after="20"/>
             </w:pPr>
             <w:r>
-              <w:rPr>
-                <w:b w:val="0"/>
-                <w:i w:val="0"/>
-                <w:sz w:val="18"/>
-              </w:rPr>
-            </w:r>
-            <w:r>
-              <w:rPr>
-                <w:b/>
-                <w:i w:val="0"/>
-                <w:sz w:val="18"/>
-              </w:rPr>
-              <w:t>Saturn displaced — Sabbath — creation ends</w:t>
-            </w:r>
-            <w:r>
-              <w:rPr>
-                <w:b w:val="0"/>
-                <w:i w:val="0"/>
-                <w:sz w:val="18"/>
-              </w:rPr>
+              <w:t>Сатурн смещен — Суббота — сотворение заканчивается</w:t>
             </w:r>
           </w:p>
         </w:tc>
@@ -13416,7 +13349,7 @@
         <w:spacing w:before="20" w:after="20"/>
       </w:pPr>
       <w:r>
-        <w:t>Введено противоречие — Дни 1-3 имеют свет, но нет Солнца — которое они не могли исправить, не раскрыв первоначальную космологию</w:t>
+        <w:t>Введено противоречие — Дни 1-3 имеют свет, но нет Солнца — которое они не могли исправить, не раскрыв первоначальную космологию.</w:t>
       </w:r>
     </w:p>
     <w:p>
@@ -13451,7 +13384,7 @@
         <w:pStyle w:val="Quote"/>
       </w:pPr>
       <w:r>
-        <w:t>«Свет луны будет как свет солнца, и свет солнца будет семикратным, как свет семи дней» (Исаия 30:26)</w:t>
+        <w:t>«Свет луны будет как свет солнца, и свет солнца будет семикратным, как свет семи дней» (Исаия 30:26).</w:t>
       </w:r>
     </w:p>
     <w:p>
@@ -13469,7 +13402,7 @@
         <w:pStyle w:val="Quote"/>
       </w:pPr>
       <w:r>
-        <w:t>«Еще семь дней, и Я поведу дождь на землю сорок дней и сорок ночей» (Бытие 7:4)</w:t>
+        <w:t>«Еще семь дней, и Я поведу дождь на землю сорок дней и сорок ночей» (Бытие 7:4).</w:t>
       </w:r>
     </w:p>
     <w:p>
@@ -13482,7 +13415,7 @@
         <w:pStyle w:val="Quote"/>
       </w:pPr>
       <w:r>
-        <w:t>«Еврейское утверждение состоит в том, что Бог изменил порядок природы, солнце восходило на западе и садилось на востоке в течение семи дней, непосредственно предшествующих потопу»</w:t>
+        <w:t>«Еврейское утверждение состоит в том, что Бог изменил порядок природы, солнце восходило на западе и садилось на востоке в течение семи дней, непосредственно предшествующих потопу».</w:t>
       </w:r>
     </w:p>
     <w:p>
@@ -13506,7 +13439,7 @@
         <w:spacing w:before="20" w:after="20"/>
       </w:pPr>
       <w:r>
-        <w:t>Jno Cook, Recovering the Lost World: Appendix B: Celestial Mechanics — «Свет луны будет как свет солнца, а свет солнца будет семикратным, как свет семи дней»</w:t>
+        <w:t>Jno Cook, Recovering the Lost World: Appendix B: Celestial Mechanics — «Свет луны будет как свет солнца, а свет солнца будет семикратным, как свет семи дней».</w:t>
       </w:r>
     </w:p>
     <w:p>
@@ -13675,7 +13608,7 @@
         <w:spacing w:before="20" w:after="20"/>
       </w:pPr>
       <w:r>
-        <w:t>Jno Cook, Recovering the Lost World: Chapter 3: The Osiris Mystery — waters above and waters below; firmament as plasma border (небо как граница плазмы) (недоступная ссылка — история)</w:t>
+        <w:t>Jno Cook, Recovering the Lost World: Chapter 3: The Osiris Mystery — waters above and waters below; firmament as plasma border (небо как граница плазмы) (недоступная ссылка — история).</w:t>
       </w:r>
     </w:p>
     <w:p>
@@ -13684,7 +13617,7 @@
         <w:spacing w:before="20" w:after="20"/>
       </w:pPr>
       <w:r>
-        <w:t>Jno Cook, Recovering the Lost World: Appendix B: Celestial Mechanics — Isaiah’s «seven days joined in one» and the 3147 BC flood (недоступная ссылка — история)</w:t>
+        <w:t>Jno Cook, Recovering the Lost World: Appendix B: Celestial Mechanics — Isaiah’s «seven days joined in one» and the 3147 BC flood (недоступная ссылка — история).</w:t>
       </w:r>
     </w:p>
     <w:p>
@@ -13775,7 +13708,7 @@
     </w:p>
     <w:p>
       <w:r>
-        <w:t>Дэвид Тэлботт «Вспоминая конец света» (YouTube) Даты Кука: Jno Cook помещает яркий полумесяц / нову Сатурна в 4077 году до нашей эры и конец коллинеарной конфигурации в 3147 году до нашей эры; эти якоря показаны в столбце даты, где они выравниваются с шагом. Все остальные шаги.</w:t>
+        <w:t>Дэвид Тэлботт «Вспоминая конец света» (YouTube) Даты Кука: Jno Cook помещает яркий полумесяц / нову Сатурна в 4077 году до нашей эры и конец коллинеарной конфигурации в 3147 году до нашей эры; эти якоря показаны в столбце даты, где они выравниваются с шагом. Все остальные шаги?</w:t>
       </w:r>
     </w:p>
     <w:tbl>
@@ -13940,12 +13873,7 @@
               <w:spacing w:before="20" w:after="20"/>
             </w:pPr>
             <w:r>
-              <w:rPr>
-                <w:b w:val="0"/>
-                <w:i w:val="0"/>
-                <w:sz w:val="18"/>
-              </w:rPr>
-              <w:t>Cloud dissipates</w:t>
+              <w:t>Облако рассеивается</w:t>
             </w:r>
           </w:p>
         </w:tc>
@@ -13996,12 +13924,7 @@
               <w:spacing w:before="20" w:after="20"/>
             </w:pPr>
             <w:r>
-              <w:rPr>
-                <w:b w:val="0"/>
-                <w:i w:val="0"/>
-                <w:sz w:val="18"/>
-              </w:rPr>
-              <w:t>Crescent appears (Cook: Saturn nova)</w:t>
+              <w:t>Появляется полумесяц (Cook: Saturn nova)</w:t>
             </w:r>
           </w:p>
         </w:tc>
@@ -14762,7 +14685,7 @@
         <w:jc w:val="center"/>
       </w:pPr>
       <w:r>
-        <w:t>ЧАСТЬ XVIII</w:t>
+        <w:t>Часть XVIII</w:t>
       </w:r>
     </w:p>
     <w:p>
@@ -14888,7 +14811,7 @@
     </w:p>
     <w:p>
       <w:r>
-        <w:t>«Смерть Бранденбурга на Марсе» (2015) иллюстрирует исследовательскую ловушку: книги, привлекающие подлинных исследователей с полномочиями и интригующими помещениями, вкладывающие сотни страниц в технический жаргон, а затем не предоставляющие никаких полезных доказательств в заключении. После более 300 страниц анализа изотопов и анекдотов холодной войны Бранденбург делает вывод: «Никаких дорог или планировки руин... не видно». Большинство останков, вероятно, захоронены под многими метрами щебня. Никаких фотографий. Никаких улиц. Никаких артефактов. «Лицо на Марсе» — курган длиной 3×2 км; «Пирамида D&amp;M» — холм с одной площадью «развалившейся кирпичной кладки»</w:t>
+        <w:t>«Смерть Бранденбурга на Марсе» (2015) иллюстрирует исследовательскую ловушку: книги, привлекающие подлинных исследователей с полномочиями и интригующими помещениями, вкладывающие сотни страниц в технический жаргон, а затем не предоставляющие никаких полезных доказательств в заключении. После более 300 страниц анализа изотопов и анекдотов холодной войны Бранденбург делает вывод: «Никаких дорог или планировки руин... не видно». Большинство останков, вероятно, захоронены под многими метрами щебня. Никаких фотографий. Никаких улиц. Никаких артефактов. «Лицо на Марсе» — курган длиной 3×2 км; «Пирамида D&amp;M» — холм с одной площадью «развалившейся кирпичной кладки».</w:t>
       </w:r>
     </w:p>
     <w:p>
@@ -15073,7 +14996,7 @@
               <w:jc w:val="center"/>
             </w:pPr>
             <w:r>
-              <w:t>Параллельный</w:t>
+              <w:t>параллельный</w:t>
             </w:r>
           </w:p>
         </w:tc>
@@ -15175,7 +15098,7 @@
               <w:spacing w:before="20" w:after="20"/>
             </w:pPr>
             <w:r>
-              <w:t>Кованые величайшим мастером, украденные темной северной властью, вызывают все войны</w:t>
+              <w:t>Кованые величайшим мастером, украденные темной северной властью, вызывают все войны.</w:t>
             </w:r>
           </w:p>
         </w:tc>
@@ -15379,7 +15302,12 @@
               <w:spacing w:before="20" w:after="20"/>
             </w:pPr>
             <w:r>
-              <w:t>Толкин прямо приравнял Нуменор к Атлантиде</w:t>
+              <w:rPr>
+                <w:b w:val="0"/>
+                <w:i w:val="0"/>
+                <w:sz w:val="18"/>
+              </w:rPr>
+              <w:t>Tolkien explicitly equated Númenor with Atlantis</w:t>
             </w:r>
           </w:p>
         </w:tc>
@@ -15430,7 +15358,12 @@
               <w:spacing w:before="20" w:after="20"/>
             </w:pPr>
             <w:r>
-              <w:t>Проклятое кольцо власти приносит смерть каждому владельцу</w:t>
+              <w:rPr>
+                <w:b w:val="0"/>
+                <w:i w:val="0"/>
+                <w:sz w:val="18"/>
+              </w:rPr>
+              <w:t>Cursed ring of power bringing death to every owner</w:t>
             </w:r>
           </w:p>
         </w:tc>
@@ -15652,7 +15585,12 @@
               <w:spacing w:before="20" w:after="20"/>
             </w:pPr>
             <w:r>
-              <w:t>Реальные языки + мифы, кодирующие реальную историю</w:t>
+              <w:rPr>
+                <w:b w:val="0"/>
+                <w:i w:val="0"/>
+                <w:sz w:val="18"/>
+              </w:rPr>
+              <w:t>Real languages + myths encoding real history</w:t>
             </w:r>
           </w:p>
         </w:tc>
@@ -15703,7 +15641,12 @@
               <w:spacing w:before="20" w:after="20"/>
             </w:pPr>
             <w:r>
-              <w:t>Реальные данные переформатированы в вымышленные языки</w:t>
+              <w:rPr>
+                <w:b w:val="0"/>
+                <w:i w:val="0"/>
+                <w:sz w:val="18"/>
+              </w:rPr>
+              <w:t>Real data reframed as invented languages in fictional world</w:t>
             </w:r>
           </w:p>
         </w:tc>
@@ -16692,7 +16635,7 @@
         <w:spacing w:before="20" w:after="20"/>
       </w:pPr>
       <w:r>
-        <w:t>Мгновенные порталы — Комбинат использует портальную технологию для перемещения между измерениями и планетами. Центральное событие игры («Инцидент Черной Месы») — резонансный каскад, вызванный экспериментом с ускорителем частиц — CERN в качестве сюжетного устройства. Порталы не являются фантазией; они изображены как инженерная инфраструктура, обыденная для оккупантов</w:t>
+        <w:t>Мгновенные порталы — Комбинат использует портальную технологию для перемещения между измерениями и планетами. Центральное событие игры («Инцидент Черной Месы») — резонансный каскад, вызванный экспериментом с ускорителем частиц — CERN в качестве сюжетного устройства. Порталы не являются фантазией; они изображены как инженерная инфраструктура, обыденная для оккупантов.</w:t>
       </w:r>
     </w:p>
     <w:p>
@@ -16710,7 +16653,7 @@
         <w:spacing w:before="20" w:after="20"/>
       </w:pPr>
       <w:r>
-        <w:t>Поле подавления — комбинат поддерживает поле, которое препятствует размножению человека. Марс нуждается в перевёрнутых женщинах: оккупант препятствует размножению занятых при извлечении того, что ему нужно. Поле подавления поднимается только на кульминации игры</w:t>
+        <w:t>Поле подавления — комбинат поддерживает поле, которое препятствует размножению человека. Марс нуждается в перевёрнутых женщинах: оккупант препятствует размножению занятых при извлечении того, что ему нужно. Поле подавления поднимается только на кульминации игры.</w:t>
       </w:r>
     </w:p>
     <w:p>
@@ -16719,7 +16662,7 @@
         <w:spacing w:before="20" w:after="20"/>
       </w:pPr>
       <w:r>
-        <w:t>Коммунизм как навязанная религия — Город 17 действует по системе, неотличимой от советского коммунизма: распределение рациона, обязательное переселение, вездесущая слежка, номинальный администратор (Доктор Брин), который сотрудничает с оккупантом и распространяет пропаганду через экраны в каждом общественном пространстве. Навязанный Комбинатом порядок на Земле отражает то, что Пирамидальная Империя навязала через монотеизм — послушание невидимой власти в обмен на выживание</w:t>
+        <w:t>Коммунизм как навязанная религия — Город 17 действует по системе, неотличимой от советского коммунизма: распределение рациона, обязательное переселение, вездесущая слежка, номинальный администратор (Доктор Брин), который сотрудничает с оккупантом и распространяет пропаганду через экраны в каждом общественном пространстве. Навязанный Комбинатом порядок на Земле отражает то, что Пирамидальная Империя навязала через монотеизм — послушание невидимой власти в обмен на выживание.</w:t>
       </w:r>
     </w:p>
     <w:p>
@@ -16728,7 +16671,7 @@
         <w:spacing w:before="20" w:after="20"/>
       </w:pPr>
       <w:r>
-        <w:t>Головокружительные зомби — люди, паразитируемые инопланетными организмами, которые переопределяют их сознание, превращая их в позорные, враждебные тела. Жанр зомби-апокалипсиса представлен как буквально инопланетная технология — биологическое оружие, которое лишает духа тела</w:t>
+        <w:t>Головокружительные зомби — люди, паразитируемые инопланетными организмами, которые переопределяют их сознание, превращая их в позорные, враждебные тела. Жанр зомби-апокалипсиса представлен как буквально инопланетная технология — биологическое оружие, которое лишает духа тела.</w:t>
       </w:r>
     </w:p>
     <w:p>
@@ -16811,12 +16754,27 @@
         <w:pStyle w:val="Quote"/>
       </w:pPr>
       <w:r>
-        <w:t>Кратко: TODO</w:t>
+        <w:t>Расширенные случаи автора за автором (Wells through Card) рассматривают печать как тот же класс инструмента, что и фильм / телевидение: закодированная технология, время и институциональное размещение, часто предполагая даты учебника до применения альтернативной хронологии. Свифт (1726) складывается как ранний мистификация-мемуары → сатирический сдвиг полки с остатком Марс + Тартария; заключение соответствует родительскому тезису — художественные ярлыки карантинных показаний, а параллельные охоты остаются контент-первым, а не жанр-увольнение.</w:t>
       </w:r>
     </w:p>
     <w:p>
       <w:r>
         <w:t>Это приложение расширяет предиктивное программирование 20-го века: литература. Для тезиса и шаблона см. основную статью.</w:t>
+      </w:r>
+    </w:p>
+    <w:p>
+      <w:pPr>
+        <w:pStyle w:val="Heading3"/>
+        <w:keepNext/>
+        <w:keepLines/>
+      </w:pPr>
+      <w:r>
+        <w:t>Джонатан Свифт (1667-1745)</w:t>
+      </w:r>
+    </w:p>
+    <w:p>
+      <w:r>
+        <w:t>Путешествия Гулливера (1726) были проданы как мемуары капитана Лемуэля Гулливера — тот же документальный кадр, каталогизированный в расследовании, представленном как факт. Прием тогда подал книгу как сатиру и детскую литературу; это приложение подсчитывает, что переименовывание в то же семейство ходов позже применялось в библиотечной фантастике. Бробдингнаг поставляет ордыно-масштабную монархию, пушечную арифметику и дикцию «Великая Тартария» на рельсах, выложенных в зеркалах временной линии Свифт — Тартария / Русь. Парные близкие спутники Марса Лапуты суммируются против Холла (1877) в Свифте — Марс, гиганты, позиция публикации. Давление публикации и форма управляемого раскрытия: дискуссионные рельсы и дрейф. Скриншоты из игры 1726 CE: Gulliver's Travels.</w:t>
       </w:r>
     </w:p>
     <w:p>
@@ -16958,7 +16916,7 @@
     </w:p>
     <w:p>
       <w:r>
-        <w:t>Рассказчик получает свою собственную копию, читает своему сыну и обнаруживает, что его отец пропустил и отредактировал Моргенштерна вслух — «оригинал» был слишком скучным; персонаж Голдман затем публикует сокращение, которое сокращает скучные растяжки и сохраняет действие и интригу. Редакция повествуется как семейная редакционная традиция: печатная книга — это не весь положенный текст — форма признания под шутку. Оригинальное название: Princess Bride Investigation.</w:t>
+        <w:t>Рассказчик получает свою собственную копию, читает своему сыну и обнаруживает, что его отец пропустил и отредактировал Моргенштерна вслух — «оригинал» был слишком скучным; персонаж Голдман затем публикует сокращение, которое сокращает скучные растяжки и сохраняет действие и интригу. Редакция повествуется как семейная редакционная традиция: печатная книга — это не весь положенный текст — форма признания под шутку. Оригинальное название: Princess Bride Investigation</w:t>
       </w:r>
     </w:p>
     <w:p>
@@ -17734,7 +17692,7 @@
     </w:p>
     <w:p>
       <w:r>
-        <w:t>Американский автор с военно-морской разведкой — он работал в Филадельфийском военно-морском дворе во время Второй мировой войны (обратите внимание на совпадение с графиком Филадельфийского эксперимента). Его марсианская фантастика заметно более «реалистична» и политически специфична, чем чистая мякоть</w:t>
+        <w:t>Американский автор с военно-морской разведкой — он работал в Филадельфийском военно-морском дворе во время Второй мировой войны (обратите внимание на совпадение с графиком Филадельфийского эксперимента). Его марсианская фантастика заметно более «реалистична» и политически специфична, чем чистая мякоть.</w:t>
       </w:r>
     </w:p>
     <w:p>
@@ -17776,7 +17734,7 @@
     </w:p>
     <w:p>
       <w:r>
-        <w:t>Американский писатель, который утверждал, что испытал подлинные психические или мистические события (опыт ВАЛИС, февраль-март 1974). В его марсианской фантастике постоянно присутствуют манипуляции с памятью, скрытая правда и корпоративный заговор</w:t>
+        <w:t>Американский писатель, который утверждал, что испытал подлинные психические или мистические события (опыт ВАЛИС, февраль-март 1974). В его марсианской фантастике постоянно присутствуют манипуляции с памятью, скрытая правда и корпоративный заговор.</w:t>
       </w:r>
     </w:p>
     <w:p>
@@ -20641,7 +20599,7 @@
         <w:pStyle w:val="Quote"/>
       </w:pPr>
       <w:r>
-        <w:t>"Ваше отстранение от роли Солнца в мифологии заходит, на мой взгляд, слишком далеко. Это правда, что в поздней античности и особенно с тех пор, как Макробий почти вся мифология была сделана, чтобы представлять Солнце, модное очень в моде в начале 19-го века (время Гете), но также и позже — см. мои ссылки в первой главе Эдипа и Ахнатона; но если бы было Солнце Дня, кроме Ночного Солнца, оно не могло бы избежать некоторой роли в мифологии</w:t>
+        <w:t>"Ваше отстранение от роли Солнца в мифологии заходит, на мой взгляд, слишком далеко. Это правда, что в поздней античности и особенно с тех пор, как Макробий почти вся мифология была сделана, чтобы представлять Солнце, модное очень в моде в начале 19-го века (время Гете), но также и позже — см. мои ссылки в первой главе Эдипа и Ахнатона; но если бы было Солнце Дня, кроме Ночного Солнца, оно не могло бы избежать некоторой роли в мифологии.</w:t>
       </w:r>
     </w:p>
     <w:p>
@@ -20691,12 +20649,12 @@
     </w:p>
     <w:p>
       <w:r>
-        <w:t>2. Планетарные ошибки. Тэлботт определил планету между Сатурном и Марсом в полярной конфигурации как Венеру. Кук определяет, что это был Меркурий, а не Венера: «Дэвид Тэлботт считал это состоянием полярного стека, но определил планету между Сатурном и Марсом как Венеру. Он также не знал о планетах над Сатурном». В другом месте: как указал Тэлботт (который неправильно идентифицирует Меркурий как Венеру)</w:t>
-      </w:r>
-    </w:p>
-    <w:p>
-      <w:r>
-        <w:t>3. модели научной фантастики. Кук описывает сценарий Thunderbolts как «научную фантастику» со «слишком большим количеством неподдерживаемых «неудобных» положений». Он называет концепцию «единого входа в штопор» для прибытия Сатурна «чистой чепухой», добавив, что взаимодействия плазмы «не могут замедлить путешествие планеты». Это потребовало бы силы взаимодействия электрического поля, которая выходит за рамки концептуальной основы группы Громовержцев»</w:t>
+        <w:t>2. Планетарные ошибки. Тэлботт определил планету между Сатурном и Марсом в полярной конфигурации как Венеру. Кук определяет, что это был Меркурий, а не Венера: «Дэвид Тэлботт считал это состоянием полярного стека, но определил планету между Сатурном и Марсом как Венеру. Он также не знал о планетах над Сатурном». В другом месте: как указал Тэлботт (который неправильно идентифицирует Меркурий как Венеру).</w:t>
+      </w:r>
+    </w:p>
+    <w:p>
+      <w:r>
+        <w:t>3. модели научной фантастики. Кук описывает сценарий Thunderbolts как «научную фантастику» со «слишком большим количеством неподдерживаемых «неудобных» положений». Он называет концепцию «единого входа в штопор» для прибытия Сатурна «чистой чепухой», добавив, что взаимодействия плазмы «не могут замедлить путешествие планеты». Это потребовало бы силы взаимодействия электрического поля, которая выходит за рамки концептуальной основы группы Громовержцев».</w:t>
       </w:r>
     </w:p>
     <w:p>
@@ -20706,7 +20664,7 @@
     </w:p>
     <w:p>
       <w:r>
-        <w:t>5. Устранение проблем. Когда Тэлботта спросили о его определении архетипа «Короля-воина» после выпуска «Символов чужого неба», он ответил, что это не дебаты, а стирание. Как задокументировал пользователь форума «серое облако» (7 августа 2010): «Вы можете вспомнить, что я бросил вызов Тэлботту в его определении этого «архетипа», когда был выпущен Symbols of an Alien Sky». Его «опровержение» состояло в том, что он удалил всю нить</w:t>
+        <w:t>5. Устранение проблем. Когда Тэлботта спросили о его определении архетипа «Короля-воина» после выпуска «Символов чужого неба», он ответил, что это не дебаты, а стирание. Как задокументировал пользователь форума «серое облако» (7 августа 2010): «Вы можете вспомнить, что я бросил вызов Тэлботту в его определении этого «архетипа», когда был выпущен Symbols of an Alien Sky». Его «опровержение» состояло в том, что он удалил всю нить.</w:t>
       </w:r>
     </w:p>
     <w:p>
@@ -21369,7 +21327,7 @@
         <w:jc w:val="center"/>
       </w:pPr>
       <w:r>
-        <w:t>ЧАСТЬ XIX</w:t>
+        <w:t>Часть XIX</w:t>
       </w:r>
     </w:p>
     <w:p>
@@ -21482,7 +21440,7 @@
         <w:spacing w:before="20" w:after="20"/>
       </w:pPr>
       <w:r>
-        <w:t>расследование 9/11</w:t>
+        <w:t>Расследование 9/11</w:t>
       </w:r>
     </w:p>
     <w:p>
@@ -21938,7 +21896,7 @@
         <w:pStyle w:val="Quote"/>
       </w:pPr>
       <w:r>
-        <w:t>Средневековая Западная Европа почему-то была твердо убеждена в существовании на востоке обширного королевства некоего христианского правителя «престера Иоанна», предшественников которого были исключительно великие ханы «монгольской» империи</w:t>
+        <w:t>Средневековая Западная Европа почему-то была твердо убеждена в существовании на востоке обширного королевства некоего христианского правителя «престера Иоанна», предшественников которого были исключительно великие ханы «монгольской» империи.</w:t>
       </w:r>
     </w:p>
     <w:p>
@@ -22081,7 +22039,7 @@
               <w:jc w:val="center"/>
             </w:pPr>
             <w:r>
-              <w:t>Период</w:t>
+              <w:t>период</w:t>
             </w:r>
           </w:p>
         </w:tc>
@@ -22126,7 +22084,12 @@
               <w:spacing w:before="20" w:after="20"/>
             </w:pPr>
             <w:r>
-              <w:t>Трансатлантический (африканский)</w:t>
+              <w:rPr>
+                <w:b w:val="0"/>
+                <w:i w:val="0"/>
+                <w:sz w:val="18"/>
+              </w:rPr>
+              <w:t>Transatlantic (African)</w:t>
             </w:r>
           </w:p>
         </w:tc>
@@ -22175,12 +22138,7 @@
               <w:spacing w:before="20" w:after="20"/>
             </w:pPr>
             <w:r>
-              <w:rPr>
-                <w:b w:val="0"/>
-                <w:i w:val="0"/>
-                <w:sz w:val="18"/>
-              </w:rPr>
-              <w:t>Portuguese, Spanish, British, French, Dutch</w:t>
+              <w:t>португальский, испанский, британский, французский, голландский</w:t>
             </w:r>
           </w:p>
         </w:tc>
@@ -22249,7 +22207,7 @@
               <w:spacing w:before="20" w:after="20"/>
             </w:pPr>
             <w:r>
-              <w:t>Мавританские корсары (Марокко, Алжир, Тунис, Триполи)</w:t>
+              <w:t>мавританские корсары (Марокко, Алжир, Тунис, Триполи)</w:t>
             </w:r>
           </w:p>
         </w:tc>
@@ -22387,12 +22345,7 @@
               <w:spacing w:before="20" w:after="20"/>
             </w:pPr>
             <w:r>
-              <w:rPr>
-                <w:b w:val="0"/>
-                <w:i w:val="0"/>
-                <w:sz w:val="18"/>
-              </w:rPr>
-              <w:t>Muslim slavers; Zanzibar, Swahili coast</w:t>
+              <w:t>Мусульманские работорговцы; Занзибар, побережье Суахили</w:t>
             </w:r>
           </w:p>
         </w:tc>
@@ -22423,7 +22376,7 @@
     </w:p>
     <w:p>
       <w:r>
-        <w:t>Этимологическая гипотеза: «Мур» мог восприниматься как «Люди Смерти» (лат. mor) из-за работорговли — народной этимологии, а не формального вывода. Главный: Маврус из Мавретании; финикийский Махурин = «западники»</w:t>
+        <w:t>Этимологическая гипотеза: «Мур» мог восприниматься как «Люди Смерти» (лат. mor) из-за работорговли — народной этимологии, а не формального вывода. Главный: Маврус из Мавретании; финикийский Махурин = «западники».</w:t>
       </w:r>
     </w:p>
     <w:p>
@@ -22633,7 +22586,7 @@
         <w:spacing w:before="20" w:after="20"/>
       </w:pPr>
       <w:r>
-        <w:t>Определите местное божество — почти повсеместно Солнце — нанесите его на карту Иисуса Христа</w:t>
+        <w:t>Определите местное божество — почти повсеместно Солнце — нанесите его на карту Иисуса Христа.</w:t>
       </w:r>
     </w:p>
     <w:p>
@@ -22798,7 +22751,7 @@
         <w:spacing w:before="20" w:after="20"/>
       </w:pPr>
       <w:r>
-        <w:t>15 в. (эта статья) — основополагающая и глобальная стратегия</w:t>
+        <w:t>15 в. (эта статья) — Основополагающая и глобальная стратегия</w:t>
       </w:r>
     </w:p>
     <w:p>
@@ -23263,7 +23216,7 @@
     </w:p>
     <w:p>
       <w:r>
-        <w:t>Вторжение Наполеона в Россию в 1812 году - катастрофическая шестимесячная кампания Великой армии на тех же территориях, которые были Московской Тартарией всего сорок лет назад - является одним из самых важных военных событий в европейской истории. Традиционное повествование представляет его как фатальный охват Наполеона: армия в 680 000 человек, которая вошла в Россию и вернулась менее чем 100 000 выживших.</w:t>
+        <w:t>Вторжение Наполеона в Россию в 1812 году — катастрофическая шестимесячная кампания Великой армии на тех же территориях, которые были Московской Тартарией всего сорок лет назад — является одним из самых важных военных событий в европейской истории. Традиционное повествование представляет его как фатальный охват Наполеона: армия в 680 000 человек, которая вошла в Россию и вернулась менее чем 100 000 выживших.</w:t>
       </w:r>
     </w:p>
     <w:p>
@@ -23573,6 +23526,37 @@
               <w:spacing w:before="20" w:after="20"/>
             </w:pPr>
             <w:r>
+              <w:t>Фигурант</w:t>
+            </w:r>
+          </w:p>
+        </w:tc>
+        <w:tc>
+          <w:tcPr>
+            <w:tcW w:type="dxa" w:w="1340"/>
+          </w:tcPr>
+          <w:p>
+            <w:pPr>
+              <w:spacing w:before="20" w:after="20"/>
+            </w:pPr>
+            <w:r>
+              <w:rPr>
+                <w:b w:val="0"/>
+                <w:i w:val="0"/>
+                <w:sz w:val="18"/>
+              </w:rPr>
+              <w:t>Napoleon</w:t>
+            </w:r>
+          </w:p>
+        </w:tc>
+        <w:tc>
+          <w:tcPr>
+            <w:tcW w:type="dxa" w:w="1560"/>
+          </w:tcPr>
+          <w:p>
+            <w:pPr>
+              <w:spacing w:before="20" w:after="20"/>
+            </w:pPr>
+            <w:r>
               <w:rPr>
                 <w:b w:val="0"/>
                 <w:i w:val="0"/>
@@ -23585,56 +23569,6 @@
                 <w:i w:val="0"/>
                 <w:sz w:val="18"/>
               </w:rPr>
-              <w:t>Figurehead</w:t>
-            </w:r>
-            <w:r>
-              <w:rPr>
-                <w:b w:val="0"/>
-                <w:i w:val="0"/>
-                <w:sz w:val="18"/>
-              </w:rPr>
-            </w:r>
-          </w:p>
-        </w:tc>
-        <w:tc>
-          <w:tcPr>
-            <w:tcW w:type="dxa" w:w="1340"/>
-          </w:tcPr>
-          <w:p>
-            <w:pPr>
-              <w:spacing w:before="20" w:after="20"/>
-            </w:pPr>
-            <w:r>
-              <w:rPr>
-                <w:b w:val="0"/>
-                <w:i w:val="0"/>
-                <w:sz w:val="18"/>
-              </w:rPr>
-              <w:t>Napoleon</w:t>
-            </w:r>
-          </w:p>
-        </w:tc>
-        <w:tc>
-          <w:tcPr>
-            <w:tcW w:type="dxa" w:w="1560"/>
-          </w:tcPr>
-          <w:p>
-            <w:pPr>
-              <w:spacing w:before="20" w:after="20"/>
-            </w:pPr>
-            <w:r>
-              <w:rPr>
-                <w:b w:val="0"/>
-                <w:i w:val="0"/>
-                <w:sz w:val="18"/>
-              </w:rPr>
-            </w:r>
-            <w:r>
-              <w:rPr>
-                <w:b/>
-                <w:i w:val="0"/>
-                <w:sz w:val="18"/>
-              </w:rPr>
               <w:t>None</w:t>
             </w:r>
             <w:r>
@@ -23673,7 +23607,12 @@
               <w:spacing w:before="20" w:after="20"/>
             </w:pPr>
             <w:r>
-              <w:t>Зеленский</w:t>
+              <w:rPr>
+                <w:b w:val="0"/>
+                <w:i w:val="0"/>
+                <w:sz w:val="18"/>
+              </w:rPr>
+              <w:t>Zelensky</w:t>
             </w:r>
           </w:p>
         </w:tc>
@@ -23875,12 +23814,7 @@
               <w:spacing w:before="20" w:after="20"/>
             </w:pPr>
             <w:r>
-              <w:rPr>
-                <w:b w:val="0"/>
-                <w:i w:val="0"/>
-                <w:sz w:val="18"/>
-              </w:rPr>
-              <w:t>US State Dept, NATO, Western media</w:t>
+              <w:t>Госдеп США, НАТО, западные СМИ</w:t>
             </w:r>
           </w:p>
         </w:tc>
@@ -23981,12 +23915,7 @@
               <w:spacing w:before="20" w:after="20"/>
             </w:pPr>
             <w:r>
-              <w:rPr>
-                <w:b w:val="0"/>
-                <w:i w:val="0"/>
-                <w:sz w:val="18"/>
-              </w:rPr>
-              <w:t>Fragment RF, seize resources, NATO to borders</w:t>
+              <w:t>Фрагмент РФ, захват ресурсов, НАТО до границ</w:t>
             </w:r>
           </w:p>
         </w:tc>
@@ -24547,28 +24476,7 @@
               <w:spacing w:before="20" w:after="20"/>
             </w:pPr>
             <w:r>
-              <w:rPr>
-                <w:b w:val="0"/>
-                <w:i w:val="0"/>
-                <w:sz w:val="18"/>
-              </w:rPr>
-              <w:t xml:space="preserve">No — </w:t>
-            </w:r>
-            <w:r>
-              <w:rPr>
-                <w:b w:val="0"/>
-                <w:i/>
-                <w:sz w:val="18"/>
-              </w:rPr>
-              <w:t>Russia goaded into invading him</w:t>
-            </w:r>
-            <w:r>
-              <w:rPr>
-                <w:b w:val="0"/>
-                <w:i w:val="0"/>
-                <w:sz w:val="18"/>
-              </w:rPr>
-              <w:t xml:space="preserve"> (inversion)</w:t>
+              <w:t>Нет — Россия вторглась в него (инверсия)</w:t>
             </w:r>
           </w:p>
         </w:tc>
@@ -24651,12 +24559,7 @@
               <w:spacing w:before="20" w:after="20"/>
             </w:pPr>
             <w:r>
-              <w:rPr>
-                <w:b w:val="0"/>
-                <w:i w:val="0"/>
-                <w:sz w:val="18"/>
-              </w:rPr>
-              <w:t>Ongoing</w:t>
+              <w:t>Продолжающийся</w:t>
             </w:r>
           </w:p>
         </w:tc>
@@ -24948,7 +24851,7 @@
               <w:spacing w:before="20" w:after="20"/>
             </w:pPr>
             <w:r>
-              <w:t>Немедленно отменил предостережение Шольца; подтолкнул поставку крылатых ракет Тельца; поддержал массовое увеличение расходов на оборону; охарактеризовал колебания как «умиротворение»</w:t>
+              <w:t>Немедленно отменил предостережение Шольца; подтолкнул поставку крылатых ракет Тельца; поддержал массовое увеличение расходов на оборону; охарактеризовал колебания как «умиротворение».</w:t>
             </w:r>
           </w:p>
         </w:tc>
@@ -25158,7 +25061,26 @@
               <w:spacing w:before="20" w:after="20"/>
             </w:pPr>
             <w:r>
-              <w:t>Марк Рютте</w:t>
+              <w:rPr>
+                <w:b w:val="0"/>
+                <w:i w:val="0"/>
+                <w:sz w:val="18"/>
+              </w:rPr>
+            </w:r>
+            <w:r>
+              <w:rPr>
+                <w:b/>
+                <w:i w:val="0"/>
+                <w:sz w:val="18"/>
+              </w:rPr>
+              <w:t>Mark Rutte</w:t>
+            </w:r>
+            <w:r>
+              <w:rPr>
+                <w:b w:val="0"/>
+                <w:i w:val="0"/>
+                <w:sz w:val="18"/>
+              </w:rPr>
             </w:r>
           </w:p>
         </w:tc>
@@ -25171,7 +25093,12 @@
               <w:spacing w:before="20" w:after="20"/>
             </w:pPr>
             <w:r>
-              <w:t>Генеральный секретарь НАТО (с октября 2024 года)</w:t>
+              <w:rPr>
+                <w:b w:val="0"/>
+                <w:i w:val="0"/>
+                <w:sz w:val="18"/>
+              </w:rPr>
+              <w:t>NATO Secretary General (from Oct 2024)</w:t>
             </w:r>
           </w:p>
         </w:tc>
@@ -25461,7 +25388,7 @@
               <w:spacing w:before="20" w:after="20"/>
             </w:pPr>
             <w:r>
-              <w:t>Управляла дипломатической изоляцией; отвергала каждое мирное предложение как «российскую пропаганду»</w:t>
+              <w:t>Управляла дипломатической изоляцией; отвергала каждое мирное предложение как «российскую пропаганду».</w:t>
             </w:r>
           </w:p>
         </w:tc>
@@ -25786,12 +25713,7 @@
               <w:spacing w:before="20" w:after="20"/>
             </w:pPr>
             <w:r>
-              <w:rPr>
-                <w:b w:val="0"/>
-                <w:i w:val="0"/>
-                <w:sz w:val="18"/>
-              </w:rPr>
-              <w:t>Bipartisan escalation anchor; uniparty in action</w:t>
+              <w:t>Двухпартийный якорь эскалации; однопартийность в действии</w:t>
             </w:r>
           </w:p>
         </w:tc>
@@ -25896,8 +25818,8 @@
     <w:p>
       <w:pPr>
         <w:sectPr>
-          <w:headerReference w:type="default" r:id="rId239"/>
-          <w:footerReference w:type="default" r:id="rId240"/>
+          <w:headerReference w:type="default" r:id="rId243"/>
+          <w:footerReference w:type="default" r:id="rId244"/>
           <w:pgSz w:w="8640" w:h="12960"/>
           <w:pgMar w:top="1020" w:right="1134" w:bottom="1134" w:left="1134" w:header="720" w:footer="720" w:gutter="0"/>
           <w:cols w:space="720"/>
@@ -25913,7 +25835,7 @@
         <w:jc w:val="center"/>
       </w:pPr>
       <w:r>
-        <w:t>ЧАСТЬ XX</w:t>
+        <w:t>Часть XX</w:t>
       </w:r>
     </w:p>
     <w:p>
@@ -26067,7 +25989,7 @@
         <w:pStyle w:val="Quote"/>
       </w:pPr>
       <w:r>
-        <w:t>С введением так называемого электрона Томсоном и предполагаемым развенчиванием теории эфира золотой век электрических открытий закончился. Башня Wardenclyffe Теслы была снесена. Его работа и работа других исследователей эфира приобрели дурную славу»</w:t>
+        <w:t>С введением так называемого электрона Томсоном и предполагаемым развенчиванием теории эфира золотой век электрических открытий закончился. Башня Wardenclyffe Теслы была снесена. Его работа и работа других исследователей эфира приобрели дурную славу».</w:t>
       </w:r>
     </w:p>
     <w:tbl>
@@ -26100,7 +26022,7 @@
               <w:jc w:val="center"/>
             </w:pPr>
             <w:r>
-              <w:t>Период</w:t>
+              <w:t>период</w:t>
             </w:r>
           </w:p>
         </w:tc>
@@ -26273,12 +26195,12 @@
         <w:spacing w:before="20" w:after="20"/>
       </w:pPr>
       <w:r>
-        <w:t>Доллард, Эрик П.; Стейнметц, Тесла, Эйнштейн (ранняя статья); Ньютон, Письма к Бентли; Лафлин (Нобель): «Слово Эфир имеет крайне негативные коннотации... оно прекрасно отражает то, как большинство физиков на самом деле думают о вакууме»</w:t>
-      </w:r>
-    </w:p>
-    <w:p>
-      <w:r>
-        <w:t>Открытые вопросы: Что было потеряно при сокращении Хевисайда? Можно ли повторить эксперименты Долларда? Интерферометрия Дейтона Миллера 1920-х годов. Коньячный эксперимент (1913) Магнито-диэлектрическая дисперсия Ferrocell RGB (Wheeler 2014)?</w:t>
+        <w:t>Доллард, Эрик П.; Стейнметц, Тесла, Эйнштейн (ранняя статья); Ньютон, Письма к Бентли; Лафлин (Нобель): «Слово Эфир имеет крайне негативные коннотации... оно прекрасно отражает то, как большинство физиков на самом деле думают о вакууме».</w:t>
+      </w:r>
+    </w:p>
+    <w:p>
+      <w:r>
+        <w:t>Открытые вопросы: Что было потеряно при сокращении Хевисайда? Можно ли повторить эксперименты Долларда? Интерферометрия Дейтона Миллера 1920-х годов. Коньячный эксперимент (1913) Магнито-диэлектрическая дисперсия Ferrocell RGB (Wheeler 2014)</w:t>
       </w:r>
     </w:p>
     <w:p>
@@ -26352,7 +26274,7 @@
               <w:jc w:val="center"/>
             </w:pPr>
             <w:r>
-              <w:t>Домен</w:t>
+              <w:t>домен</w:t>
             </w:r>
           </w:p>
         </w:tc>
@@ -26427,7 +26349,26 @@
               <w:spacing w:before="20" w:after="20"/>
             </w:pPr>
             <w:r>
-              <w:t>Передача энергии</w:t>
+              <w:rPr>
+                <w:b w:val="0"/>
+                <w:i w:val="0"/>
+                <w:sz w:val="18"/>
+              </w:rPr>
+            </w:r>
+            <w:r>
+              <w:rPr>
+                <w:b/>
+                <w:i w:val="0"/>
+                <w:sz w:val="18"/>
+              </w:rPr>
+              <w:t>Energy transmission</w:t>
+            </w:r>
+            <w:r>
+              <w:rPr>
+                <w:b w:val="0"/>
+                <w:i w:val="0"/>
+                <w:sz w:val="18"/>
+              </w:rPr>
             </w:r>
           </w:p>
         </w:tc>
@@ -26493,7 +26434,411 @@
             <w:pPr>
               <w:spacing w:before="20" w:after="20"/>
             </w:pPr>
-            <w:hyperlink r:id="rId116">
+            <w:r>
+              <w:t>Исполнитель: Maxwell &amp; The Aether</w:t>
+            </w:r>
+          </w:p>
+        </w:tc>
+      </w:tr>
+      <w:tr>
+        <w:tc>
+          <w:tcPr>
+            <w:tcW w:type="dxa" w:w="846"/>
+          </w:tcPr>
+          <w:p>
+            <w:pPr>
+              <w:spacing w:before="20" w:after="20"/>
+            </w:pPr>
+            <w:r>
+              <w:rPr>
+                <w:b w:val="0"/>
+                <w:i w:val="0"/>
+                <w:sz w:val="18"/>
+              </w:rPr>
+            </w:r>
+            <w:r>
+              <w:rPr>
+                <w:b/>
+                <w:i w:val="0"/>
+                <w:sz w:val="18"/>
+              </w:rPr>
+              <w:t>Weather control</w:t>
+            </w:r>
+            <w:r>
+              <w:rPr>
+                <w:b w:val="0"/>
+                <w:i w:val="0"/>
+                <w:sz w:val="18"/>
+              </w:rPr>
+            </w:r>
+          </w:p>
+        </w:tc>
+        <w:tc>
+          <w:tcPr>
+            <w:tcW w:type="dxa" w:w="1652"/>
+          </w:tcPr>
+          <w:p>
+            <w:pPr>
+              <w:spacing w:before="20" w:after="20"/>
+            </w:pPr>
+            <w:r>
+              <w:rPr>
+                <w:b w:val="0"/>
+                <w:i w:val="0"/>
+                <w:sz w:val="18"/>
+              </w:rPr>
+              <w:t>Tunable resonant cavity (ionosphere–ground)</w:t>
+            </w:r>
+          </w:p>
+        </w:tc>
+        <w:tc>
+          <w:tcPr>
+            <w:tcW w:type="dxa" w:w="1789"/>
+          </w:tcPr>
+          <w:p>
+            <w:pPr>
+              <w:spacing w:before="20" w:after="20"/>
+            </w:pPr>
+            <w:r>
+              <w:rPr>
+                <w:b w:val="0"/>
+                <w:i w:val="0"/>
+                <w:sz w:val="18"/>
+              </w:rPr>
+              <w:t>Ionospheric heating + particulate seeding modulates the medium</w:t>
+            </w:r>
+          </w:p>
+        </w:tc>
+        <w:tc>
+          <w:tcPr>
+            <w:tcW w:type="dxa" w:w="1138"/>
+          </w:tcPr>
+          <w:p>
+            <w:pPr>
+              <w:spacing w:before="20" w:after="20"/>
+            </w:pPr>
+            <w:r>
+              <w:rPr>
+                <w:b w:val="0"/>
+                <w:i w:val="0"/>
+                <w:sz w:val="18"/>
+              </w:rPr>
+              <w:t>"Cloud seeding sometimes works"</w:t>
+            </w:r>
+          </w:p>
+        </w:tc>
+        <w:tc>
+          <w:tcPr>
+            <w:tcW w:type="dxa" w:w="947"/>
+          </w:tcPr>
+          <w:p>
+            <w:pPr>
+              <w:spacing w:before="20" w:after="20"/>
+            </w:pPr>
+            <w:r>
+              <w:t>Контроль погоды</w:t>
+            </w:r>
+          </w:p>
+        </w:tc>
+      </w:tr>
+      <w:tr>
+        <w:tc>
+          <w:tcPr>
+            <w:tcW w:type="dxa" w:w="846"/>
+          </w:tcPr>
+          <w:p>
+            <w:pPr>
+              <w:spacing w:before="20" w:after="20"/>
+            </w:pPr>
+            <w:r>
+              <w:rPr>
+                <w:b w:val="0"/>
+                <w:i w:val="0"/>
+                <w:sz w:val="18"/>
+              </w:rPr>
+            </w:r>
+            <w:r>
+              <w:rPr>
+                <w:b/>
+                <w:i w:val="0"/>
+                <w:sz w:val="18"/>
+              </w:rPr>
+              <w:t>Directed-energy weapons</w:t>
+            </w:r>
+            <w:r>
+              <w:rPr>
+                <w:b w:val="0"/>
+                <w:i w:val="0"/>
+                <w:sz w:val="18"/>
+              </w:rPr>
+            </w:r>
+          </w:p>
+        </w:tc>
+        <w:tc>
+          <w:tcPr>
+            <w:tcW w:type="dxa" w:w="1652"/>
+          </w:tcPr>
+          <w:p>
+            <w:pPr>
+              <w:spacing w:before="20" w:after="20"/>
+            </w:pPr>
+            <w:r>
+              <w:rPr>
+                <w:b w:val="0"/>
+                <w:i w:val="0"/>
+                <w:sz w:val="18"/>
+              </w:rPr>
+              <w:t>Focused EM/microwave targeting of biological systems</w:t>
+            </w:r>
+          </w:p>
+        </w:tc>
+        <w:tc>
+          <w:tcPr>
+            <w:tcW w:type="dxa" w:w="1789"/>
+          </w:tcPr>
+          <w:p>
+            <w:pPr>
+              <w:spacing w:before="20" w:after="20"/>
+            </w:pPr>
+            <w:r>
+              <w:rPr>
+                <w:b w:val="0"/>
+                <w:i w:val="0"/>
+                <w:sz w:val="18"/>
+              </w:rPr>
+              <w:t>Coherent field propagation through medium</w:t>
+            </w:r>
+          </w:p>
+        </w:tc>
+        <w:tc>
+          <w:tcPr>
+            <w:tcW w:type="dxa" w:w="1138"/>
+          </w:tcPr>
+          <w:p>
+            <w:pPr>
+              <w:spacing w:before="20" w:after="20"/>
+            </w:pPr>
+            <w:r>
+              <w:rPr>
+                <w:b w:val="0"/>
+                <w:i w:val="0"/>
+                <w:sz w:val="18"/>
+              </w:rPr>
+              <w:t>"Havana Syndrome is mass hysteria"</w:t>
+            </w:r>
+          </w:p>
+        </w:tc>
+        <w:tc>
+          <w:tcPr>
+            <w:tcW w:type="dxa" w:w="947"/>
+          </w:tcPr>
+          <w:p>
+            <w:pPr>
+              <w:spacing w:before="20" w:after="20"/>
+            </w:pPr>
+            <w:r>
+              <w:t>Погодный контроль - та же физика</w:t>
+            </w:r>
+          </w:p>
+        </w:tc>
+      </w:tr>
+      <w:tr>
+        <w:tc>
+          <w:tcPr>
+            <w:tcW w:type="dxa" w:w="846"/>
+          </w:tcPr>
+          <w:p>
+            <w:pPr>
+              <w:spacing w:before="20" w:after="20"/>
+            </w:pPr>
+            <w:r>
+              <w:rPr>
+                <w:b w:val="0"/>
+                <w:i w:val="0"/>
+                <w:sz w:val="18"/>
+              </w:rPr>
+            </w:r>
+            <w:r>
+              <w:rPr>
+                <w:b/>
+                <w:i w:val="0"/>
+                <w:sz w:val="18"/>
+              </w:rPr>
+              <w:t>Portal technology</w:t>
+            </w:r>
+            <w:r>
+              <w:rPr>
+                <w:b w:val="0"/>
+                <w:i w:val="0"/>
+                <w:sz w:val="18"/>
+              </w:rPr>
+            </w:r>
+          </w:p>
+        </w:tc>
+        <w:tc>
+          <w:tcPr>
+            <w:tcW w:type="dxa" w:w="1652"/>
+          </w:tcPr>
+          <w:p>
+            <w:pPr>
+              <w:spacing w:before="20" w:after="20"/>
+            </w:pPr>
+            <w:r>
+              <w:rPr>
+                <w:b w:val="0"/>
+                <w:i w:val="0"/>
+                <w:sz w:val="18"/>
+              </w:rPr>
+              <w:t>Localized aether distortion</w:t>
+            </w:r>
+          </w:p>
+        </w:tc>
+        <w:tc>
+          <w:tcPr>
+            <w:tcW w:type="dxa" w:w="1789"/>
+          </w:tcPr>
+          <w:p>
+            <w:pPr>
+              <w:spacing w:before="20" w:after="20"/>
+            </w:pPr>
+            <w:r>
+              <w:rPr>
+                <w:b w:val="0"/>
+                <w:i w:val="0"/>
+                <w:sz w:val="18"/>
+              </w:rPr>
+              <w:t>Extreme energy in confined volume compresses/structures medium</w:t>
+            </w:r>
+          </w:p>
+        </w:tc>
+        <w:tc>
+          <w:tcPr>
+            <w:tcW w:type="dxa" w:w="1138"/>
+          </w:tcPr>
+          <w:p>
+            <w:pPr>
+              <w:spacing w:before="20" w:after="20"/>
+            </w:pPr>
+            <w:r>
+              <w:rPr>
+                <w:b w:val="0"/>
+                <w:i w:val="0"/>
+                <w:sz w:val="18"/>
+              </w:rPr>
+              <w:t>"CERN does particle physics"</w:t>
+            </w:r>
+          </w:p>
+        </w:tc>
+        <w:tc>
+          <w:tcPr>
+            <w:tcW w:type="dxa" w:w="947"/>
+          </w:tcPr>
+          <w:p>
+            <w:pPr>
+              <w:spacing w:before="20" w:after="20"/>
+            </w:pPr>
+            <w:r>
+              <w:t>Обсуждение CERN's LHC &amp; the Portal</w:t>
+            </w:r>
+          </w:p>
+        </w:tc>
+      </w:tr>
+      <w:tr>
+        <w:tc>
+          <w:tcPr>
+            <w:tcW w:type="dxa" w:w="846"/>
+          </w:tcPr>
+          <w:p>
+            <w:pPr>
+              <w:spacing w:before="20" w:after="20"/>
+            </w:pPr>
+            <w:r>
+              <w:rPr>
+                <w:b w:val="0"/>
+                <w:i w:val="0"/>
+                <w:sz w:val="18"/>
+              </w:rPr>
+            </w:r>
+            <w:r>
+              <w:rPr>
+                <w:b/>
+                <w:i w:val="0"/>
+                <w:sz w:val="18"/>
+              </w:rPr>
+              <w:t>Over-unity energy</w:t>
+            </w:r>
+            <w:r>
+              <w:rPr>
+                <w:b w:val="0"/>
+                <w:i w:val="0"/>
+                <w:sz w:val="18"/>
+              </w:rPr>
+            </w:r>
+          </w:p>
+        </w:tc>
+        <w:tc>
+          <w:tcPr>
+            <w:tcW w:type="dxa" w:w="1652"/>
+          </w:tcPr>
+          <w:p>
+            <w:pPr>
+              <w:spacing w:before="20" w:after="20"/>
+            </w:pPr>
+            <w:r>
+              <w:rPr>
+                <w:b w:val="0"/>
+                <w:i w:val="0"/>
+                <w:sz w:val="18"/>
+              </w:rPr>
+              <w:t>Plasma–aether interaction producing excess energy</w:t>
+            </w:r>
+          </w:p>
+        </w:tc>
+        <w:tc>
+          <w:tcPr>
+            <w:tcW w:type="dxa" w:w="1789"/>
+          </w:tcPr>
+          <w:p>
+            <w:pPr>
+              <w:spacing w:before="20" w:after="20"/>
+            </w:pPr>
+            <w:r>
+              <w:rPr>
+                <w:b w:val="0"/>
+                <w:i w:val="0"/>
+                <w:sz w:val="18"/>
+              </w:rPr>
+              <w:t>Aether medium coupled to plasma yields more output than input</w:t>
+            </w:r>
+          </w:p>
+        </w:tc>
+        <w:tc>
+          <w:tcPr>
+            <w:tcW w:type="dxa" w:w="1138"/>
+          </w:tcPr>
+          <w:p>
+            <w:pPr>
+              <w:spacing w:before="20" w:after="20"/>
+            </w:pPr>
+            <w:r>
+              <w:rPr>
+                <w:b w:val="0"/>
+                <w:i w:val="0"/>
+                <w:sz w:val="18"/>
+              </w:rPr>
+              <w:t>"Violates thermodynamics"</w:t>
+            </w:r>
+          </w:p>
+        </w:tc>
+        <w:tc>
+          <w:tcPr>
+            <w:tcW w:type="dxa" w:w="947"/>
+          </w:tcPr>
+          <w:p>
+            <w:pPr>
+              <w:spacing w:before="20" w:after="20"/>
+            </w:pPr>
+            <w:hyperlink r:id="rId310">
               <w:r>
                 <w:rPr>
                   <w:b w:val="0"/>
@@ -26501,413 +26846,9 @@
                   <w:color w:val="B8860B"/>
                   <w:sz w:val="18"/>
                 </w:rPr>
-                <w:t>Maxwell &amp; the Aether</w:t>
+                <w:t>Challenging Established Physics</w:t>
               </w:r>
             </w:hyperlink>
-          </w:p>
-        </w:tc>
-      </w:tr>
-      <w:tr>
-        <w:tc>
-          <w:tcPr>
-            <w:tcW w:type="dxa" w:w="846"/>
-          </w:tcPr>
-          <w:p>
-            <w:pPr>
-              <w:spacing w:before="20" w:after="20"/>
-            </w:pPr>
-            <w:r>
-              <w:rPr>
-                <w:b w:val="0"/>
-                <w:i w:val="0"/>
-                <w:sz w:val="18"/>
-              </w:rPr>
-            </w:r>
-            <w:r>
-              <w:rPr>
-                <w:b/>
-                <w:i w:val="0"/>
-                <w:sz w:val="18"/>
-              </w:rPr>
-              <w:t>Weather control</w:t>
-            </w:r>
-            <w:r>
-              <w:rPr>
-                <w:b w:val="0"/>
-                <w:i w:val="0"/>
-                <w:sz w:val="18"/>
-              </w:rPr>
-            </w:r>
-          </w:p>
-        </w:tc>
-        <w:tc>
-          <w:tcPr>
-            <w:tcW w:type="dxa" w:w="1652"/>
-          </w:tcPr>
-          <w:p>
-            <w:pPr>
-              <w:spacing w:before="20" w:after="20"/>
-            </w:pPr>
-            <w:r>
-              <w:rPr>
-                <w:b w:val="0"/>
-                <w:i w:val="0"/>
-                <w:sz w:val="18"/>
-              </w:rPr>
-              <w:t>Tunable resonant cavity (ionosphere–ground)</w:t>
-            </w:r>
-          </w:p>
-        </w:tc>
-        <w:tc>
-          <w:tcPr>
-            <w:tcW w:type="dxa" w:w="1789"/>
-          </w:tcPr>
-          <w:p>
-            <w:pPr>
-              <w:spacing w:before="20" w:after="20"/>
-            </w:pPr>
-            <w:r>
-              <w:rPr>
-                <w:b w:val="0"/>
-                <w:i w:val="0"/>
-                <w:sz w:val="18"/>
-              </w:rPr>
-              <w:t>Ionospheric heating + particulate seeding modulates the medium</w:t>
-            </w:r>
-          </w:p>
-        </w:tc>
-        <w:tc>
-          <w:tcPr>
-            <w:tcW w:type="dxa" w:w="1138"/>
-          </w:tcPr>
-          <w:p>
-            <w:pPr>
-              <w:spacing w:before="20" w:after="20"/>
-            </w:pPr>
-            <w:r>
-              <w:rPr>
-                <w:b w:val="0"/>
-                <w:i w:val="0"/>
-                <w:sz w:val="18"/>
-              </w:rPr>
-              <w:t>"Cloud seeding sometimes works"</w:t>
-            </w:r>
-          </w:p>
-        </w:tc>
-        <w:tc>
-          <w:tcPr>
-            <w:tcW w:type="dxa" w:w="947"/>
-          </w:tcPr>
-          <w:p>
-            <w:pPr>
-              <w:spacing w:before="20" w:after="20"/>
-            </w:pPr>
-            <w:r>
-              <w:t>Контроль погоды</w:t>
-            </w:r>
-          </w:p>
-        </w:tc>
-      </w:tr>
-      <w:tr>
-        <w:tc>
-          <w:tcPr>
-            <w:tcW w:type="dxa" w:w="846"/>
-          </w:tcPr>
-          <w:p>
-            <w:pPr>
-              <w:spacing w:before="20" w:after="20"/>
-            </w:pPr>
-            <w:r>
-              <w:rPr>
-                <w:b w:val="0"/>
-                <w:i w:val="0"/>
-                <w:sz w:val="18"/>
-              </w:rPr>
-            </w:r>
-            <w:r>
-              <w:rPr>
-                <w:b/>
-                <w:i w:val="0"/>
-                <w:sz w:val="18"/>
-              </w:rPr>
-              <w:t>Directed-energy weapons</w:t>
-            </w:r>
-            <w:r>
-              <w:rPr>
-                <w:b w:val="0"/>
-                <w:i w:val="0"/>
-                <w:sz w:val="18"/>
-              </w:rPr>
-            </w:r>
-          </w:p>
-        </w:tc>
-        <w:tc>
-          <w:tcPr>
-            <w:tcW w:type="dxa" w:w="1652"/>
-          </w:tcPr>
-          <w:p>
-            <w:pPr>
-              <w:spacing w:before="20" w:after="20"/>
-            </w:pPr>
-            <w:r>
-              <w:rPr>
-                <w:b w:val="0"/>
-                <w:i w:val="0"/>
-                <w:sz w:val="18"/>
-              </w:rPr>
-              <w:t>Focused EM/microwave targeting of biological systems</w:t>
-            </w:r>
-          </w:p>
-        </w:tc>
-        <w:tc>
-          <w:tcPr>
-            <w:tcW w:type="dxa" w:w="1789"/>
-          </w:tcPr>
-          <w:p>
-            <w:pPr>
-              <w:spacing w:before="20" w:after="20"/>
-            </w:pPr>
-            <w:r>
-              <w:rPr>
-                <w:b w:val="0"/>
-                <w:i w:val="0"/>
-                <w:sz w:val="18"/>
-              </w:rPr>
-              <w:t>Coherent field propagation through medium</w:t>
-            </w:r>
-          </w:p>
-        </w:tc>
-        <w:tc>
-          <w:tcPr>
-            <w:tcW w:type="dxa" w:w="1138"/>
-          </w:tcPr>
-          <w:p>
-            <w:pPr>
-              <w:spacing w:before="20" w:after="20"/>
-            </w:pPr>
-            <w:r>
-              <w:rPr>
-                <w:b w:val="0"/>
-                <w:i w:val="0"/>
-                <w:sz w:val="18"/>
-              </w:rPr>
-              <w:t>"Havana Syndrome is mass hysteria"</w:t>
-            </w:r>
-          </w:p>
-        </w:tc>
-        <w:tc>
-          <w:tcPr>
-            <w:tcW w:type="dxa" w:w="947"/>
-          </w:tcPr>
-          <w:p>
-            <w:pPr>
-              <w:spacing w:before="20" w:after="20"/>
-            </w:pPr>
-            <w:r>
-              <w:t>Погодный контроль - та же физика</w:t>
-            </w:r>
-          </w:p>
-        </w:tc>
-      </w:tr>
-      <w:tr>
-        <w:tc>
-          <w:tcPr>
-            <w:tcW w:type="dxa" w:w="846"/>
-          </w:tcPr>
-          <w:p>
-            <w:pPr>
-              <w:spacing w:before="20" w:after="20"/>
-            </w:pPr>
-            <w:r>
-              <w:rPr>
-                <w:b w:val="0"/>
-                <w:i w:val="0"/>
-                <w:sz w:val="18"/>
-              </w:rPr>
-            </w:r>
-            <w:r>
-              <w:rPr>
-                <w:b/>
-                <w:i w:val="0"/>
-                <w:sz w:val="18"/>
-              </w:rPr>
-              <w:t>Portal technology</w:t>
-            </w:r>
-            <w:r>
-              <w:rPr>
-                <w:b w:val="0"/>
-                <w:i w:val="0"/>
-                <w:sz w:val="18"/>
-              </w:rPr>
-            </w:r>
-          </w:p>
-        </w:tc>
-        <w:tc>
-          <w:tcPr>
-            <w:tcW w:type="dxa" w:w="1652"/>
-          </w:tcPr>
-          <w:p>
-            <w:pPr>
-              <w:spacing w:before="20" w:after="20"/>
-            </w:pPr>
-            <w:r>
-              <w:rPr>
-                <w:b w:val="0"/>
-                <w:i w:val="0"/>
-                <w:sz w:val="18"/>
-              </w:rPr>
-              <w:t>Localized aether distortion</w:t>
-            </w:r>
-          </w:p>
-        </w:tc>
-        <w:tc>
-          <w:tcPr>
-            <w:tcW w:type="dxa" w:w="1789"/>
-          </w:tcPr>
-          <w:p>
-            <w:pPr>
-              <w:spacing w:before="20" w:after="20"/>
-            </w:pPr>
-            <w:r>
-              <w:rPr>
-                <w:b w:val="0"/>
-                <w:i w:val="0"/>
-                <w:sz w:val="18"/>
-              </w:rPr>
-              <w:t>Extreme energy in confined volume compresses/structures medium</w:t>
-            </w:r>
-          </w:p>
-        </w:tc>
-        <w:tc>
-          <w:tcPr>
-            <w:tcW w:type="dxa" w:w="1138"/>
-          </w:tcPr>
-          <w:p>
-            <w:pPr>
-              <w:spacing w:before="20" w:after="20"/>
-            </w:pPr>
-            <w:r>
-              <w:rPr>
-                <w:b w:val="0"/>
-                <w:i w:val="0"/>
-                <w:sz w:val="18"/>
-              </w:rPr>
-              <w:t>"CERN does particle physics"</w:t>
-            </w:r>
-          </w:p>
-        </w:tc>
-        <w:tc>
-          <w:tcPr>
-            <w:tcW w:type="dxa" w:w="947"/>
-          </w:tcPr>
-          <w:p>
-            <w:pPr>
-              <w:spacing w:before="20" w:after="20"/>
-            </w:pPr>
-            <w:r>
-              <w:t>Обсуждение CERN's LHC &amp; the Portal</w:t>
-            </w:r>
-          </w:p>
-        </w:tc>
-      </w:tr>
-      <w:tr>
-        <w:tc>
-          <w:tcPr>
-            <w:tcW w:type="dxa" w:w="846"/>
-          </w:tcPr>
-          <w:p>
-            <w:pPr>
-              <w:spacing w:before="20" w:after="20"/>
-            </w:pPr>
-            <w:r>
-              <w:rPr>
-                <w:b w:val="0"/>
-                <w:i w:val="0"/>
-                <w:sz w:val="18"/>
-              </w:rPr>
-            </w:r>
-            <w:r>
-              <w:rPr>
-                <w:b/>
-                <w:i w:val="0"/>
-                <w:sz w:val="18"/>
-              </w:rPr>
-              <w:t>Over-unity energy</w:t>
-            </w:r>
-            <w:r>
-              <w:rPr>
-                <w:b w:val="0"/>
-                <w:i w:val="0"/>
-                <w:sz w:val="18"/>
-              </w:rPr>
-            </w:r>
-          </w:p>
-        </w:tc>
-        <w:tc>
-          <w:tcPr>
-            <w:tcW w:type="dxa" w:w="1652"/>
-          </w:tcPr>
-          <w:p>
-            <w:pPr>
-              <w:spacing w:before="20" w:after="20"/>
-            </w:pPr>
-            <w:r>
-              <w:rPr>
-                <w:b w:val="0"/>
-                <w:i w:val="0"/>
-                <w:sz w:val="18"/>
-              </w:rPr>
-              <w:t>Plasma–aether interaction producing excess energy</w:t>
-            </w:r>
-          </w:p>
-        </w:tc>
-        <w:tc>
-          <w:tcPr>
-            <w:tcW w:type="dxa" w:w="1789"/>
-          </w:tcPr>
-          <w:p>
-            <w:pPr>
-              <w:spacing w:before="20" w:after="20"/>
-            </w:pPr>
-            <w:r>
-              <w:rPr>
-                <w:b w:val="0"/>
-                <w:i w:val="0"/>
-                <w:sz w:val="18"/>
-              </w:rPr>
-              <w:t>Aether medium coupled to plasma yields more output than input</w:t>
-            </w:r>
-          </w:p>
-        </w:tc>
-        <w:tc>
-          <w:tcPr>
-            <w:tcW w:type="dxa" w:w="1138"/>
-          </w:tcPr>
-          <w:p>
-            <w:pPr>
-              <w:spacing w:before="20" w:after="20"/>
-            </w:pPr>
-            <w:r>
-              <w:rPr>
-                <w:b w:val="0"/>
-                <w:i w:val="0"/>
-                <w:sz w:val="18"/>
-              </w:rPr>
-              <w:t>"Violates thermodynamics"</w:t>
-            </w:r>
-          </w:p>
-        </w:tc>
-        <w:tc>
-          <w:tcPr>
-            <w:tcW w:type="dxa" w:w="947"/>
-          </w:tcPr>
-          <w:p>
-            <w:pPr>
-              <w:spacing w:before="20" w:after="20"/>
-            </w:pPr>
-            <w:r>
-              <w:t>Сложная установленная физика</w:t>
-            </w:r>
           </w:p>
         </w:tc>
       </w:tr>
@@ -27115,7 +27056,7 @@
             <w:pPr>
               <w:spacing w:before="20" w:after="20"/>
             </w:pPr>
-            <w:hyperlink r:id="rId307">
+            <w:hyperlink r:id="rId311">
               <w:r>
                 <w:rPr>
                   <w:b w:val="0"/>
@@ -27360,7 +27301,7 @@
               <w:jc w:val="center"/>
             </w:pPr>
             <w:r>
-              <w:t>Масштаб</w:t>
+              <w:t>масштаб</w:t>
             </w:r>
           </w:p>
         </w:tc>
@@ -27737,12 +27678,7 @@
               <w:spacing w:before="20" w:after="20"/>
             </w:pPr>
             <w:r>
-              <w:rPr>
-                <w:b w:val="0"/>
-                <w:i w:val="0"/>
-                <w:sz w:val="18"/>
-              </w:rPr>
-              <w:t>Climate-scale weather manipulation</w:t>
+              <w:t>Климатические манипуляции с погодой</w:t>
             </w:r>
           </w:p>
         </w:tc>
@@ -27795,7 +27731,7 @@
         <w:spacing w:before="20" w:after="20"/>
       </w:pPr>
       <w:r>
-        <w:t>Серджио Бертолуччи (Sergio Bertolucci), директор по исследованиям и научным вычислениям CERN (ноябрь 2009): «Из этой двери может что-то появиться, или мы можем что-то отправить через нее». (Источник: The Register, 6 ноября 2009)</w:t>
+        <w:t>Серджио Бертолуччи (Sergio Bertolucci), директор по исследованиям и научным вычислениям CERN (ноябрь 2009): «Из этой двери может что-то появиться, или мы можем что-то отправить через нее». (Источник: The Register, 6 ноября 2009).</w:t>
       </w:r>
     </w:p>
     <w:p>
@@ -27841,7 +27777,7 @@
         <w:spacing w:before="20" w:after="20"/>
       </w:pPr>
       <w:r>
-        <w:t>Редукция Хевисайда удалила термины в уравнениях Максвелла, которые описывали тензор напряжения среды. Если эти термины реальны, то достаточное количество энергии, приложенное к ограниченному объему эфира, может вызвать структурные искажения — то, что древние описывали как порталы, и то, что Бертолуччи описывал как «дверь»</w:t>
+        <w:t>Редукция Хевисайда удалила термины в уравнениях Максвелла, которые описывали тензор напряжения среды. Если эти термины реальны, то достаточное количество энергии, приложенное к ограниченному объему эфира, может вызвать структурные искажения — то, что древние описывали как порталы, и то, что Бертолуччи описывал как «дверь».</w:t>
       </w:r>
     </w:p>
     <w:p>
@@ -27898,7 +27834,7 @@
         <w:spacing w:before="20" w:after="20"/>
       </w:pPr>
       <w:r>
-        <w:t>Достигнутая трансмутация — входные элементы, преобразованные в более тяжелые элементы без радиоактивности. Это низкоэнергетическая ядерная реакция (LENR), ранее отклонявшаяся как «холодный синтез»</w:t>
+        <w:t>Достигнутая трансмутация — входные элементы, преобразованные в более тяжелые элементы без радиоактивности. Это низкоэнергетическая ядерная реакция (LENR), ранее отклонявшаяся как «холодный синтез».</w:t>
       </w:r>
     </w:p>
     <w:p>
@@ -27953,7 +27889,7 @@
         <w:spacing w:before="20" w:after="20"/>
       </w:pPr>
       <w:r>
-        <w:t>Каждый энергозависимый механизм контроля (счет, ценообразование, нормирование, санкции) теряет рычаги влияния</w:t>
+        <w:t>Каждый энергозависимый механизм контроля (счет, ценообразование, нормирование, санкции) теряет рычаги влияния.</w:t>
       </w:r>
     </w:p>
     <w:p>
@@ -27995,7 +27931,7 @@
               <w:jc w:val="center"/>
             </w:pPr>
             <w:r>
-              <w:t>Нить</w:t>
+              <w:t>нить</w:t>
             </w:r>
           </w:p>
         </w:tc>
@@ -28286,7 +28222,7 @@
     </w:p>
     <w:p>
       <w:r>
-        <w:t>Тесла заявил: «В тот день, когда наука начнет изучать нефизические явления, она достигнет большего прогресса за одно столетие, чем за все предыдущие века своего существования»</w:t>
+        <w:t>Тесла заявил: «В тот день, когда наука начнет изучать нефизические явления, она достигнет большего прогресса за одно столетие, чем за все предыдущие века своего существования».</w:t>
       </w:r>
     </w:p>
     <w:p>
@@ -28327,7 +28263,7 @@
         <w:spacing w:before="20" w:after="20"/>
       </w:pPr>
       <w:r>
-        <w:t>Подавление того, что древние описывали как путешествие между мирами</w:t>
+        <w:t>Подавление того, что древние описывали как путешествие между мирами.</w:t>
       </w:r>
     </w:p>
     <w:p>
@@ -28362,7 +28298,7 @@
     </w:p>
     <w:p>
       <w:r>
-        <w:t>Программа ядерного оружия пересекает стек подавленной энергии не через физику эфира напрямую, а через механизм управления — использование страха для поддержания контроля над энергетическими технологиями</w:t>
+        <w:t>Программа ядерного оружия пересекает стек подавленной энергии не через физику эфира напрямую, а через механизм управления — использование страха для поддержания контроля над энергетическими технологиями.</w:t>
       </w:r>
     </w:p>
     <w:p>
@@ -28442,7 +28378,7 @@
         <w:spacing w:before="20" w:after="20"/>
       </w:pPr>
       <w:r>
-        <w:t>Классифицировать - Открытие входит в систему военно-промышленной классификации. После 1945 года это автоматически для всего, что имеет оружейный потенциал</w:t>
+        <w:t>Классифицировать - Открытие входит в систему военно-промышленной классификации. После 1945 года это автоматически для всего, что имеет оружейный потенциал.</w:t>
       </w:r>
     </w:p>
     <w:p>
@@ -28460,7 +28396,7 @@
         <w:spacing w:before="20" w:after="20"/>
       </w:pPr>
       <w:r>
-        <w:t>Развернуть - Технология используется скрытно (изменение погоды во Вьетнаме, направленная энергия против дипломатов, эксперименты ЦЕРН при бюджете в 1 млрд долларов в год)</w:t>
+        <w:t>Развернуть - Технология используется скрытно (изменение погоды во Вьетнаме, направленная энергия против дипломатов, эксперименты ЦЕРН при бюджете в 1 млрд долларов в год).</w:t>
       </w:r>
     </w:p>
     <w:p>
@@ -28708,7 +28644,7 @@
     </w:p>
     <w:p>
       <w:r>
-        <w:t>Эйнштейн не «доказал» специальную или общую теорию относительности в смысле единого решающего, состязательного лабораторного протокола, сравнимого с «созданием этого двигателя и измерения крутящего момента». За этим последовали формирование консенсуса, математическая элегантность и выборочное наблюдение — в то время как собственные колебания и развороты Эйнштейна (о космологии, квантовой полноте, объединенных надеждах на поле и даже эфирном языке в его лекции 1920 года в Лейдене, где он позволил, чтобы общая теория относительности приписывала физические свойства пространству) были сглажены последователями и учебниками в агиографию уверенности. Жест Лейдена часто опускается или кастрируется в популярных аккаунтах, потому что он усложняет историю «Эйнштейн убил эфир навсегда»</w:t>
+        <w:t>Эйнштейн не «доказал» специальную или общую теорию относительности в смысле единого решающего, состязательного лабораторного протокола, сравнимого с «созданием этого двигателя и измерения крутящего момента». За этим последовали формирование консенсуса, математическая элегантность и выборочное наблюдение — в то время как собственные колебания и развороты Эйнштейна (о космологии, квантовой полноте, объединенных надеждах на поле и даже эфирном языке в его лекции 1920 года в Лейдене, где он позволил, чтобы общая теория относительности приписывала физические свойства пространству) были сглажены последователями и учебниками в агиографию уверенности. Жест Лейдена часто опускается или кастрируется в популярных аккаунтах, потому что он усложняет историю «Эйнштейн убил эфир навсегда».</w:t>
       </w:r>
     </w:p>
     <w:p>
@@ -28779,7 +28715,7 @@
     </w:p>
     <w:p>
       <w:r>
-        <w:t>Устойчивое наследие, которое определяет его историческую роль в этой реконструкции, не является константой в блокноте, а лицензионной структурой</w:t>
+        <w:t>Устойчивое наследие, которое определяет его историческую роль в этой реконструкции, не является константой в блокноте, а лицензионной структурой.</w:t>
       </w:r>
     </w:p>
     <w:p>
@@ -28869,7 +28805,7 @@
         <w:spacing w:before="20" w:after="20"/>
       </w:pPr>
       <w:r>
-        <w:t>1920 Лейден — пространство, наделенное физическими качествами; «эфир» реабилитирован словами, в то время как инженерная среда Максвелла оставалась табу</w:t>
+        <w:t>1920 Лейден — пространство, наделенное физическими качествами; «эфир» реабилитирован словами, в то время как инженерная среда Максвелла оставалась табу.</w:t>
       </w:r>
     </w:p>
     <w:p>
@@ -29465,7 +29401,7 @@
         <w:spacing w:before="20" w:after="20"/>
       </w:pPr>
       <w:r>
-        <w:t>1931 — родился в Чикаго в еврейской семье, которая обратилась в христианскую науку</w:t>
+        <w:t>1931 — родился в Чикаго в еврейской семье, которая обратилась в христианскую науку.</w:t>
       </w:r>
     </w:p>
     <w:p>
@@ -29510,7 +29446,7 @@
         <w:spacing w:before="20" w:after="20"/>
       </w:pPr>
       <w:r>
-        <w:t>1964 — переведен в Пентагон в качестве специального помощника помощника министра обороны Джона Макнотона</w:t>
+        <w:t>1964 — переведен в Пентагон в качестве специального помощника помощника министра обороны Джона Макнотона.</w:t>
       </w:r>
     </w:p>
     <w:p>
@@ -29539,7 +29475,7 @@
         <w:spacing w:before="20" w:after="20"/>
       </w:pPr>
       <w:r>
-        <w:t>Капитан Джон Херрик (командующий Мэддоксом) телеграфировал в течение нескольких часов: «Обзор действий заставляет многие контакты и выпущенные торпеды казаться сомнительными... Предлагаю провести полную оценку до принятия любых дальнейших мер"</w:t>
+        <w:t>Капитан Джон Херрик (командующий Мэддоксом) телеграфировал в течение нескольких часов: «Обзор действий заставляет многие контакты и выпущенные торпеды казаться сомнительными... Предлагаю провести полную оценку до принятия любых дальнейших мер".</w:t>
       </w:r>
     </w:p>
     <w:p>
@@ -29548,7 +29484,7 @@
         <w:spacing w:before="20" w:after="20"/>
       </w:pPr>
       <w:r>
-        <w:t>Президент Джонсон сказал заместителю госсекретаря Джорджу Боллу: «Эти тупые, глупые моряки просто стреляли в летающих рыб!» Он также сказал в частном порядке: «Насколько я знаю, наш флот стрелял в китов там»</w:t>
+        <w:t>Президент Джонсон сказал заместителю госсекретаря Джорджу Боллу: «Эти тупые, глупые моряки просто стреляли в летающих рыб!» Он также сказал в частном порядке: «Насколько я знаю, наш флот стрелял в китов там».</w:t>
       </w:r>
     </w:p>
     <w:p>
@@ -29557,7 +29493,7 @@
         <w:spacing w:before="20" w:after="20"/>
       </w:pPr>
       <w:r>
-        <w:t>Джеймс Стокдейл, пилот, летевший над головой во время предполагаемой атаки: «У меня было лучшее место в доме, чтобы наблюдать за этим событием, и наши эсминцы просто стреляли по фантомным целям — там не было лодок ПТ... Там не было ничего, кроме черной воды и американской огневой мощи»</w:t>
+        <w:t>Джеймс Стокдейл, пилот, летевший над головой во время предполагаемой атаки: «У меня было лучшее место в доме, чтобы наблюдать за этим событием, и наши эсминцы просто стреляли по фантомным целям — там не было лодок ПТ... Там не было ничего, кроме черной воды и американской огневой мощи».</w:t>
       </w:r>
     </w:p>
     <w:p>
@@ -29566,7 +29502,7 @@
         <w:spacing w:before="20" w:after="20"/>
       </w:pPr>
       <w:r>
-        <w:t>Роберт Макнамара в фильме «Туман войны» (2003): «Этого не было»</w:t>
+        <w:t>Роберт Макнамара в фильме «Туман войны» (2003): «Этого не было».</w:t>
       </w:r>
     </w:p>
     <w:p>
@@ -29575,7 +29511,7 @@
         <w:spacing w:before="20" w:after="20"/>
       </w:pPr>
       <w:r>
-        <w:t>Роберт Ханьок (историк АНБ) в секретном исследовании 2001 года (рассекречено 2005): АНБ «намеренно искажало» свои разведывательные отчеты, чтобы поддержать вывод о том, что произошла вторая атака</w:t>
+        <w:t>Роберт Ханьок (историк АНБ) в секретном исследовании 2001 года (рассекречено 2005): АНБ «намеренно искажало» свои разведывательные отчеты, чтобы поддержать вывод о том, что произошла вторая атака.</w:t>
       </w:r>
     </w:p>
     <w:p>
@@ -29665,7 +29601,7 @@
         <w:spacing w:before="20" w:after="20"/>
       </w:pPr>
       <w:r>
-        <w:t>2002–2003: неоднократно предупреждал, что «сценарий в Тонкинском заливе» готовится оправдать войну в Ираке — предупреждение, полностью оправданное сфабрикованной разведкой ОМУ</w:t>
+        <w:t>2002–2003: неоднократно предупреждал, что «сценарий в Тонкинском заливе» готовится оправдать войну в Ираке — предупреждение, полностью оправданное сфабрикованной разведкой ОМУ.</w:t>
       </w:r>
     </w:p>
     <w:p>
@@ -29701,7 +29637,7 @@
         <w:spacing w:before="20" w:after="20"/>
       </w:pPr>
       <w:r>
-        <w:t>2021: В возрасте 90 лет опубликовал секретные документы о кризисе в Тайваньском проливе 1958 года, раскрывающие планы США по нанесению ядерных ударов по Китаю, которые прогнозировали 600 миллионов смертей</w:t>
+        <w:t>2021: В возрасте 90 лет опубликовал секретные документы о кризисе в Тайваньском проливе 1958 года, раскрывающие планы США по нанесению ядерных ударов по Китаю, которые прогнозировали 600 миллионов смертей.</w:t>
       </w:r>
     </w:p>
     <w:p>
@@ -29710,7 +29646,7 @@
         <w:spacing w:before="20" w:after="20"/>
       </w:pPr>
       <w:r>
-        <w:t>2023: Умер 16 июня 92 года от рака поджелудочной железы. Он публично объявил о своем диагнозе и продолжал выступать до самой смерти</w:t>
+        <w:t>2023: Умер 16 июня 92 года от рака поджелудочной железы. Он публично объявил о своем диагнозе и продолжал выступать до самой смерти.</w:t>
       </w:r>
     </w:p>
     <w:p>
@@ -29784,7 +29720,7 @@
         <w:spacing w:before="20" w:after="20"/>
       </w:pPr>
       <w:r>
-        <w:t>Льюис К.С. Из безмолвной планеты. Джон Лейн, The Bodley Head, 1938.</w:t>
+        <w:t>Льюис К.С. Из безмолвной планеты. Джон Лейн, The Bodley Head, 1938</w:t>
       </w:r>
     </w:p>
     <w:p>
@@ -29900,7 +29836,7 @@
         <w:spacing w:before="20" w:after="20"/>
       </w:pPr>
       <w:r>
-        <w:t>Каждая планета управляется Интеллектом (сознательной сущностью, которая формирует земные дела в своей сфере)</w:t>
+        <w:t>Каждая планета управляется Интеллектом (сознательной сущностью, которая формирует земные дела в своей сфере).</w:t>
       </w:r>
     </w:p>
     <w:p>
@@ -29909,7 +29845,7 @@
         <w:spacing w:before="20" w:after="20"/>
       </w:pPr>
       <w:r>
-        <w:t>Планетарные Разумы — это языческие боги, переименованные в Юпитер, Марс — бог войны, Венера — богиня любви, Сатурн — хранитель времени</w:t>
+        <w:t>Планетарные Разумы — это языческие боги, переименованные в Юпитер, Марс — бог войны, Венера — богиня любви, Сатурн — хранитель времени.</w:t>
       </w:r>
     </w:p>
     <w:p>
@@ -29918,7 +29854,7 @@
         <w:spacing w:before="20" w:after="20"/>
       </w:pPr>
       <w:r>
-        <w:t>Средневековые христианские ученые приняли эту архитектуру, не соглашаясь с язычниками «только на языке (in voce tantum)» — называя Разумы «ангелами», а не «богами»</w:t>
+        <w:t>Средневековые христианские ученые приняли эту архитектуру, не соглашаясь с язычниками «только на языке (in voce tantum)» — называя Разумы «ангелами», а не «богами».</w:t>
       </w:r>
     </w:p>
     <w:p>
@@ -29927,12 +29863,12 @@
         <w:spacing w:before="20" w:after="20"/>
       </w:pPr>
       <w:r>
-        <w:t>Космос живой, а не механический — сферы производят Музыку Сфер, и каждое небесное движение имеет смысл</w:t>
-      </w:r>
-    </w:p>
-    <w:p>
-      <w:r>
-        <w:t>Языческие элементы, встроенные в него, включали в себя концепцию Бога и места человека во вселенной, которые, если не в логическом противоречии с христианством, были тонко вне гармонии с ним</w:t>
+        <w:t>Космос живой, а не механический — сферы производят Музыку Сфер, и каждое небесное движение имеет смысл.</w:t>
+      </w:r>
+    </w:p>
+    <w:p>
+      <w:r>
+        <w:t>Языческие элементы, встроенные в него, включали в себя концепцию Бога и места человека во вселенной, которые, если не в логическом противоречии с христианством, были тонко вне гармонии с ним.</w:t>
       </w:r>
     </w:p>
     <w:p>
@@ -29965,7 +29901,7 @@
         <w:pStyle w:val="Quote"/>
       </w:pPr>
       <w:r>
-        <w:t>"Нет Оярсы на Небесах, у которого не было бы своего представителя на Земле. На небесах нет Оярсы, которая не получила бы тысячи. Там был итальянский Сатурн, а также небесный, критский Джов и олимпиец. Именно эти земные гневы высоких разумов люди встречали в старину, когда сообщали, что видели богов»</w:t>
+        <w:t>"Нет Оярсы на Небесах, у которого не было бы своего представителя на Земле. На небесах нет Оярсы, которая не получила бы тысячи. Там был итальянский Сатурн, а также небесный, критский Джов и олимпиец. Именно эти земные гневы высоких разумов люди встречали в старину, когда сообщали, что видели богов».</w:t>
       </w:r>
     </w:p>
     <w:p>
@@ -29973,7 +29909,7 @@
         <w:pStyle w:val="Quote"/>
       </w:pPr>
       <w:r>
-        <w:t>"Слово "ангел" скорее вызывает вопрос. Даже в Сент-Поле можно увидеть популяцию, которая не вписывается в две колонны ангелов и дьяволов. А если вернуться дальше... все боги, эльфы, карлики, водолюди, судьба, лонгаеви»</w:t>
+        <w:t>"Слово "ангел" скорее вызывает вопрос. Даже в Сент-Поле можно увидеть популяцию, которая не вписывается в две колонны ангелов и дьяволов. А если вернуться дальше... все боги, эльфы, карлики, водолюди, судьба, лонгаеви».</w:t>
       </w:r>
     </w:p>
     <w:p>
@@ -29981,7 +29917,7 @@
         <w:pStyle w:val="Quote"/>
       </w:pPr>
       <w:r>
-        <w:t>Боги язычников не просто дьяволы, как многие из наших друзей сказали бы. Они всего лишь небесные силы под своими старыми, дохристианскими именами»</w:t>
+        <w:t>Боги язычников не просто дьяволы, как многие из наших друзей сказали бы. Они всего лишь небесные силы под своими старыми, дохристианскими именами».</w:t>
       </w:r>
     </w:p>
     <w:p>
@@ -30001,7 +29937,7 @@
     </w:p>
     <w:p>
       <w:r>
-        <w:t>Книга Майкла Уорда «Планета Нарния» (2008) показывает, что каждая книга Нарнии управляется атмосферой и характером конкретной планеты по средневековой космологической модели</w:t>
+        <w:t>Книга Майкла Уорда «Планета Нарния» (2008) показывает, что каждая книга Нарнии управляется атмосферой и характером конкретной планеты по средневековой космологической модели.</w:t>
       </w:r>
     </w:p>
     <w:tbl>
@@ -30663,12 +30599,7 @@
               <w:spacing w:before="20" w:after="20"/>
             </w:pPr>
             <w:r>
-              <w:rPr>
-                <w:b w:val="0"/>
-                <w:i w:val="0"/>
-                <w:sz w:val="18"/>
-              </w:rPr>
-              <w:t>The end of Narnia; the dwarfs' saturnine refusal; Father Time awakened; the last judgment</w:t>
+              <w:t>Конец Нарнии; сатурнинский отказ карликов; Пробуждение Отца Времени; последний суд</w:t>
             </w:r>
           </w:p>
         </w:tc>
@@ -30785,8 +30716,8 @@
     <w:p>
       <w:pPr>
         <w:sectPr>
-          <w:headerReference w:type="default" r:id="rId302"/>
-          <w:footerReference w:type="default" r:id="rId303"/>
+          <w:headerReference w:type="default" r:id="rId306"/>
+          <w:footerReference w:type="default" r:id="rId307"/>
           <w:pgSz w:w="8640" w:h="12960"/>
           <w:pgMar w:top="1020" w:right="1134" w:bottom="1134" w:left="1134" w:header="720" w:footer="720" w:gutter="0"/>
           <w:cols w:space="720"/>
@@ -30802,7 +30733,7 @@
         <w:jc w:val="center"/>
       </w:pPr>
       <w:r>
-        <w:t>ЧАСТЬ XXI</w:t>
+        <w:t>Часть XXI</w:t>
       </w:r>
     </w:p>
     <w:p>
@@ -31386,7 +31317,7 @@
               <w:jc w:val="center"/>
             </w:pPr>
             <w:r>
-              <w:t>Срок</w:t>
+              <w:t>срок</w:t>
             </w:r>
           </w:p>
         </w:tc>
@@ -31463,7 +31394,108 @@
               <w:spacing w:before="20" w:after="20"/>
             </w:pPr>
             <w:r>
-              <w:t>Из итальянской/испанской инфантерии ← инфант «фут-солдат», более ранний «молодежь»; латинские инфанты «неспособны говорить» → распространяется на ребенка/молодежь. Английский язык с конца 16 в. Акцент: нога против кавалерии, часто молодого или низкого ранга.</w:t>
+              <w:rPr>
+                <w:b w:val="0"/>
+                <w:i w:val="0"/>
+                <w:sz w:val="18"/>
+              </w:rPr>
+              <w:t xml:space="preserve">From Italian/Spanish </w:t>
+            </w:r>
+            <w:r>
+              <w:rPr>
+                <w:b w:val="0"/>
+                <w:i/>
+                <w:sz w:val="18"/>
+              </w:rPr>
+              <w:t>infanteria</w:t>
+            </w:r>
+            <w:r>
+              <w:rPr>
+                <w:b w:val="0"/>
+                <w:i w:val="0"/>
+                <w:sz w:val="18"/>
+              </w:rPr>
+              <w:t xml:space="preserve"> ← </w:t>
+            </w:r>
+            <w:r>
+              <w:rPr>
+                <w:b w:val="0"/>
+                <w:i/>
+                <w:sz w:val="18"/>
+              </w:rPr>
+              <w:t>infante</w:t>
+            </w:r>
+            <w:r>
+              <w:rPr>
+                <w:b w:val="0"/>
+                <w:i w:val="0"/>
+                <w:sz w:val="18"/>
+              </w:rPr>
+              <w:t xml:space="preserve"> “foot soldier,” earlier “youth”; Latin </w:t>
+            </w:r>
+            <w:r>
+              <w:rPr>
+                <w:b w:val="0"/>
+                <w:i/>
+                <w:sz w:val="18"/>
+              </w:rPr>
+              <w:t>infans</w:t>
+            </w:r>
+            <w:r>
+              <w:rPr>
+                <w:b w:val="0"/>
+                <w:i w:val="0"/>
+                <w:sz w:val="18"/>
+              </w:rPr>
+              <w:t xml:space="preserve"> “unable to speak” → extended to child/youth. English from late 16th c. Emphasis: </w:t>
+            </w:r>
+            <w:r>
+              <w:rPr>
+                <w:b/>
+                <w:i w:val="0"/>
+                <w:sz w:val="18"/>
+              </w:rPr>
+              <w:t>foot</w:t>
+            </w:r>
+            <w:r>
+              <w:rPr>
+                <w:b w:val="0"/>
+                <w:i w:val="0"/>
+                <w:sz w:val="18"/>
+              </w:rPr>
+              <w:t xml:space="preserve"> vs cavalry, often </w:t>
+            </w:r>
+            <w:r>
+              <w:rPr>
+                <w:b/>
+                <w:i w:val="0"/>
+                <w:sz w:val="18"/>
+              </w:rPr>
+              <w:t>young</w:t>
+            </w:r>
+            <w:r>
+              <w:rPr>
+                <w:b w:val="0"/>
+                <w:i w:val="0"/>
+                <w:sz w:val="18"/>
+              </w:rPr>
+              <w:t xml:space="preserve"> or </w:t>
+            </w:r>
+            <w:r>
+              <w:rPr>
+                <w:b/>
+                <w:i w:val="0"/>
+                <w:sz w:val="18"/>
+              </w:rPr>
+              <w:t>low rank</w:t>
+            </w:r>
+            <w:r>
+              <w:rPr>
+                <w:b w:val="0"/>
+                <w:i w:val="0"/>
+                <w:sz w:val="18"/>
+              </w:rPr>
+              <w:t>.</w:t>
             </w:r>
           </w:p>
         </w:tc>
@@ -31476,76 +31508,7 @@
               <w:spacing w:before="20" w:after="20"/>
             </w:pPr>
             <w:r>
-              <w:rPr>
-                <w:b w:val="0"/>
-                <w:i w:val="0"/>
-                <w:sz w:val="18"/>
-              </w:rPr>
-              <w:t xml:space="preserve">Horde </w:t>
-            </w:r>
-            <w:r>
-              <w:rPr>
-                <w:b/>
-                <w:i w:val="0"/>
-                <w:sz w:val="18"/>
-              </w:rPr>
-              <w:t>organized foot</w:t>
-            </w:r>
-            <w:r>
-              <w:rPr>
-                <w:b w:val="0"/>
-                <w:i w:val="0"/>
-                <w:sz w:val="18"/>
-              </w:rPr>
-              <w:t xml:space="preserve"> included </w:t>
-            </w:r>
-            <w:r>
-              <w:rPr>
-                <w:b/>
-                <w:i w:val="0"/>
-                <w:sz w:val="18"/>
-              </w:rPr>
-              <w:t>young giant</w:t>
-            </w:r>
-            <w:r>
-              <w:rPr>
-                <w:b w:val="0"/>
-                <w:i w:val="0"/>
-                <w:sz w:val="18"/>
-              </w:rPr>
-              <w:t xml:space="preserve"> lines; the </w:t>
-            </w:r>
-            <w:r>
-              <w:rPr>
-                <w:b/>
-                <w:i w:val="0"/>
-                <w:sz w:val="18"/>
-              </w:rPr>
-              <w:t>infant-/youth</w:t>
-            </w:r>
-            <w:r>
-              <w:rPr>
-                <w:b w:val="0"/>
-                <w:i w:val="0"/>
-                <w:sz w:val="18"/>
-              </w:rPr>
-              <w:t xml:space="preserve"> thread matches </w:t>
-            </w:r>
-            <w:r>
-              <w:rPr>
-                <w:b/>
-                <w:i w:val="0"/>
-                <w:sz w:val="18"/>
-              </w:rPr>
-              <w:t>rash, strong, non-knightly</w:t>
-            </w:r>
-            <w:r>
-              <w:rPr>
-                <w:b w:val="0"/>
-                <w:i w:val="0"/>
-                <w:sz w:val="18"/>
-              </w:rPr>
-              <w:t xml:space="preserve"> mass assault without preserving stature in glosses.</w:t>
+              <w:t>Организованная ордой нога включала в себя молодые гигантские линии; нить младенец/молодежь соответствует опрометчивому, сильному, не рыцарскому массовому штурму без сохранения роста в глоссах.</w:t>
             </w:r>
           </w:p>
         </w:tc>
@@ -32053,7 +32016,7 @@
               <w:jc w:val="center"/>
             </w:pPr>
             <w:r>
-              <w:t>Актуальность</w:t>
+              <w:t>актуальность</w:t>
             </w:r>
           </w:p>
         </w:tc>
@@ -32152,44 +32115,7 @@
               <w:spacing w:before="20" w:after="20"/>
             </w:pPr>
             <w:r>
-              <w:rPr>
-                <w:b w:val="0"/>
-                <w:i w:val="0"/>
-                <w:sz w:val="18"/>
-              </w:rPr>
-              <w:t xml:space="preserve">Latin </w:t>
-            </w:r>
-            <w:r>
-              <w:rPr>
-                <w:b w:val="0"/>
-                <w:i/>
-                <w:sz w:val="18"/>
-              </w:rPr>
-              <w:t>cohors</w:t>
-            </w:r>
-            <w:r>
-              <w:rPr>
-                <w:b w:val="0"/>
-                <w:i w:val="0"/>
-                <w:sz w:val="18"/>
-              </w:rPr>
-              <w:t xml:space="preserve"> → Roman </w:t>
-            </w:r>
-            <w:r>
-              <w:rPr>
-                <w:b/>
-                <w:i w:val="0"/>
-                <w:sz w:val="18"/>
-              </w:rPr>
-              <w:t>infantry</w:t>
-            </w:r>
-            <w:r>
-              <w:rPr>
-                <w:b w:val="0"/>
-                <w:i w:val="0"/>
-                <w:sz w:val="18"/>
-              </w:rPr>
-              <w:t xml:space="preserve"> unit; “enclosure” → body of soldiers.</w:t>
+              <w:t>Латинские когоры → римская пехотная часть; «ограждение» → корпус солдат.</w:t>
             </w:r>
           </w:p>
         </w:tc>
@@ -32254,12 +32180,7 @@
               <w:spacing w:before="20" w:after="20"/>
             </w:pPr>
             <w:r>
-              <w:rPr>
-                <w:b w:val="0"/>
-                <w:i w:val="0"/>
-                <w:sz w:val="18"/>
-              </w:rPr>
-              <w:t>Hebrew giant-tribe vocabulary; cross-mythic pattern.</w:t>
+              <w:t>Еврейский словарь гигантских племен; кросс-мифический паттерн.</w:t>
             </w:r>
           </w:p>
         </w:tc>
@@ -32324,47 +32245,7 @@
               <w:spacing w:before="20" w:after="20"/>
             </w:pPr>
             <w:r>
-              <w:rPr>
-                <w:b w:val="0"/>
-                <w:i w:val="0"/>
-                <w:sz w:val="18"/>
-              </w:rPr>
-              <w:t xml:space="preserve">Indo-European and Norse </w:t>
-            </w:r>
-            <w:r>
-              <w:rPr>
-                <w:b/>
-                <w:i w:val="0"/>
-                <w:sz w:val="18"/>
-              </w:rPr>
-              <w:t>oversized</w:t>
-            </w:r>
-            <w:r>
-              <w:rPr>
-                <w:b w:val="0"/>
-                <w:i w:val="0"/>
-                <w:sz w:val="18"/>
-              </w:rPr>
-              <w:t xml:space="preserve"> antagonists; </w:t>
-            </w:r>
-            <w:hyperlink r:id="rId339">
-              <w:r>
-                <w:rPr>
-                  <w:b w:val="0"/>
-                  <w:i w:val="0"/>
-                  <w:color w:val="B8860B"/>
-                  <w:sz w:val="18"/>
-                </w:rPr>
-                <w:t>Jötunn</w:t>
-              </w:r>
-            </w:hyperlink>
-            <w:r>
-              <w:rPr>
-                <w:b w:val="0"/>
-                <w:i w:val="0"/>
-                <w:sz w:val="18"/>
-              </w:rPr>
-              <w:t xml:space="preserve"> linked in First Crusade article.</w:t>
+              <w:t>Индоевропейские и скандинавские негабаритные антагонисты; Йотунн связан в статье Первого крестового похода.</w:t>
             </w:r>
           </w:p>
         </w:tc>
@@ -32397,28 +32278,7 @@
               <w:spacing w:before="20" w:after="20"/>
             </w:pPr>
             <w:r>
-              <w:rPr>
-                <w:b w:val="0"/>
-                <w:i w:val="0"/>
-                <w:sz w:val="18"/>
-              </w:rPr>
-              <w:t xml:space="preserve">Mythic </w:t>
-            </w:r>
-            <w:r>
-              <w:rPr>
-                <w:b/>
-                <w:i w:val="0"/>
-                <w:sz w:val="18"/>
-              </w:rPr>
-              <w:t>war against giants</w:t>
-            </w:r>
-            <w:r>
-              <w:rPr>
-                <w:b w:val="0"/>
-                <w:i w:val="0"/>
-                <w:sz w:val="18"/>
-              </w:rPr>
-              <w:t xml:space="preserve"> — structural parallel to state vs giant-line conflict.</w:t>
+              <w:t>Мифическая война против гигантов — структурная параллель между государством и конфликтом гигантских линий.</w:t>
             </w:r>
           </w:p>
         </w:tc>
@@ -32483,59 +32343,7 @@
               <w:spacing w:before="20" w:after="20"/>
             </w:pPr>
             <w:r>
-              <w:rPr>
-                <w:b w:val="0"/>
-                <w:i w:val="0"/>
-                <w:sz w:val="18"/>
-              </w:rPr>
-            </w:r>
-            <w:r>
-              <w:rPr>
-                <w:b/>
-                <w:i w:val="0"/>
-                <w:sz w:val="18"/>
-              </w:rPr>
-              <w:t>Irregular</w:t>
-            </w:r>
-            <w:r>
-              <w:rPr>
-                <w:b w:val="0"/>
-                <w:i w:val="0"/>
-                <w:sz w:val="18"/>
-              </w:rPr>
-              <w:t xml:space="preserve"> fighter vocabulary; useful analogues for </w:t>
-            </w:r>
-            <w:r>
-              <w:rPr>
-                <w:b/>
-                <w:i w:val="0"/>
-                <w:sz w:val="18"/>
-              </w:rPr>
-              <w:t>post-set-piece</w:t>
-            </w:r>
-            <w:r>
-              <w:rPr>
-                <w:b w:val="0"/>
-                <w:i w:val="0"/>
-                <w:sz w:val="18"/>
-              </w:rPr>
-              <w:t xml:space="preserve"> resistance without implying Spanish </w:t>
-            </w:r>
-            <w:r>
-              <w:rPr>
-                <w:b w:val="0"/>
-                <w:i/>
-                <w:sz w:val="18"/>
-              </w:rPr>
-              <w:t>guerrilla</w:t>
-            </w:r>
-            <w:r>
-              <w:rPr>
-                <w:b w:val="0"/>
-                <w:i w:val="0"/>
-                <w:sz w:val="18"/>
-              </w:rPr>
-              <w:t>’s origin.</w:t>
+              <w:t>Нерегулярный словарный запас бойца; полезные аналоги для сопротивления после набора частей, не подразумевая происхождение испанского партизана.</w:t>
             </w:r>
           </w:p>
         </w:tc>
@@ -32549,7 +32357,7 @@
         <w:keepLines/>
       </w:pPr>
       <w:r>
-        <w:t>Перекрестные ссылки</w:t>
+        <w:t>перекрестные ссылки</w:t>
       </w:r>
     </w:p>
     <w:p>
@@ -32565,8 +32373,8 @@
     <w:p>
       <w:pPr>
         <w:sectPr>
-          <w:headerReference w:type="default" r:id="rId325"/>
-          <w:footerReference w:type="default" r:id="rId326"/>
+          <w:headerReference w:type="default" r:id="rId329"/>
+          <w:footerReference w:type="default" r:id="rId330"/>
           <w:pgSz w:w="8640" w:h="12960"/>
           <w:pgMar w:top="1020" w:right="1134" w:bottom="1134" w:left="1134" w:header="720" w:footer="720" w:gutter="0"/>
           <w:cols w:space="720"/>
@@ -32582,7 +32390,7 @@
         <w:jc w:val="center"/>
       </w:pPr>
       <w:r>
-        <w:t>ЧАСТЬ XXII</w:t>
+        <w:t>Часть XXII</w:t>
       </w:r>
     </w:p>
     <w:p>
@@ -32675,7 +32483,26 @@
               <w:spacing w:before="20" w:after="20"/>
             </w:pPr>
             <w:r>
-              <w:t>Самуэль Ваверу</w:t>
+              <w:rPr>
+                <w:b w:val="0"/>
+                <w:i w:val="0"/>
+                <w:sz w:val="18"/>
+              </w:rPr>
+            </w:r>
+            <w:r>
+              <w:rPr>
+                <w:b/>
+                <w:i w:val="0"/>
+                <w:sz w:val="18"/>
+              </w:rPr>
+              <w:t>Samuel Waweru</w:t>
+            </w:r>
+            <w:r>
+              <w:rPr>
+                <w:b w:val="0"/>
+                <w:i w:val="0"/>
+                <w:sz w:val="18"/>
+              </w:rPr>
             </w:r>
           </w:p>
         </w:tc>
@@ -32688,12 +32515,7 @@
               <w:spacing w:before="20" w:after="20"/>
             </w:pPr>
             <w:r>
-              <w:rPr>
-                <w:b w:val="0"/>
-                <w:i w:val="0"/>
-                <w:sz w:val="18"/>
-              </w:rPr>
-              <w:t>Research support and project contributions</w:t>
+              <w:t>Исследовательская поддержка и вклад в проекты</w:t>
             </w:r>
           </w:p>
         </w:tc>
@@ -32714,8 +32536,8 @@
     </w:p>
     <w:p/>
     <w:sectPr>
-      <w:headerReference w:type="default" r:id="rId345"/>
-      <w:footerReference w:type="default" r:id="rId346"/>
+      <w:headerReference w:type="default" r:id="rId349"/>
+      <w:footerReference w:type="default" r:id="rId350"/>
       <w:pgSz w:w="8640" w:h="12960"/>
       <w:pgMar w:top="1020" w:right="1134" w:bottom="1134" w:left="1134" w:header="720" w:footer="720" w:gutter="0"/>
       <w:cols w:space="720"/>

</xml_diff>